<commit_message>
Finished Data Ingestion Pipeline V1
</commit_message>
<xml_diff>
--- a/Deliverables/project_report_g1.docx
+++ b/Deliverables/project_report_g1.docx
@@ -311,7 +311,7 @@
                     <pic:cNvPicPr/>
                   </pic:nvPicPr>
                   <pic:blipFill rotWithShape="1">
-                    <a:blip r:embed="rId5"/>
+                    <a:blip r:embed="rId6"/>
                     <a:srcRect l="29327" r="24680"/>
                     <a:stretch>
                       <a:fillRect/>
@@ -430,7 +430,7 @@
                     <pic:cNvPicPr/>
                   </pic:nvPicPr>
                   <pic:blipFill>
-                    <a:blip r:embed="rId6"/>
+                    <a:blip r:embed="rId7"/>
                     <a:stretch>
                       <a:fillRect/>
                     </a:stretch>
@@ -461,6 +461,7 @@
         <w:rPr>
           <w:sz w:val="22"/>
         </w:rPr>
+        <w:lastRenderedPageBreak/>
         <w:t xml:space="preserve">Mu and lambda will be </w:t>
       </w:r>
       <w:r>
@@ -699,7 +700,7 @@
                     <pic:cNvPicPr/>
                   </pic:nvPicPr>
                   <pic:blipFill>
-                    <a:blip r:embed="rId7"/>
+                    <a:blip r:embed="rId8"/>
                     <a:stretch>
                       <a:fillRect/>
                     </a:stretch>
@@ -731,6 +732,7 @@
           <w:noProof/>
           <w:sz w:val="22"/>
         </w:rPr>
+        <w:lastRenderedPageBreak/>
         <w:drawing>
           <wp:inline distT="0" distB="0" distL="0" distR="0" wp14:anchorId="2D4D865E" wp14:editId="59A16EBC">
             <wp:extent cx="5943600" cy="2372995"/>
@@ -753,7 +755,7 @@
                     <pic:cNvPicPr/>
                   </pic:nvPicPr>
                   <pic:blipFill>
-                    <a:blip r:embed="rId8"/>
+                    <a:blip r:embed="rId9"/>
                     <a:stretch>
                       <a:fillRect/>
                     </a:stretch>
@@ -807,7 +809,7 @@
                     <pic:cNvPicPr/>
                   </pic:nvPicPr>
                   <pic:blipFill>
-                    <a:blip r:embed="rId9"/>
+                    <a:blip r:embed="rId10"/>
                     <a:stretch>
                       <a:fillRect/>
                     </a:stretch>
@@ -934,6 +936,28 @@
     </w:p>
     <w:p>
       <w:pPr>
+        <w:pStyle w:val="ListParagraph"/>
+        <w:numPr>
+          <w:ilvl w:val="0"/>
+          <w:numId w:val="1"/>
+        </w:numPr>
+        <w:rPr>
+          <w:b/>
+          <w:bCs/>
+          <w:color w:val="EE0000"/>
+          <w:sz w:val="22"/>
+        </w:rPr>
+      </w:pPr>
+      <w:r>
+        <w:rPr>
+          <w:color w:val="EE0000"/>
+          <w:sz w:val="22"/>
+        </w:rPr>
+        <w:t xml:space="preserve">Check if Time intervals are over the day or over the night. </w:t>
+      </w:r>
+    </w:p>
+    <w:p>
+      <w:pPr>
         <w:rPr>
           <w:i/>
           <w:iCs/>
@@ -950,60 +974,70 @@
         </w:rPr>
         <w:t>Time Intervals</w:t>
       </w:r>
-    </w:p>
-    <w:p>
-      <w:pPr>
-        <w:rPr>
-          <w:sz w:val="22"/>
-        </w:rPr>
-      </w:pPr>
-      <w:r>
-        <w:rPr>
-          <w:sz w:val="22"/>
-        </w:rPr>
-        <w:t xml:space="preserve">Time intervals are each 6 minutes wide. This is based on NYCBS estimates of how long it takes to load/unload a set </w:t>
-      </w:r>
-      <w:r>
-        <w:rPr>
-          <w:sz w:val="22"/>
-        </w:rPr>
-        <w:t>of 7</w:t>
-      </w:r>
-      <w:r>
-        <w:rPr>
-          <w:sz w:val="22"/>
-        </w:rPr>
-        <w:t xml:space="preserve"> </w:t>
-      </w:r>
-      <w:r>
-        <w:rPr>
-          <w:sz w:val="22"/>
-        </w:rPr>
-        <w:t xml:space="preserve">bikes. </w:t>
-      </w:r>
-      <w:r>
-        <w:rPr>
-          <w:sz w:val="22"/>
-        </w:rPr>
-        <w:t xml:space="preserve">The time intervals cover the entire length of night rebalancing operations. </w:t>
-      </w:r>
-    </w:p>
-    <w:p>
-      <w:pPr>
+      <w:r>
         <w:rPr>
           <w:i/>
           <w:iCs/>
           <w:sz w:val="22"/>
           <w:u w:val="single"/>
         </w:rPr>
-      </w:pPr>
-      <w:r>
+        <w:t xml:space="preserve"> </w:t>
+      </w:r>
+    </w:p>
+    <w:p>
+      <w:pPr>
+        <w:rPr>
+          <w:sz w:val="22"/>
+        </w:rPr>
+      </w:pPr>
+      <w:r>
+        <w:rPr>
+          <w:sz w:val="22"/>
+        </w:rPr>
+        <w:t xml:space="preserve">Time intervals are each 6 minutes wide. This is based on NYCBS estimates of how long it takes to load/unload a set </w:t>
+      </w:r>
+      <w:r>
+        <w:rPr>
+          <w:sz w:val="22"/>
+        </w:rPr>
+        <w:t>of 7</w:t>
+      </w:r>
+      <w:r>
+        <w:rPr>
+          <w:sz w:val="22"/>
+        </w:rPr>
+        <w:t xml:space="preserve"> </w:t>
+      </w:r>
+      <w:r>
+        <w:rPr>
+          <w:sz w:val="22"/>
+        </w:rPr>
+        <w:t xml:space="preserve">bikes. </w:t>
+      </w:r>
+      <w:r>
+        <w:rPr>
+          <w:sz w:val="22"/>
+        </w:rPr>
+        <w:t xml:space="preserve">The time intervals cover the entire length of night rebalancing operations. </w:t>
+      </w:r>
+    </w:p>
+    <w:p>
+      <w:pPr>
         <w:rPr>
           <w:i/>
           <w:iCs/>
           <w:sz w:val="22"/>
           <w:u w:val="single"/>
         </w:rPr>
+      </w:pPr>
+      <w:r>
+        <w:rPr>
+          <w:i/>
+          <w:iCs/>
+          <w:sz w:val="22"/>
+          <w:u w:val="single"/>
+        </w:rPr>
+        <w:lastRenderedPageBreak/>
         <w:t>Indices</w:t>
       </w:r>
     </w:p>
@@ -1108,7 +1142,13 @@
         <w:rPr>
           <w:sz w:val="22"/>
         </w:rPr>
-        <w:t>Intervals range from start to end of the day</w:t>
+        <w:t xml:space="preserve">Intervals range from start to end of the </w:t>
+      </w:r>
+      <w:r>
+        <w:rPr>
+          <w:sz w:val="22"/>
+        </w:rPr>
+        <w:t>night</w:t>
       </w:r>
     </w:p>
     <w:p>
@@ -1783,6 +1823,7 @@
           <w:sz w:val="22"/>
           <w:szCs w:val="22"/>
         </w:rPr>
+        <w:lastRenderedPageBreak/>
         <w:drawing>
           <wp:inline distT="0" distB="0" distL="0" distR="0" wp14:anchorId="05AE6EDF" wp14:editId="366E419D">
             <wp:extent cx="4467225" cy="1536802"/>
@@ -1805,7 +1846,7 @@
                     <pic:cNvPicPr/>
                   </pic:nvPicPr>
                   <pic:blipFill>
-                    <a:blip r:embed="rId10"/>
+                    <a:blip r:embed="rId11"/>
                     <a:stretch>
                       <a:fillRect/>
                     </a:stretch>
@@ -2049,7 +2090,7 @@
                     <pic:cNvPicPr/>
                   </pic:nvPicPr>
                   <pic:blipFill>
-                    <a:blip r:embed="rId11"/>
+                    <a:blip r:embed="rId12"/>
                     <a:stretch>
                       <a:fillRect/>
                     </a:stretch>
@@ -2283,7 +2324,7 @@
                     <pic:cNvPicPr/>
                   </pic:nvPicPr>
                   <pic:blipFill>
-                    <a:blip r:embed="rId12"/>
+                    <a:blip r:embed="rId13"/>
                     <a:stretch>
                       <a:fillRect/>
                     </a:stretch>
@@ -2687,6 +2728,7 @@
           <w:sz w:val="22"/>
           <w:szCs w:val="22"/>
         </w:rPr>
+        <w:lastRenderedPageBreak/>
         <w:drawing>
           <wp:inline distT="0" distB="0" distL="0" distR="0" wp14:anchorId="4FBC5D19" wp14:editId="084C5C01">
             <wp:extent cx="2686425" cy="628738"/>
@@ -2709,7 +2751,7 @@
                     <pic:cNvPicPr/>
                   </pic:nvPicPr>
                   <pic:blipFill>
-                    <a:blip r:embed="rId13"/>
+                    <a:blip r:embed="rId14"/>
                     <a:stretch>
                       <a:fillRect/>
                     </a:stretch>
@@ -2871,7 +2913,7 @@
                     <pic:cNvPicPr/>
                   </pic:nvPicPr>
                   <pic:blipFill>
-                    <a:blip r:embed="rId14"/>
+                    <a:blip r:embed="rId15"/>
                     <a:stretch>
                       <a:fillRect/>
                     </a:stretch>
@@ -3012,7 +3054,7 @@
                     <pic:cNvPicPr/>
                   </pic:nvPicPr>
                   <pic:blipFill>
-                    <a:blip r:embed="rId15"/>
+                    <a:blip r:embed="rId16"/>
                     <a:stretch>
                       <a:fillRect/>
                     </a:stretch>
@@ -3177,7 +3219,7 @@
                     <pic:cNvPicPr/>
                   </pic:nvPicPr>
                   <pic:blipFill>
-                    <a:blip r:embed="rId16"/>
+                    <a:blip r:embed="rId17"/>
                     <a:stretch>
                       <a:fillRect/>
                     </a:stretch>
@@ -3279,7 +3321,7 @@
                     <pic:cNvPicPr/>
                   </pic:nvPicPr>
                   <pic:blipFill>
-                    <a:blip r:embed="rId17"/>
+                    <a:blip r:embed="rId18"/>
                     <a:stretch>
                       <a:fillRect/>
                     </a:stretch>
@@ -3320,7 +3362,15 @@
           <w:sz w:val="22"/>
           <w:szCs w:val="22"/>
         </w:rPr>
-        <w:t>The number of total bikes assigned to a specific truck at a specific time across all stations must equal the number of bikes assigned to that truck</w:t>
+        <w:t xml:space="preserve">The number of total bikes assigned to a specific truck at a specific time across all stations must </w:t>
+      </w:r>
+      <w:r>
+        <w:rPr>
+          <w:sz w:val="22"/>
+          <w:szCs w:val="22"/>
+        </w:rPr>
+        <w:lastRenderedPageBreak/>
+        <w:t>equal the number of bikes assigned to that truck</w:t>
       </w:r>
       <w:r>
         <w:rPr>
@@ -3395,7 +3445,7 @@
                     <pic:cNvPicPr/>
                   </pic:nvPicPr>
                   <pic:blipFill>
-                    <a:blip r:embed="rId18"/>
+                    <a:blip r:embed="rId19"/>
                     <a:stretch>
                       <a:fillRect/>
                     </a:stretch>
@@ -3584,7 +3634,7 @@
                     <pic:cNvPicPr/>
                   </pic:nvPicPr>
                   <pic:blipFill>
-                    <a:blip r:embed="rId19"/>
+                    <a:blip r:embed="rId20"/>
                     <a:stretch>
                       <a:fillRect/>
                     </a:stretch>
@@ -3891,6 +3941,7 @@
           <w:b/>
           <w:bCs/>
         </w:rPr>
+        <w:lastRenderedPageBreak/>
         <w:t>Citations</w:t>
       </w:r>
     </w:p>
@@ -3937,7 +3988,7 @@
         </w:rPr>
         <w:t xml:space="preserve">. </w:t>
       </w:r>
-      <w:hyperlink r:id="rId20" w:history="1">
+      <w:hyperlink r:id="rId21" w:history="1">
         <w:r>
           <w:rPr>
             <w:rStyle w:val="Hyperlink"/>
@@ -4004,7 +4055,7 @@
         </w:rPr>
         <w:t xml:space="preserve">(1). </w:t>
       </w:r>
-      <w:hyperlink r:id="rId21" w:history="1">
+      <w:hyperlink r:id="rId22" w:history="1">
         <w:r>
           <w:rPr>
             <w:rStyle w:val="Hyperlink"/>
@@ -4063,7 +4114,7 @@
         </w:rPr>
         <w:t xml:space="preserve">. Citibikenyc.com. </w:t>
       </w:r>
-      <w:hyperlink r:id="rId22" w:history="1">
+      <w:hyperlink r:id="rId23" w:history="1">
         <w:r>
           <w:rPr>
             <w:rStyle w:val="Hyperlink"/>
@@ -4131,7 +4182,7 @@
         </w:rPr>
         <w:t xml:space="preserve">. Citybik.es. </w:t>
       </w:r>
-      <w:hyperlink r:id="rId23" w:history="1">
+      <w:hyperlink r:id="rId24" w:history="1">
         <w:r>
           <w:rPr>
             <w:rStyle w:val="Hyperlink"/>
@@ -4190,7 +4241,7 @@
         </w:rPr>
         <w:t xml:space="preserve">. Citybik.es. </w:t>
       </w:r>
-      <w:hyperlink r:id="rId24" w:history="1">
+      <w:hyperlink r:id="rId25" w:history="1">
         <w:r>
           <w:rPr>
             <w:rStyle w:val="Hyperlink"/>
@@ -4244,7 +4295,7 @@
         </w:rPr>
         <w:t xml:space="preserve"> (GPT-5.2 Thinking) [Large language model]. </w:t>
       </w:r>
-      <w:hyperlink r:id="rId25" w:tgtFrame="_new" w:history="1">
+      <w:hyperlink r:id="rId26" w:tgtFrame="_new" w:history="1">
         <w:r>
           <w:rPr>
             <w:rStyle w:val="Hyperlink"/>
@@ -4324,7 +4375,7 @@
         </w:rPr>
         <w:t xml:space="preserve">Large language model]. </w:t>
       </w:r>
-      <w:hyperlink r:id="rId26" w:history="1">
+      <w:hyperlink r:id="rId27" w:history="1">
         <w:r>
           <w:rPr>
             <w:rStyle w:val="Hyperlink"/>
@@ -6236,4 +6287,16 @@
     </a:ext>
   </a:extLst>
 </a:theme>
+</file>
+
+<file path=customXml/item1.xml><?xml version="1.0" encoding="utf-8"?>
+<b:Sources xmlns:b="http://schemas.openxmlformats.org/officeDocument/2006/bibliography" xmlns="http://schemas.openxmlformats.org/officeDocument/2006/bibliography" SelectedStyle="\APASixthEditionOfficeOnline.xsl" StyleName="APA" Version="6"/>
+</file>
+
+<file path=customXml/itemProps1.xml><?xml version="1.0" encoding="utf-8"?>
+<ds:datastoreItem xmlns:ds="http://schemas.openxmlformats.org/officeDocument/2006/customXml" ds:itemID="{3EF678FB-CDF5-41CD-867C-930E15FB9273}">
+  <ds:schemaRefs>
+    <ds:schemaRef ds:uri="http://schemas.openxmlformats.org/officeDocument/2006/bibliography"/>
+  </ds:schemaRefs>
+</ds:datastoreItem>
 </file>
</xml_diff>

<commit_message>
Add in explanation for Abe
</commit_message>
<xml_diff>
--- a/Deliverables/project_report_g1.docx
+++ b/Deliverables/project_report_g1.docx
@@ -53,7 +53,25 @@
           <w:sz w:val="22"/>
           <w:szCs w:val="22"/>
         </w:rPr>
-        <w:t>We will use free student license of gorubi solver</w:t>
+        <w:t xml:space="preserve">We will use free student license of </w:t>
+      </w:r>
+      <w:proofErr w:type="spellStart"/>
+      <w:r>
+        <w:rPr>
+          <w:color w:val="EE0000"/>
+          <w:sz w:val="22"/>
+          <w:szCs w:val="22"/>
+        </w:rPr>
+        <w:t>gorubi</w:t>
+      </w:r>
+      <w:proofErr w:type="spellEnd"/>
+      <w:r>
+        <w:rPr>
+          <w:color w:val="EE0000"/>
+          <w:sz w:val="22"/>
+          <w:szCs w:val="22"/>
+        </w:rPr>
+        <w:t xml:space="preserve"> solver</w:t>
       </w:r>
     </w:p>
     <w:p>
@@ -105,7 +123,43 @@
           <w:sz w:val="22"/>
           <w:szCs w:val="22"/>
         </w:rPr>
-        <w:t>We need to determine where trucks start in the system and how many bikes they start with at the beginning of the night</w:t>
+        <w:t xml:space="preserve">We need to determine where trucks start in the system and how many </w:t>
+      </w:r>
+      <w:proofErr w:type="gramStart"/>
+      <w:r>
+        <w:rPr>
+          <w:color w:val="EE0000"/>
+          <w:sz w:val="22"/>
+          <w:szCs w:val="22"/>
+        </w:rPr>
+        <w:t>bikes</w:t>
+      </w:r>
+      <w:proofErr w:type="gramEnd"/>
+      <w:r>
+        <w:rPr>
+          <w:color w:val="EE0000"/>
+          <w:sz w:val="22"/>
+          <w:szCs w:val="22"/>
+        </w:rPr>
+        <w:t xml:space="preserve"> they </w:t>
+      </w:r>
+      <w:proofErr w:type="gramStart"/>
+      <w:r>
+        <w:rPr>
+          <w:color w:val="EE0000"/>
+          <w:sz w:val="22"/>
+          <w:szCs w:val="22"/>
+        </w:rPr>
+        <w:t>start with</w:t>
+      </w:r>
+      <w:proofErr w:type="gramEnd"/>
+      <w:r>
+        <w:rPr>
+          <w:color w:val="EE0000"/>
+          <w:sz w:val="22"/>
+          <w:szCs w:val="22"/>
+        </w:rPr>
+        <w:t xml:space="preserve"> at the beginning of the night</w:t>
       </w:r>
     </w:p>
     <w:p>
@@ -142,14 +196,30 @@
           <w:color w:val="EE0000"/>
           <w:sz w:val="22"/>
         </w:rPr>
-        <w:t>Constant mu and lambda for simp</w:t>
-      </w:r>
+        <w:t xml:space="preserve">Constant mu and lambda for </w:t>
+      </w:r>
+      <w:proofErr w:type="spellStart"/>
       <w:r>
         <w:rPr>
           <w:color w:val="EE0000"/>
           <w:sz w:val="22"/>
         </w:rPr>
-        <w:t xml:space="preserve">ilicity. Don’t want to go the dynamic programming route as that’s </w:t>
+        <w:t>simp</w:t>
+      </w:r>
+      <w:r>
+        <w:rPr>
+          <w:color w:val="EE0000"/>
+          <w:sz w:val="22"/>
+        </w:rPr>
+        <w:t>ilicity</w:t>
+      </w:r>
+      <w:proofErr w:type="spellEnd"/>
+      <w:r>
+        <w:rPr>
+          <w:color w:val="EE0000"/>
+          <w:sz w:val="22"/>
+        </w:rPr>
+        <w:t xml:space="preserve">. Don’t want to go the dynamic programming route as that’s </w:t>
       </w:r>
       <w:r>
         <w:rPr>
@@ -296,7 +366,7 @@
             <wp:docPr id="815216729" name="Picture 1">
               <a:extLst xmlns:a="http://schemas.openxmlformats.org/drawingml/2006/main">
                 <a:ext uri="{FF2B5EF4-FFF2-40B4-BE49-F238E27FC236}">
-                  <a16:creationId xmlns:a16="http://schemas.microsoft.com/office/drawing/2014/main" id="{4CF17263-6364-49D1-9B0B-46F21AB38AC8}"/>
+                  <a16:creationId xmlns:a16="http://schemas.microsoft.com/office/drawing/2014/main" id="{408A0524-7866-4DD2-A058-16FA352F3230}"/>
                 </a:ext>
               </a:extLst>
             </wp:docPr>
@@ -415,7 +485,7 @@
             <wp:docPr id="255951218" name="Picture 1">
               <a:extLst xmlns:a="http://schemas.openxmlformats.org/drawingml/2006/main">
                 <a:ext uri="{FF2B5EF4-FFF2-40B4-BE49-F238E27FC236}">
-                  <a16:creationId xmlns:a16="http://schemas.microsoft.com/office/drawing/2014/main" id="{1F98E262-92D8-4D25-A186-3157020E553C}"/>
+                  <a16:creationId xmlns:a16="http://schemas.microsoft.com/office/drawing/2014/main" id="{1507269C-58A9-4441-B111-4E70394BCD82}"/>
                 </a:ext>
               </a:extLst>
             </wp:docPr>
@@ -457,12 +527,20 @@
           <w:sz w:val="22"/>
         </w:rPr>
       </w:pPr>
+      <w:proofErr w:type="gramStart"/>
       <w:r>
         <w:rPr>
           <w:sz w:val="22"/>
         </w:rPr>
         <w:lastRenderedPageBreak/>
-        <w:t xml:space="preserve">Mu and lambda will be </w:t>
+        <w:t>Mu</w:t>
+      </w:r>
+      <w:proofErr w:type="gramEnd"/>
+      <w:r>
+        <w:rPr>
+          <w:sz w:val="22"/>
+        </w:rPr>
+        <w:t xml:space="preserve"> and lambda will be </w:t>
       </w:r>
       <w:r>
         <w:rPr>
@@ -643,7 +721,21 @@
         <w:rPr>
           <w:sz w:val="22"/>
         </w:rPr>
-        <w:t xml:space="preserve"> on the results. </w:t>
+        <w:t xml:space="preserve"> </w:t>
+      </w:r>
+      <w:proofErr w:type="gramStart"/>
+      <w:r>
+        <w:rPr>
+          <w:sz w:val="22"/>
+        </w:rPr>
+        <w:t>on</w:t>
+      </w:r>
+      <w:proofErr w:type="gramEnd"/>
+      <w:r>
+        <w:rPr>
+          <w:sz w:val="22"/>
+        </w:rPr>
+        <w:t xml:space="preserve"> the results. </w:t>
       </w:r>
     </w:p>
     <w:p>
@@ -685,7 +777,7 @@
             <wp:docPr id="1759249917" name="Picture 1">
               <a:extLst xmlns:a="http://schemas.openxmlformats.org/drawingml/2006/main">
                 <a:ext uri="{FF2B5EF4-FFF2-40B4-BE49-F238E27FC236}">
-                  <a16:creationId xmlns:a16="http://schemas.microsoft.com/office/drawing/2014/main" id="{381B4941-E11A-4587-A573-890CF11C9A14}"/>
+                  <a16:creationId xmlns:a16="http://schemas.microsoft.com/office/drawing/2014/main" id="{C81EE2C1-7845-45D6-A735-ABBB991F4007}"/>
                 </a:ext>
               </a:extLst>
             </wp:docPr>
@@ -740,7 +832,7 @@
             <wp:docPr id="713763062" name="Picture 1">
               <a:extLst xmlns:a="http://schemas.openxmlformats.org/drawingml/2006/main">
                 <a:ext uri="{FF2B5EF4-FFF2-40B4-BE49-F238E27FC236}">
-                  <a16:creationId xmlns:a16="http://schemas.microsoft.com/office/drawing/2014/main" id="{266BA15C-8453-49CB-879D-ABDD56383CAE}"/>
+                  <a16:creationId xmlns:a16="http://schemas.microsoft.com/office/drawing/2014/main" id="{39CEF4F2-D65A-4AFE-829E-0B3DD7F6A985}"/>
                 </a:ext>
               </a:extLst>
             </wp:docPr>
@@ -794,7 +886,7 @@
             <wp:docPr id="2027737879" name="Picture 1">
               <a:extLst xmlns:a="http://schemas.openxmlformats.org/drawingml/2006/main">
                 <a:ext uri="{FF2B5EF4-FFF2-40B4-BE49-F238E27FC236}">
-                  <a16:creationId xmlns:a16="http://schemas.microsoft.com/office/drawing/2014/main" id="{DC9A3216-85BA-4A60-81A3-32E81DFB68EF}"/>
+                  <a16:creationId xmlns:a16="http://schemas.microsoft.com/office/drawing/2014/main" id="{52FA3C82-4D1A-45BB-B1CB-FD20530BE5BB}"/>
                 </a:ext>
               </a:extLst>
             </wp:docPr>
@@ -873,13 +965,29 @@
           <w:color w:val="EE0000"/>
           <w:sz w:val="22"/>
         </w:rPr>
-        <w:t>change the c_s formulation to remove the absolute value. We need sign information in objective, otherwise</w:t>
-      </w:r>
+        <w:t xml:space="preserve">change the </w:t>
+      </w:r>
+      <w:proofErr w:type="spellStart"/>
       <w:r>
         <w:rPr>
           <w:color w:val="EE0000"/>
           <w:sz w:val="22"/>
         </w:rPr>
+        <w:t>c_s</w:t>
+      </w:r>
+      <w:proofErr w:type="spellEnd"/>
+      <w:r>
+        <w:rPr>
+          <w:color w:val="EE0000"/>
+          <w:sz w:val="22"/>
+        </w:rPr>
+        <w:t xml:space="preserve"> formulation to remove the absolute value. We need sign information in objective, otherwise</w:t>
+      </w:r>
+      <w:r>
+        <w:rPr>
+          <w:color w:val="EE0000"/>
+          <w:sz w:val="22"/>
+        </w:rPr>
         <w:t xml:space="preserve"> a net contribution to a station would result in a negative </w:t>
       </w:r>
       <w:r>
@@ -889,6 +997,7 @@
         </w:rPr>
         <w:t xml:space="preserve">objective contribution since </w:t>
       </w:r>
+      <w:proofErr w:type="spellStart"/>
       <w:r>
         <w:rPr>
           <w:color w:val="EE0000"/>
@@ -904,6 +1013,7 @@
         </w:rPr>
         <w:t>stk</w:t>
       </w:r>
+      <w:proofErr w:type="spellEnd"/>
       <w:r>
         <w:rPr>
           <w:color w:val="EE0000"/>
@@ -916,22 +1026,47 @@
           <w:color w:val="EE0000"/>
           <w:sz w:val="22"/>
         </w:rPr>
-        <w:t>– y</w:t>
-      </w:r>
+        <w:t xml:space="preserve">– </w:t>
+      </w:r>
+      <w:proofErr w:type="spellStart"/>
       <w:r>
         <w:rPr>
           <w:color w:val="EE0000"/>
           <w:sz w:val="22"/>
+        </w:rPr>
+        <w:t>y</w:t>
+      </w:r>
+      <w:r>
+        <w:rPr>
+          <w:color w:val="EE0000"/>
+          <w:sz w:val="22"/>
           <w:vertAlign w:val="subscript"/>
         </w:rPr>
         <w:t>sTk</w:t>
       </w:r>
+      <w:proofErr w:type="spellEnd"/>
       <w:r>
         <w:rPr>
           <w:color w:val="EE0000"/>
           <w:sz w:val="22"/>
         </w:rPr>
-        <w:t xml:space="preserve"> would be negative with an always positive c_s. </w:t>
+        <w:t xml:space="preserve"> would be negative with an always positive </w:t>
+      </w:r>
+      <w:proofErr w:type="spellStart"/>
+      <w:r>
+        <w:rPr>
+          <w:color w:val="EE0000"/>
+          <w:sz w:val="22"/>
+        </w:rPr>
+        <w:t>c_s</w:t>
+      </w:r>
+      <w:proofErr w:type="spellEnd"/>
+      <w:r>
+        <w:rPr>
+          <w:color w:val="EE0000"/>
+          <w:sz w:val="22"/>
+        </w:rPr>
+        <w:t xml:space="preserve">. </w:t>
       </w:r>
     </w:p>
     <w:p>
@@ -1190,6 +1325,7 @@
           <w:szCs w:val="22"/>
         </w:rPr>
       </w:pPr>
+      <w:proofErr w:type="spellStart"/>
       <w:r>
         <w:rPr>
           <w:sz w:val="28"/>
@@ -1205,6 +1341,7 @@
         </w:rPr>
         <w:t>stk</w:t>
       </w:r>
+      <w:proofErr w:type="spellEnd"/>
       <w:r>
         <w:rPr>
           <w:szCs w:val="28"/>
@@ -1274,6 +1411,7 @@
           <w:szCs w:val="22"/>
         </w:rPr>
       </w:pPr>
+      <w:proofErr w:type="spellStart"/>
       <w:r>
         <w:rPr>
           <w:sz w:val="28"/>
@@ -1289,6 +1427,7 @@
         </w:rPr>
         <w:t>stk</w:t>
       </w:r>
+      <w:proofErr w:type="spellEnd"/>
       <w:r>
         <w:rPr>
           <w:szCs w:val="28"/>
@@ -1300,7 +1439,23 @@
           <w:sz w:val="22"/>
           <w:szCs w:val="22"/>
         </w:rPr>
-        <w:t xml:space="preserve">How many bikes accessible to truck </w:t>
+        <w:t xml:space="preserve">How many bikes </w:t>
+      </w:r>
+      <w:proofErr w:type="gramStart"/>
+      <w:r>
+        <w:rPr>
+          <w:sz w:val="22"/>
+          <w:szCs w:val="22"/>
+        </w:rPr>
+        <w:t>accessible</w:t>
+      </w:r>
+      <w:proofErr w:type="gramEnd"/>
+      <w:r>
+        <w:rPr>
+          <w:sz w:val="22"/>
+          <w:szCs w:val="22"/>
+        </w:rPr>
+        <w:t xml:space="preserve"> to truck </w:t>
       </w:r>
       <w:r>
         <w:rPr>
@@ -1378,6 +1533,7 @@
           <w:szCs w:val="22"/>
         </w:rPr>
       </w:pPr>
+      <w:proofErr w:type="spellStart"/>
       <w:r>
         <w:rPr>
           <w:sz w:val="28"/>
@@ -1393,6 +1549,7 @@
         </w:rPr>
         <w:t>tk</w:t>
       </w:r>
+      <w:proofErr w:type="spellEnd"/>
       <w:r>
         <w:rPr>
           <w:szCs w:val="28"/>
@@ -1831,7 +1988,7 @@
             <wp:docPr id="344799194" name="Picture 1">
               <a:extLst xmlns:a="http://schemas.openxmlformats.org/drawingml/2006/main">
                 <a:ext uri="{FF2B5EF4-FFF2-40B4-BE49-F238E27FC236}">
-                  <a16:creationId xmlns:a16="http://schemas.microsoft.com/office/drawing/2014/main" id="{E590F03C-0565-4DA6-8435-B80A6299828A}"/>
+                  <a16:creationId xmlns:a16="http://schemas.microsoft.com/office/drawing/2014/main" id="{E573506B-D2F6-4A27-9248-71467F768BC9}"/>
                 </a:ext>
               </a:extLst>
             </wp:docPr>
@@ -2075,7 +2232,7 @@
             <wp:docPr id="809812771" name="Picture 1">
               <a:extLst xmlns:a="http://schemas.openxmlformats.org/drawingml/2006/main">
                 <a:ext uri="{FF2B5EF4-FFF2-40B4-BE49-F238E27FC236}">
-                  <a16:creationId xmlns:a16="http://schemas.microsoft.com/office/drawing/2014/main" id="{112D9B3B-C5ED-4FB6-B4A5-29F7B3FFD3CA}"/>
+                  <a16:creationId xmlns:a16="http://schemas.microsoft.com/office/drawing/2014/main" id="{DEF12094-FC22-4FD8-B429-DE84F74D97E6}"/>
                 </a:ext>
               </a:extLst>
             </wp:docPr>
@@ -2309,7 +2466,7 @@
             <wp:docPr id="8817493" name="Picture 1">
               <a:extLst xmlns:a="http://schemas.openxmlformats.org/drawingml/2006/main">
                 <a:ext uri="{FF2B5EF4-FFF2-40B4-BE49-F238E27FC236}">
-                  <a16:creationId xmlns:a16="http://schemas.microsoft.com/office/drawing/2014/main" id="{94F5684C-D682-444C-9DE5-5B104098F213}"/>
+                  <a16:creationId xmlns:a16="http://schemas.microsoft.com/office/drawing/2014/main" id="{46CFAA6C-2F01-4A78-A824-9BB2DDE54BFF}"/>
                 </a:ext>
               </a:extLst>
             </wp:docPr>
@@ -2360,6 +2517,7 @@
         </w:rPr>
         <w:t xml:space="preserve">So </w:t>
       </w:r>
+      <w:proofErr w:type="spellStart"/>
       <w:r>
         <w:rPr>
           <w:b/>
@@ -2379,6 +2537,7 @@
         </w:rPr>
         <w:t>stk</w:t>
       </w:r>
+      <w:proofErr w:type="spellEnd"/>
       <w:r>
         <w:rPr>
           <w:b/>
@@ -2620,7 +2779,23 @@
           <w:sz w:val="22"/>
           <w:szCs w:val="22"/>
         </w:rPr>
-        <w:t>station in the previous time period (</w:t>
+        <w:t xml:space="preserve">station in the previous </w:t>
+      </w:r>
+      <w:proofErr w:type="gramStart"/>
+      <w:r>
+        <w:rPr>
+          <w:sz w:val="22"/>
+          <w:szCs w:val="22"/>
+        </w:rPr>
+        <w:t>time period</w:t>
+      </w:r>
+      <w:proofErr w:type="gramEnd"/>
+      <w:r>
+        <w:rPr>
+          <w:sz w:val="22"/>
+          <w:szCs w:val="22"/>
+        </w:rPr>
+        <w:t xml:space="preserve"> (</w:t>
       </w:r>
       <w:r>
         <w:rPr>
@@ -2636,7 +2811,15 @@
           <w:sz w:val="22"/>
           <w:szCs w:val="22"/>
         </w:rPr>
-        <w:t>) or if it was in a station</w:t>
+        <w:t xml:space="preserve">) or if it was in a </w:t>
+      </w:r>
+      <w:proofErr w:type="gramStart"/>
+      <w:r>
+        <w:rPr>
+          <w:sz w:val="22"/>
+          <w:szCs w:val="22"/>
+        </w:rPr>
+        <w:t>station</w:t>
       </w:r>
       <w:r>
         <w:rPr>
@@ -2659,7 +2842,17 @@
           <w:sz w:val="22"/>
           <w:szCs w:val="22"/>
         </w:rPr>
-        <w:t>s’</w:t>
+        <w:t>s</w:t>
+      </w:r>
+      <w:proofErr w:type="gramEnd"/>
+      <w:r>
+        <w:rPr>
+          <w:b/>
+          <w:bCs/>
+          <w:sz w:val="22"/>
+          <w:szCs w:val="22"/>
+        </w:rPr>
+        <w:t>’</w:t>
       </w:r>
       <w:r>
         <w:rPr>
@@ -2682,7 +2875,23 @@
           <w:sz w:val="22"/>
           <w:szCs w:val="22"/>
         </w:rPr>
-        <w:t xml:space="preserve">, in the previous time period. </w:t>
+        <w:t xml:space="preserve">, in the previous </w:t>
+      </w:r>
+      <w:proofErr w:type="gramStart"/>
+      <w:r>
+        <w:rPr>
+          <w:sz w:val="22"/>
+          <w:szCs w:val="22"/>
+        </w:rPr>
+        <w:t>time period</w:t>
+      </w:r>
+      <w:proofErr w:type="gramEnd"/>
+      <w:r>
+        <w:rPr>
+          <w:sz w:val="22"/>
+          <w:szCs w:val="22"/>
+        </w:rPr>
+        <w:t xml:space="preserve">. </w:t>
       </w:r>
     </w:p>
     <w:p>
@@ -2736,7 +2945,7 @@
             <wp:docPr id="1892747924" name="Picture 1">
               <a:extLst xmlns:a="http://schemas.openxmlformats.org/drawingml/2006/main">
                 <a:ext uri="{FF2B5EF4-FFF2-40B4-BE49-F238E27FC236}">
-                  <a16:creationId xmlns:a16="http://schemas.microsoft.com/office/drawing/2014/main" id="{7922BBFF-AAA3-474F-9119-C70D0939D262}"/>
+                  <a16:creationId xmlns:a16="http://schemas.microsoft.com/office/drawing/2014/main" id="{6F53C04E-F660-46EE-85A3-DC223667B245}"/>
                 </a:ext>
               </a:extLst>
             </wp:docPr>
@@ -2898,7 +3107,7 @@
             <wp:docPr id="2144857936" name="Picture 1">
               <a:extLst xmlns:a="http://schemas.openxmlformats.org/drawingml/2006/main">
                 <a:ext uri="{FF2B5EF4-FFF2-40B4-BE49-F238E27FC236}">
-                  <a16:creationId xmlns:a16="http://schemas.microsoft.com/office/drawing/2014/main" id="{758731CE-521C-4240-AA04-59FB20EB510C}"/>
+                  <a16:creationId xmlns:a16="http://schemas.microsoft.com/office/drawing/2014/main" id="{E4431477-7801-49E6-BA6D-D08CE88801FA}"/>
                 </a:ext>
               </a:extLst>
             </wp:docPr>
@@ -2986,7 +3195,39 @@
           <w:sz w:val="22"/>
           <w:szCs w:val="22"/>
         </w:rPr>
-        <w:t xml:space="preserve"> trucks during time period 1 must be equal to the starting amount of bikes at that station. </w:t>
+        <w:t xml:space="preserve"> trucks during </w:t>
+      </w:r>
+      <w:proofErr w:type="gramStart"/>
+      <w:r>
+        <w:rPr>
+          <w:sz w:val="22"/>
+          <w:szCs w:val="22"/>
+        </w:rPr>
+        <w:t>time period</w:t>
+      </w:r>
+      <w:proofErr w:type="gramEnd"/>
+      <w:r>
+        <w:rPr>
+          <w:sz w:val="22"/>
+          <w:szCs w:val="22"/>
+        </w:rPr>
+        <w:t xml:space="preserve"> 1 must be equal to the starting </w:t>
+      </w:r>
+      <w:proofErr w:type="gramStart"/>
+      <w:r>
+        <w:rPr>
+          <w:sz w:val="22"/>
+          <w:szCs w:val="22"/>
+        </w:rPr>
+        <w:t>amount</w:t>
+      </w:r>
+      <w:proofErr w:type="gramEnd"/>
+      <w:r>
+        <w:rPr>
+          <w:sz w:val="22"/>
+          <w:szCs w:val="22"/>
+        </w:rPr>
+        <w:t xml:space="preserve"> of bikes at that station. </w:t>
       </w:r>
     </w:p>
     <w:p>
@@ -3039,7 +3280,7 @@
             <wp:docPr id="188835607" name="Picture 1">
               <a:extLst xmlns:a="http://schemas.openxmlformats.org/drawingml/2006/main">
                 <a:ext uri="{FF2B5EF4-FFF2-40B4-BE49-F238E27FC236}">
-                  <a16:creationId xmlns:a16="http://schemas.microsoft.com/office/drawing/2014/main" id="{6904E037-E395-4173-85D7-4D50CC568B30}"/>
+                  <a16:creationId xmlns:a16="http://schemas.microsoft.com/office/drawing/2014/main" id="{FE9EF6D7-A87E-47AD-AA30-1952BFDDAF1B}"/>
                 </a:ext>
               </a:extLst>
             </wp:docPr>
@@ -3204,7 +3445,7 @@
             <wp:docPr id="517351163" name="Picture 1">
               <a:extLst xmlns:a="http://schemas.openxmlformats.org/drawingml/2006/main">
                 <a:ext uri="{FF2B5EF4-FFF2-40B4-BE49-F238E27FC236}">
-                  <a16:creationId xmlns:a16="http://schemas.microsoft.com/office/drawing/2014/main" id="{8DBFB709-F8C9-463D-B2D2-6EA14FDCD7A0}"/>
+                  <a16:creationId xmlns:a16="http://schemas.microsoft.com/office/drawing/2014/main" id="{C3283230-A4A9-4C46-B3E8-CB26E6F59A6C}"/>
                 </a:ext>
               </a:extLst>
             </wp:docPr>
@@ -3306,7 +3547,7 @@
             <wp:docPr id="1818024232" name="Picture 1">
               <a:extLst xmlns:a="http://schemas.openxmlformats.org/drawingml/2006/main">
                 <a:ext uri="{FF2B5EF4-FFF2-40B4-BE49-F238E27FC236}">
-                  <a16:creationId xmlns:a16="http://schemas.microsoft.com/office/drawing/2014/main" id="{6C6CD5EE-2753-44E5-89D3-3737692D3E4E}"/>
+                  <a16:creationId xmlns:a16="http://schemas.microsoft.com/office/drawing/2014/main" id="{986FC0A1-5D51-4637-A380-19B19DDD0895}"/>
                 </a:ext>
               </a:extLst>
             </wp:docPr>
@@ -3430,7 +3671,7 @@
             <wp:docPr id="2140868630" name="Picture 1">
               <a:extLst xmlns:a="http://schemas.openxmlformats.org/drawingml/2006/main">
                 <a:ext uri="{FF2B5EF4-FFF2-40B4-BE49-F238E27FC236}">
-                  <a16:creationId xmlns:a16="http://schemas.microsoft.com/office/drawing/2014/main" id="{9837D3E1-9D9D-4D3C-A096-B4AB4D78A2F1}"/>
+                  <a16:creationId xmlns:a16="http://schemas.microsoft.com/office/drawing/2014/main" id="{BF666AAB-7190-4C39-9BCA-7997A36D67FC}"/>
                 </a:ext>
               </a:extLst>
             </wp:docPr>
@@ -3619,7 +3860,7 @@
             <wp:docPr id="1161314185" name="Picture 1">
               <a:extLst xmlns:a="http://schemas.openxmlformats.org/drawingml/2006/main">
                 <a:ext uri="{FF2B5EF4-FFF2-40B4-BE49-F238E27FC236}">
-                  <a16:creationId xmlns:a16="http://schemas.microsoft.com/office/drawing/2014/main" id="{2FDE4BE6-4CB5-47A6-8499-6B6DB10258D7}"/>
+                  <a16:creationId xmlns:a16="http://schemas.microsoft.com/office/drawing/2014/main" id="{C8FCDA63-82D5-4C59-8E7F-425A2EB40516}"/>
                 </a:ext>
               </a:extLst>
             </wp:docPr>
@@ -3689,14 +3930,46 @@
           <w:sz w:val="22"/>
           <w:szCs w:val="22"/>
         </w:rPr>
-        <w:t xml:space="preserve"> of bikes at a station assigned to a truck from one adjacent time period to the next, the truck must have loaded or unloaded. Since this term is &gt; 0 in this case, the second term</w:t>
-      </w:r>
-      <w:r>
-        <w:rPr>
-          <w:sz w:val="22"/>
-          <w:szCs w:val="22"/>
-        </w:rPr>
-        <w:t xml:space="preserve">, representing a change in the location of a truck over the course of a time period change, </w:t>
+        <w:t xml:space="preserve"> of bikes at a station assigned to a truck from one adjacent </w:t>
+      </w:r>
+      <w:proofErr w:type="gramStart"/>
+      <w:r>
+        <w:rPr>
+          <w:sz w:val="22"/>
+          <w:szCs w:val="22"/>
+        </w:rPr>
+        <w:t>time period</w:t>
+      </w:r>
+      <w:proofErr w:type="gramEnd"/>
+      <w:r>
+        <w:rPr>
+          <w:sz w:val="22"/>
+          <w:szCs w:val="22"/>
+        </w:rPr>
+        <w:t xml:space="preserve"> to the next, the truck must have loaded or unloaded. Since this term is &gt; 0 in this case, the second term</w:t>
+      </w:r>
+      <w:r>
+        <w:rPr>
+          <w:sz w:val="22"/>
+          <w:szCs w:val="22"/>
+        </w:rPr>
+        <w:t xml:space="preserve">, representing a change in the location of a truck over the course of </w:t>
+      </w:r>
+      <w:proofErr w:type="gramStart"/>
+      <w:r>
+        <w:rPr>
+          <w:sz w:val="22"/>
+          <w:szCs w:val="22"/>
+        </w:rPr>
+        <w:t>a time period</w:t>
+      </w:r>
+      <w:proofErr w:type="gramEnd"/>
+      <w:r>
+        <w:rPr>
+          <w:sz w:val="22"/>
+          <w:szCs w:val="22"/>
+        </w:rPr>
+        <w:t xml:space="preserve"> change, </w:t>
       </w:r>
       <w:r>
         <w:rPr>
@@ -3795,7 +4068,39 @@
           <w:sz w:val="22"/>
           <w:szCs w:val="22"/>
         </w:rPr>
-        <w:t xml:space="preserve"> (Maybe shrink down scope cuz that’s like a billion records)</w:t>
+        <w:t xml:space="preserve"> (Maybe shrink </w:t>
+      </w:r>
+      <w:proofErr w:type="gramStart"/>
+      <w:r>
+        <w:rPr>
+          <w:sz w:val="22"/>
+          <w:szCs w:val="22"/>
+        </w:rPr>
+        <w:t>down scope</w:t>
+      </w:r>
+      <w:proofErr w:type="gramEnd"/>
+      <w:r>
+        <w:rPr>
+          <w:sz w:val="22"/>
+          <w:szCs w:val="22"/>
+        </w:rPr>
+        <w:t xml:space="preserve"> </w:t>
+      </w:r>
+      <w:proofErr w:type="spellStart"/>
+      <w:r>
+        <w:rPr>
+          <w:sz w:val="22"/>
+          <w:szCs w:val="22"/>
+        </w:rPr>
+        <w:t>cuz</w:t>
+      </w:r>
+      <w:proofErr w:type="spellEnd"/>
+      <w:r>
+        <w:rPr>
+          <w:sz w:val="22"/>
+          <w:szCs w:val="22"/>
+        </w:rPr>
+        <w:t xml:space="preserve"> that’s like a billion records)</w:t>
       </w:r>
     </w:p>
     <w:p>
@@ -3810,12 +4115,21 @@
         </w:rPr>
         <w:t xml:space="preserve">Historical timestamps of bike availability at stations gathered from </w:t>
       </w:r>
-      <w:r>
-        <w:rPr>
-          <w:sz w:val="22"/>
-        </w:rPr>
-        <w:t xml:space="preserve">CityBikes (independent aggregator) at the </w:t>
-      </w:r>
+      <w:proofErr w:type="spellStart"/>
+      <w:r>
+        <w:rPr>
+          <w:sz w:val="22"/>
+        </w:rPr>
+        <w:t>CityBikes</w:t>
+      </w:r>
+      <w:proofErr w:type="spellEnd"/>
+      <w:r>
+        <w:rPr>
+          <w:sz w:val="22"/>
+        </w:rPr>
+        <w:t xml:space="preserve"> (independent aggregator) at the </w:t>
+      </w:r>
+      <w:proofErr w:type="spellStart"/>
       <w:r>
         <w:rPr>
           <w:sz w:val="22"/>
@@ -3826,7 +4140,14 @@
         <w:rPr>
           <w:sz w:val="22"/>
         </w:rPr>
-        <w:t xml:space="preserve">itibikes </w:t>
+        <w:t>itibikes</w:t>
+      </w:r>
+      <w:proofErr w:type="spellEnd"/>
+      <w:r>
+        <w:rPr>
+          <w:sz w:val="22"/>
+        </w:rPr>
+        <w:t xml:space="preserve"> </w:t>
       </w:r>
       <w:r>
         <w:rPr>
@@ -3901,11 +4222,19 @@
         </w:rPr>
         <w:t xml:space="preserve">gathered from </w:t>
       </w:r>
-      <w:r>
-        <w:rPr>
-          <w:sz w:val="22"/>
-        </w:rPr>
-        <w:t xml:space="preserve">Citibikes NYC directly. Shows all trips with timestamps. </w:t>
+      <w:proofErr w:type="spellStart"/>
+      <w:r>
+        <w:rPr>
+          <w:sz w:val="22"/>
+        </w:rPr>
+        <w:t>Citibikes</w:t>
+      </w:r>
+      <w:proofErr w:type="spellEnd"/>
+      <w:r>
+        <w:rPr>
+          <w:sz w:val="22"/>
+        </w:rPr>
+        <w:t xml:space="preserve"> NYC directly. Shows all trips with timestamps. </w:t>
       </w:r>
       <w:r>
         <w:rPr>
@@ -3972,7 +4301,21 @@
         <w:rPr>
           <w:sz w:val="22"/>
         </w:rPr>
-        <w:t xml:space="preserve">Freund, D., Norouzi-Fard, A., Paul, A., Wang, C., Henderson, S., &amp; Shmoys, D. (2020). </w:t>
+        <w:t xml:space="preserve">Freund, D., Norouzi-Fard, A., Paul, A., Wang, C., Henderson, S., &amp; </w:t>
+      </w:r>
+      <w:proofErr w:type="spellStart"/>
+      <w:r>
+        <w:rPr>
+          <w:sz w:val="22"/>
+        </w:rPr>
+        <w:t>Shmoys</w:t>
+      </w:r>
+      <w:proofErr w:type="spellEnd"/>
+      <w:r>
+        <w:rPr>
+          <w:sz w:val="22"/>
+        </w:rPr>
+        <w:t xml:space="preserve">, D. (2020). </w:t>
       </w:r>
       <w:r>
         <w:rPr>
@@ -4025,7 +4368,21 @@
         <w:rPr>
           <w:sz w:val="22"/>
         </w:rPr>
-        <w:t>O’Mahony, E., &amp; Shmoys, D. (2015). Data Analysis and Optimization for (Citi)Bike Sharing. </w:t>
+        <w:t xml:space="preserve">O’Mahony, E., &amp; </w:t>
+      </w:r>
+      <w:proofErr w:type="spellStart"/>
+      <w:r>
+        <w:rPr>
+          <w:sz w:val="22"/>
+        </w:rPr>
+        <w:t>Shmoys</w:t>
+      </w:r>
+      <w:proofErr w:type="spellEnd"/>
+      <w:r>
+        <w:rPr>
+          <w:sz w:val="22"/>
+        </w:rPr>
+        <w:t>, D. (2015). Data Analysis and Optimization for (Citi)Bike Sharing. </w:t>
       </w:r>
       <w:r>
         <w:rPr>
@@ -4153,20 +4510,38 @@
           <w:bCs/>
           <w:sz w:val="22"/>
         </w:rPr>
-        <w:t xml:space="preserve"> from CityBikes</w:t>
-      </w:r>
-    </w:p>
-    <w:p>
-      <w:pPr>
-        <w:rPr>
-          <w:sz w:val="22"/>
-        </w:rPr>
-      </w:pPr>
-      <w:r>
-        <w:rPr>
-          <w:sz w:val="22"/>
-        </w:rPr>
-        <w:t xml:space="preserve">CityBikes. (2024). </w:t>
+        <w:t xml:space="preserve"> from </w:t>
+      </w:r>
+      <w:proofErr w:type="spellStart"/>
+      <w:r>
+        <w:rPr>
+          <w:b/>
+          <w:bCs/>
+          <w:sz w:val="22"/>
+        </w:rPr>
+        <w:t>CityBikes</w:t>
+      </w:r>
+      <w:proofErr w:type="spellEnd"/>
+    </w:p>
+    <w:p>
+      <w:pPr>
+        <w:rPr>
+          <w:sz w:val="22"/>
+        </w:rPr>
+      </w:pPr>
+      <w:proofErr w:type="spellStart"/>
+      <w:r>
+        <w:rPr>
+          <w:sz w:val="22"/>
+        </w:rPr>
+        <w:t>CityBikes</w:t>
+      </w:r>
+      <w:proofErr w:type="spellEnd"/>
+      <w:r>
+        <w:rPr>
+          <w:sz w:val="22"/>
+        </w:rPr>
+        <w:t xml:space="preserve">. (2024). </w:t>
       </w:r>
       <w:r>
         <w:rPr>
@@ -4174,8 +4549,18 @@
           <w:iCs/>
           <w:sz w:val="22"/>
         </w:rPr>
-        <w:t>Data | Citybikes</w:t>
-      </w:r>
+        <w:t xml:space="preserve">Data | </w:t>
+      </w:r>
+      <w:proofErr w:type="spellStart"/>
+      <w:r>
+        <w:rPr>
+          <w:i/>
+          <w:iCs/>
+          <w:sz w:val="22"/>
+        </w:rPr>
+        <w:t>Citybikes</w:t>
+      </w:r>
+      <w:proofErr w:type="spellEnd"/>
       <w:r>
         <w:rPr>
           <w:sz w:val="22"/>
@@ -4221,19 +4606,37 @@
           <w:sz w:val="22"/>
         </w:rPr>
       </w:pPr>
-      <w:r>
-        <w:rPr>
-          <w:sz w:val="22"/>
-        </w:rPr>
-        <w:t xml:space="preserve">CityBikes. (2026). </w:t>
-      </w:r>
+      <w:proofErr w:type="spellStart"/>
+      <w:r>
+        <w:rPr>
+          <w:sz w:val="22"/>
+        </w:rPr>
+        <w:t>CityBikes</w:t>
+      </w:r>
+      <w:proofErr w:type="spellEnd"/>
+      <w:r>
+        <w:rPr>
+          <w:sz w:val="22"/>
+        </w:rPr>
+        <w:t xml:space="preserve">. (2026). </w:t>
+      </w:r>
+      <w:proofErr w:type="spellStart"/>
       <w:r>
         <w:rPr>
           <w:i/>
           <w:iCs/>
           <w:sz w:val="22"/>
         </w:rPr>
-        <w:t>CityBikes: bike sharing networks around the world</w:t>
+        <w:t>CityBikes</w:t>
+      </w:r>
+      <w:proofErr w:type="spellEnd"/>
+      <w:r>
+        <w:rPr>
+          <w:i/>
+          <w:iCs/>
+          <w:sz w:val="22"/>
+        </w:rPr>
+        <w:t>: bike sharing networks around the world</w:t>
       </w:r>
       <w:r>
         <w:rPr>
@@ -6299,4 +6702,10 @@
     <ds:schemaRef ds:uri="http://schemas.openxmlformats.org/officeDocument/2006/bibliography"/>
   </ds:schemaRefs>
 </ds:datastoreItem>
+</file>
+
+<file path=docMetadata/LabelInfo.xml><?xml version="1.0" encoding="utf-8"?>
+<clbl:labelList xmlns:clbl="http://schemas.microsoft.com/office/2020/mipLabelMetadata">
+  <clbl:label id="{79c742c4-e61c-4fa5-be89-a3cb566a80d1}" enabled="0" method="" siteId="{79c742c4-e61c-4fa5-be89-a3cb566a80d1}" removed="1"/>
+</clbl:labelList>
 </file>
</xml_diff>

<commit_message>
First run at full model
</commit_message>
<xml_diff>
--- a/Deliverables/project_report_g1.docx
+++ b/Deliverables/project_report_g1.docx
@@ -32,6 +32,44 @@
           <w:iCs/>
         </w:rPr>
         <w:t>Group 1 – Abe Archer, Ethan Ericson, Trevor Bolena</w:t>
+      </w:r>
+    </w:p>
+    <w:p>
+      <w:pPr>
+        <w:pStyle w:val="ListParagraph"/>
+        <w:numPr>
+          <w:ilvl w:val="0"/>
+          <w:numId w:val="6"/>
+        </w:numPr>
+        <w:rPr>
+          <w:color w:val="EE0000"/>
+          <w:sz w:val="22"/>
+          <w:szCs w:val="22"/>
+        </w:rPr>
+      </w:pPr>
+      <w:r>
+        <w:rPr>
+          <w:color w:val="EE0000"/>
+          <w:sz w:val="22"/>
+          <w:szCs w:val="22"/>
+        </w:rPr>
+        <w:t xml:space="preserve">As of right now, we are computing lambda and mu for the entire month, then going through a day of the </w:t>
+      </w:r>
+      <w:r>
+        <w:rPr>
+          <w:color w:val="EE0000"/>
+          <w:sz w:val="22"/>
+          <w:szCs w:val="22"/>
+        </w:rPr>
+        <w:t xml:space="preserve">month like we </w:t>
+      </w:r>
+      <w:r>
+        <w:rPr>
+          <w:color w:val="EE0000"/>
+          <w:sz w:val="22"/>
+          <w:szCs w:val="22"/>
+        </w:rPr>
+        <w:t xml:space="preserve">haven’t already seen it and using the recorded nightly start amount to kick off the optimization model. </w:t>
       </w:r>
     </w:p>
     <w:p>
@@ -381,7 +419,7 @@
                     <pic:cNvPicPr/>
                   </pic:nvPicPr>
                   <pic:blipFill rotWithShape="1">
-                    <a:blip r:embed="rId6"/>
+                    <a:blip r:embed="rId5"/>
                     <a:srcRect l="29327" r="24680"/>
                     <a:stretch>
                       <a:fillRect/>
@@ -478,6 +516,7 @@
           <w:noProof/>
           <w:sz w:val="22"/>
         </w:rPr>
+        <w:lastRenderedPageBreak/>
         <w:drawing>
           <wp:inline distT="0" distB="0" distL="0" distR="0" wp14:anchorId="44C2BFDD" wp14:editId="7E475D12">
             <wp:extent cx="4800600" cy="1236052"/>
@@ -500,7 +539,7 @@
                     <pic:cNvPicPr/>
                   </pic:nvPicPr>
                   <pic:blipFill>
-                    <a:blip r:embed="rId7"/>
+                    <a:blip r:embed="rId6"/>
                     <a:stretch>
                       <a:fillRect/>
                     </a:stretch>
@@ -532,7 +571,6 @@
         <w:rPr>
           <w:sz w:val="22"/>
         </w:rPr>
-        <w:lastRenderedPageBreak/>
         <w:t>Mu</w:t>
       </w:r>
       <w:proofErr w:type="gramEnd"/>
@@ -792,7 +830,7 @@
                     <pic:cNvPicPr/>
                   </pic:nvPicPr>
                   <pic:blipFill>
-                    <a:blip r:embed="rId8"/>
+                    <a:blip r:embed="rId7"/>
                     <a:stretch>
                       <a:fillRect/>
                     </a:stretch>
@@ -847,7 +885,7 @@
                     <pic:cNvPicPr/>
                   </pic:nvPicPr>
                   <pic:blipFill>
-                    <a:blip r:embed="rId9"/>
+                    <a:blip r:embed="rId8"/>
                     <a:stretch>
                       <a:fillRect/>
                     </a:stretch>
@@ -870,57 +908,2788 @@
     </w:p>
     <w:p>
       <w:pPr>
-        <w:rPr>
-          <w:sz w:val="22"/>
-        </w:rPr>
-      </w:pPr>
-      <w:r>
-        <w:rPr>
-          <w:noProof/>
-          <w:sz w:val="22"/>
-        </w:rPr>
-        <w:drawing>
-          <wp:inline distT="0" distB="0" distL="0" distR="0" wp14:anchorId="680B8DBA" wp14:editId="417A637B">
-            <wp:extent cx="5943600" cy="3288030"/>
-            <wp:effectExtent l="0" t="0" r="0" b="7620"/>
-            <wp:docPr id="2027737879" name="Picture 1">
-              <a:extLst xmlns:a="http://schemas.openxmlformats.org/drawingml/2006/main">
-                <a:ext uri="{FF2B5EF4-FFF2-40B4-BE49-F238E27FC236}">
-                  <a16:creationId xmlns:a16="http://schemas.microsoft.com/office/drawing/2014/main" id="{52FA3C82-4D1A-45BB-B1CB-FD20530BE5BB}"/>
-                </a:ext>
-              </a:extLst>
-            </wp:docPr>
-            <wp:cNvGraphicFramePr>
-              <a:graphicFrameLocks xmlns:a="http://schemas.openxmlformats.org/drawingml/2006/main" noChangeAspect="1"/>
-            </wp:cNvGraphicFramePr>
-            <a:graphic xmlns:a="http://schemas.openxmlformats.org/drawingml/2006/main">
-              <a:graphicData uri="http://schemas.openxmlformats.org/drawingml/2006/picture">
-                <pic:pic xmlns:pic="http://schemas.openxmlformats.org/drawingml/2006/picture">
-                  <pic:nvPicPr>
-                    <pic:cNvPr id="2027737879" name=""/>
-                    <pic:cNvPicPr/>
-                  </pic:nvPicPr>
-                  <pic:blipFill>
-                    <a:blip r:embed="rId10"/>
-                    <a:stretch>
-                      <a:fillRect/>
-                    </a:stretch>
-                  </pic:blipFill>
-                  <pic:spPr>
-                    <a:xfrm>
-                      <a:off x="0" y="0"/>
-                      <a:ext cx="5943600" cy="3288030"/>
-                    </a:xfrm>
-                    <a:prstGeom prst="rect">
-                      <a:avLst/>
-                    </a:prstGeom>
-                  </pic:spPr>
-                </pic:pic>
-              </a:graphicData>
-            </a:graphic>
-          </wp:inline>
-        </w:drawing>
-      </w:r>
+        <w:shd w:val="clear" w:color="auto" w:fill="191A1B"/>
+        <w:spacing w:after="100" w:afterAutospacing="1" w:line="240" w:lineRule="auto"/>
+        <w:outlineLvl w:val="1"/>
+        <w:rPr>
+          <w:rFonts w:ascii="Segoe UI" w:eastAsia="Times New Roman" w:hAnsi="Segoe UI" w:cs="Segoe UI"/>
+          <w:b/>
+          <w:bCs/>
+          <w:color w:val="BFBFBF"/>
+          <w:kern w:val="0"/>
+          <w:sz w:val="36"/>
+          <w:szCs w:val="36"/>
+          <w14:ligatures w14:val="none"/>
+        </w:rPr>
+      </w:pPr>
+      <w:r>
+        <w:rPr>
+          <w:rFonts w:ascii="Segoe UI" w:eastAsia="Times New Roman" w:hAnsi="Segoe UI" w:cs="Segoe UI"/>
+          <w:b/>
+          <w:bCs/>
+          <w:color w:val="BFBFBF"/>
+          <w:kern w:val="0"/>
+          <w:sz w:val="36"/>
+          <w:szCs w:val="36"/>
+          <w14:ligatures w14:val="none"/>
+        </w:rPr>
+        <w:t>UDF Computation — Synopsis</w:t>
+      </w:r>
+    </w:p>
+    <w:p>
+      <w:pPr>
+        <w:shd w:val="clear" w:color="auto" w:fill="191A1B"/>
+        <w:spacing w:before="100" w:beforeAutospacing="1" w:after="100" w:afterAutospacing="1" w:line="240" w:lineRule="auto"/>
+        <w:outlineLvl w:val="2"/>
+        <w:rPr>
+          <w:rFonts w:ascii="Segoe UI" w:eastAsia="Times New Roman" w:hAnsi="Segoe UI" w:cs="Segoe UI"/>
+          <w:b/>
+          <w:bCs/>
+          <w:color w:val="BFBFBF"/>
+          <w:kern w:val="0"/>
+          <w:sz w:val="27"/>
+          <w:szCs w:val="27"/>
+          <w14:ligatures w14:val="none"/>
+        </w:rPr>
+      </w:pPr>
+      <w:r>
+        <w:rPr>
+          <w:rFonts w:ascii="Segoe UI" w:eastAsia="Times New Roman" w:hAnsi="Segoe UI" w:cs="Segoe UI"/>
+          <w:b/>
+          <w:bCs/>
+          <w:color w:val="BFBFBF"/>
+          <w:kern w:val="0"/>
+          <w:sz w:val="27"/>
+          <w:szCs w:val="27"/>
+          <w14:ligatures w14:val="none"/>
+        </w:rPr>
+        <w:t>The Goal</w:t>
+      </w:r>
+    </w:p>
+    <w:p>
+      <w:pPr>
+        <w:shd w:val="clear" w:color="auto" w:fill="191A1B"/>
+        <w:spacing w:before="24" w:after="48" w:line="240" w:lineRule="auto"/>
+        <w:rPr>
+          <w:rFonts w:ascii="Segoe UI" w:eastAsia="Times New Roman" w:hAnsi="Segoe UI" w:cs="Segoe UI"/>
+          <w:color w:val="BFBFBF"/>
+          <w:kern w:val="0"/>
+          <w:sz w:val="20"/>
+          <w:szCs w:val="20"/>
+          <w14:ligatures w14:val="none"/>
+        </w:rPr>
+      </w:pPr>
+      <w:r>
+        <w:rPr>
+          <w:rFonts w:ascii="Segoe UI" w:eastAsia="Times New Roman" w:hAnsi="Segoe UI" w:cs="Segoe UI"/>
+          <w:color w:val="BFBFBF"/>
+          <w:kern w:val="0"/>
+          <w:sz w:val="20"/>
+          <w:szCs w:val="20"/>
+          <w14:ligatures w14:val="none"/>
+        </w:rPr>
+        <w:t xml:space="preserve">For each station, </w:t>
+      </w:r>
+      <w:proofErr w:type="gramStart"/>
+      <w:r>
+        <w:rPr>
+          <w:rFonts w:ascii="Segoe UI" w:eastAsia="Times New Roman" w:hAnsi="Segoe UI" w:cs="Segoe UI"/>
+          <w:color w:val="BFBFBF"/>
+          <w:kern w:val="0"/>
+          <w:sz w:val="20"/>
+          <w:szCs w:val="20"/>
+          <w14:ligatures w14:val="none"/>
+        </w:rPr>
+        <w:t>compute</w:t>
+      </w:r>
+      <w:proofErr w:type="gramEnd"/>
+      <w:r>
+        <w:rPr>
+          <w:rFonts w:ascii="Segoe UI" w:eastAsia="Times New Roman" w:hAnsi="Segoe UI" w:cs="Segoe UI"/>
+          <w:color w:val="BFBFBF"/>
+          <w:kern w:val="0"/>
+          <w:sz w:val="20"/>
+          <w:szCs w:val="20"/>
+          <w14:ligatures w14:val="none"/>
+        </w:rPr>
+        <w:t xml:space="preserve"> </w:t>
+      </w:r>
+      <w:r>
+        <w:rPr>
+          <w:rFonts w:ascii="Courier New" w:eastAsia="Times New Roman" w:hAnsi="Courier New" w:cs="Courier New"/>
+          <w:color w:val="8C8C8C"/>
+          <w:kern w:val="0"/>
+          <w:sz w:val="18"/>
+          <w:szCs w:val="18"/>
+          <w:shd w:val="clear" w:color="auto" w:fill="262626"/>
+          <w14:ligatures w14:val="none"/>
+        </w:rPr>
+        <w:t>F_s(x_</w:t>
+      </w:r>
+      <w:proofErr w:type="gramStart"/>
+      <w:r>
+        <w:rPr>
+          <w:rFonts w:ascii="Courier New" w:eastAsia="Times New Roman" w:hAnsi="Courier New" w:cs="Courier New"/>
+          <w:color w:val="8C8C8C"/>
+          <w:kern w:val="0"/>
+          <w:sz w:val="18"/>
+          <w:szCs w:val="18"/>
+          <w:shd w:val="clear" w:color="auto" w:fill="262626"/>
+          <w14:ligatures w14:val="none"/>
+        </w:rPr>
+        <w:t>0)</w:t>
+      </w:r>
+      <w:r>
+        <w:rPr>
+          <w:rFonts w:ascii="Segoe UI" w:eastAsia="Times New Roman" w:hAnsi="Segoe UI" w:cs="Segoe UI"/>
+          <w:color w:val="BFBFBF"/>
+          <w:kern w:val="0"/>
+          <w:sz w:val="20"/>
+          <w:szCs w:val="20"/>
+          <w14:ligatures w14:val="none"/>
+        </w:rPr>
+        <w:t xml:space="preserve"> —</w:t>
+      </w:r>
+      <w:proofErr w:type="gramEnd"/>
+      <w:r>
+        <w:rPr>
+          <w:rFonts w:ascii="Segoe UI" w:eastAsia="Times New Roman" w:hAnsi="Segoe UI" w:cs="Segoe UI"/>
+          <w:color w:val="BFBFBF"/>
+          <w:kern w:val="0"/>
+          <w:sz w:val="20"/>
+          <w:szCs w:val="20"/>
+          <w14:ligatures w14:val="none"/>
+        </w:rPr>
+        <w:t xml:space="preserve"> expected dissatisfied users over the 900-minute operating day given </w:t>
+      </w:r>
+      <w:r>
+        <w:rPr>
+          <w:rFonts w:ascii="Courier New" w:eastAsia="Times New Roman" w:hAnsi="Courier New" w:cs="Courier New"/>
+          <w:color w:val="8C8C8C"/>
+          <w:kern w:val="0"/>
+          <w:sz w:val="18"/>
+          <w:szCs w:val="18"/>
+          <w:shd w:val="clear" w:color="auto" w:fill="262626"/>
+          <w14:ligatures w14:val="none"/>
+        </w:rPr>
+        <w:t>x_0</w:t>
+      </w:r>
+      <w:r>
+        <w:rPr>
+          <w:rFonts w:ascii="Segoe UI" w:eastAsia="Times New Roman" w:hAnsi="Segoe UI" w:cs="Segoe UI"/>
+          <w:color w:val="BFBFBF"/>
+          <w:kern w:val="0"/>
+          <w:sz w:val="20"/>
+          <w:szCs w:val="20"/>
+          <w14:ligatures w14:val="none"/>
+        </w:rPr>
+        <w:t xml:space="preserve"> bikes at 7am. We need this for every integer x_0 from 0 to κ.</w:t>
+      </w:r>
+    </w:p>
+    <w:p>
+      <w:pPr>
+        <w:spacing w:after="0" w:line="240" w:lineRule="auto"/>
+        <w:rPr>
+          <w:rFonts w:ascii="Segoe UI" w:eastAsia="Times New Roman" w:hAnsi="Segoe UI" w:cs="Segoe UI"/>
+          <w:kern w:val="0"/>
+          <w:sz w:val="20"/>
+          <w:szCs w:val="20"/>
+          <w14:ligatures w14:val="none"/>
+        </w:rPr>
+      </w:pPr>
+      <w:r>
+        <w:rPr>
+          <w:rFonts w:ascii="Times New Roman" w:eastAsia="Times New Roman" w:hAnsi="Times New Roman" w:cs="Times New Roman"/>
+          <w:kern w:val="0"/>
+          <w14:ligatures w14:val="none"/>
+        </w:rPr>
+        <w:pict w14:anchorId="50292937">
+          <v:rect id="_x0000_i1025" style="width:0;height:1.5pt" o:hralign="center" o:hrstd="t" o:hr="t" fillcolor="#a0a0a0" stroked="f"/>
+        </w:pict>
+      </w:r>
+    </w:p>
+    <w:p>
+      <w:pPr>
+        <w:shd w:val="clear" w:color="auto" w:fill="191A1B"/>
+        <w:spacing w:before="100" w:beforeAutospacing="1" w:after="100" w:afterAutospacing="1" w:line="240" w:lineRule="auto"/>
+        <w:outlineLvl w:val="2"/>
+        <w:rPr>
+          <w:rFonts w:ascii="Segoe UI" w:eastAsia="Times New Roman" w:hAnsi="Segoe UI" w:cs="Segoe UI"/>
+          <w:b/>
+          <w:bCs/>
+          <w:color w:val="BFBFBF"/>
+          <w:kern w:val="0"/>
+          <w:sz w:val="27"/>
+          <w:szCs w:val="27"/>
+          <w14:ligatures w14:val="none"/>
+        </w:rPr>
+      </w:pPr>
+      <w:r>
+        <w:rPr>
+          <w:rFonts w:ascii="Segoe UI" w:eastAsia="Times New Roman" w:hAnsi="Segoe UI" w:cs="Segoe UI"/>
+          <w:b/>
+          <w:bCs/>
+          <w:color w:val="BFBFBF"/>
+          <w:kern w:val="0"/>
+          <w:sz w:val="27"/>
+          <w:szCs w:val="27"/>
+          <w14:ligatures w14:val="none"/>
+        </w:rPr>
+        <w:t>The State Space</w:t>
+      </w:r>
+    </w:p>
+    <w:p>
+      <w:pPr>
+        <w:shd w:val="clear" w:color="auto" w:fill="191A1B"/>
+        <w:spacing w:before="24" w:after="48" w:line="240" w:lineRule="auto"/>
+        <w:rPr>
+          <w:rFonts w:ascii="Segoe UI" w:eastAsia="Times New Roman" w:hAnsi="Segoe UI" w:cs="Segoe UI"/>
+          <w:color w:val="BFBFBF"/>
+          <w:kern w:val="0"/>
+          <w:sz w:val="20"/>
+          <w:szCs w:val="20"/>
+          <w14:ligatures w14:val="none"/>
+        </w:rPr>
+      </w:pPr>
+      <w:r>
+        <w:rPr>
+          <w:rFonts w:ascii="Segoe UI" w:eastAsia="Times New Roman" w:hAnsi="Segoe UI" w:cs="Segoe UI"/>
+          <w:color w:val="BFBFBF"/>
+          <w:kern w:val="0"/>
+          <w:sz w:val="20"/>
+          <w:szCs w:val="20"/>
+          <w14:ligatures w14:val="none"/>
+        </w:rPr>
+        <w:t xml:space="preserve">Each station is modeled as an M/M/1/κ queue. At any minute t, the station is in one of κ+1 states (0 bikes, 1 bike, ..., κ bikes). Because users arrive randomly, we can't know the exact state — only a </w:t>
+      </w:r>
+      <w:r>
+        <w:rPr>
+          <w:rFonts w:ascii="Segoe UI" w:eastAsia="Times New Roman" w:hAnsi="Segoe UI" w:cs="Segoe UI"/>
+          <w:b/>
+          <w:bCs/>
+          <w:color w:val="BFBFBF"/>
+          <w:kern w:val="0"/>
+          <w:sz w:val="20"/>
+          <w:szCs w:val="20"/>
+          <w14:ligatures w14:val="none"/>
+        </w:rPr>
+        <w:t>probability distribution</w:t>
+      </w:r>
+      <w:r>
+        <w:rPr>
+          <w:rFonts w:ascii="Segoe UI" w:eastAsia="Times New Roman" w:hAnsi="Segoe UI" w:cs="Segoe UI"/>
+          <w:color w:val="BFBFBF"/>
+          <w:kern w:val="0"/>
+          <w:sz w:val="20"/>
+          <w:szCs w:val="20"/>
+          <w14:ligatures w14:val="none"/>
+        </w:rPr>
+        <w:t xml:space="preserve"> over states.</w:t>
+      </w:r>
+    </w:p>
+    <w:p>
+      <w:pPr>
+        <w:spacing w:after="0" w:line="240" w:lineRule="auto"/>
+        <w:rPr>
+          <w:rFonts w:ascii="Segoe UI" w:eastAsia="Times New Roman" w:hAnsi="Segoe UI" w:cs="Segoe UI"/>
+          <w:kern w:val="0"/>
+          <w:sz w:val="20"/>
+          <w:szCs w:val="20"/>
+          <w14:ligatures w14:val="none"/>
+        </w:rPr>
+      </w:pPr>
+      <w:r>
+        <w:rPr>
+          <w:rFonts w:ascii="Times New Roman" w:eastAsia="Times New Roman" w:hAnsi="Times New Roman" w:cs="Times New Roman"/>
+          <w:kern w:val="0"/>
+          <w14:ligatures w14:val="none"/>
+        </w:rPr>
+        <w:pict w14:anchorId="561F0A01">
+          <v:rect id="_x0000_i1026" style="width:0;height:1.5pt" o:hralign="center" o:hrstd="t" o:hr="t" fillcolor="#a0a0a0" stroked="f"/>
+        </w:pict>
+      </w:r>
+    </w:p>
+    <w:p>
+      <w:pPr>
+        <w:shd w:val="clear" w:color="auto" w:fill="191A1B"/>
+        <w:spacing w:before="100" w:beforeAutospacing="1" w:after="100" w:afterAutospacing="1" w:line="240" w:lineRule="auto"/>
+        <w:outlineLvl w:val="2"/>
+        <w:rPr>
+          <w:rFonts w:ascii="Segoe UI" w:eastAsia="Times New Roman" w:hAnsi="Segoe UI" w:cs="Segoe UI"/>
+          <w:b/>
+          <w:bCs/>
+          <w:color w:val="BFBFBF"/>
+          <w:kern w:val="0"/>
+          <w:sz w:val="27"/>
+          <w:szCs w:val="27"/>
+          <w14:ligatures w14:val="none"/>
+        </w:rPr>
+      </w:pPr>
+      <w:r>
+        <w:rPr>
+          <w:rFonts w:ascii="Segoe UI" w:eastAsia="Times New Roman" w:hAnsi="Segoe UI" w:cs="Segoe UI"/>
+          <w:b/>
+          <w:bCs/>
+          <w:color w:val="BFBFBF"/>
+          <w:kern w:val="0"/>
+          <w:sz w:val="27"/>
+          <w:szCs w:val="27"/>
+          <w14:ligatures w14:val="none"/>
+        </w:rPr>
+        <w:t>Q — The Generator Matrix</w:t>
+      </w:r>
+    </w:p>
+    <w:p>
+      <w:pPr>
+        <w:shd w:val="clear" w:color="auto" w:fill="191A1B"/>
+        <w:spacing w:before="24" w:after="48" w:line="240" w:lineRule="auto"/>
+        <w:rPr>
+          <w:rFonts w:ascii="Segoe UI" w:eastAsia="Times New Roman" w:hAnsi="Segoe UI" w:cs="Segoe UI"/>
+          <w:color w:val="BFBFBF"/>
+          <w:kern w:val="0"/>
+          <w:sz w:val="20"/>
+          <w:szCs w:val="20"/>
+          <w14:ligatures w14:val="none"/>
+        </w:rPr>
+      </w:pPr>
+      <w:r>
+        <w:rPr>
+          <w:rFonts w:ascii="Segoe UI" w:eastAsia="Times New Roman" w:hAnsi="Segoe UI" w:cs="Segoe UI"/>
+          <w:color w:val="BFBFBF"/>
+          <w:kern w:val="0"/>
+          <w:sz w:val="20"/>
+          <w:szCs w:val="20"/>
+          <w14:ligatures w14:val="none"/>
+        </w:rPr>
+        <w:t xml:space="preserve">Encodes all the Kolmogorov ODEs as a single matrix equation </w:t>
+      </w:r>
+      <w:proofErr w:type="spellStart"/>
+      <w:r>
+        <w:rPr>
+          <w:rFonts w:ascii="Courier New" w:eastAsia="Times New Roman" w:hAnsi="Courier New" w:cs="Courier New"/>
+          <w:color w:val="8C8C8C"/>
+          <w:kern w:val="0"/>
+          <w:sz w:val="18"/>
+          <w:szCs w:val="18"/>
+          <w:shd w:val="clear" w:color="auto" w:fill="262626"/>
+          <w14:ligatures w14:val="none"/>
+        </w:rPr>
+        <w:t>dp</w:t>
+      </w:r>
+      <w:proofErr w:type="spellEnd"/>
+      <w:r>
+        <w:rPr>
+          <w:rFonts w:ascii="Courier New" w:eastAsia="Times New Roman" w:hAnsi="Courier New" w:cs="Courier New"/>
+          <w:color w:val="8C8C8C"/>
+          <w:kern w:val="0"/>
+          <w:sz w:val="18"/>
+          <w:szCs w:val="18"/>
+          <w:shd w:val="clear" w:color="auto" w:fill="262626"/>
+          <w14:ligatures w14:val="none"/>
+        </w:rPr>
+        <w:t>/dt = Q @ p</w:t>
+      </w:r>
+      <w:r>
+        <w:rPr>
+          <w:rFonts w:ascii="Segoe UI" w:eastAsia="Times New Roman" w:hAnsi="Segoe UI" w:cs="Segoe UI"/>
+          <w:color w:val="BFBFBF"/>
+          <w:kern w:val="0"/>
+          <w:sz w:val="20"/>
+          <w:szCs w:val="20"/>
+          <w14:ligatures w14:val="none"/>
+        </w:rPr>
+        <w:t>. Built from three diagonals:</w:t>
+      </w:r>
+    </w:p>
+    <w:p>
+      <w:pPr>
+        <w:shd w:val="clear" w:color="auto" w:fill="191A1B"/>
+        <w:tabs>
+          <w:tab w:val="left" w:pos="916"/>
+          <w:tab w:val="left" w:pos="1832"/>
+          <w:tab w:val="left" w:pos="2748"/>
+          <w:tab w:val="left" w:pos="3664"/>
+          <w:tab w:val="left" w:pos="4580"/>
+          <w:tab w:val="left" w:pos="5496"/>
+          <w:tab w:val="left" w:pos="6412"/>
+          <w:tab w:val="left" w:pos="7328"/>
+          <w:tab w:val="left" w:pos="8244"/>
+          <w:tab w:val="left" w:pos="9160"/>
+          <w:tab w:val="left" w:pos="10076"/>
+          <w:tab w:val="left" w:pos="10992"/>
+          <w:tab w:val="left" w:pos="11908"/>
+          <w:tab w:val="left" w:pos="12824"/>
+          <w:tab w:val="left" w:pos="13740"/>
+          <w:tab w:val="left" w:pos="14656"/>
+        </w:tabs>
+        <w:spacing w:after="0" w:line="240" w:lineRule="auto"/>
+        <w:rPr>
+          <w:rFonts w:ascii="Courier New" w:eastAsia="Times New Roman" w:hAnsi="Courier New" w:cs="Courier New"/>
+          <w:color w:val="8C8C8C"/>
+          <w:kern w:val="0"/>
+          <w:sz w:val="18"/>
+          <w:szCs w:val="18"/>
+          <w:shd w:val="clear" w:color="auto" w:fill="262626"/>
+          <w14:ligatures w14:val="none"/>
+        </w:rPr>
+      </w:pPr>
+      <w:r>
+        <w:rPr>
+          <w:rFonts w:ascii="Courier New" w:eastAsia="Times New Roman" w:hAnsi="Courier New" w:cs="Courier New"/>
+          <w:color w:val="8C8C8C"/>
+          <w:kern w:val="0"/>
+          <w:sz w:val="18"/>
+          <w:szCs w:val="18"/>
+          <w:shd w:val="clear" w:color="auto" w:fill="262626"/>
+          <w14:ligatures w14:val="none"/>
+        </w:rPr>
+        <w:t xml:space="preserve">         </w:t>
+      </w:r>
+      <w:proofErr w:type="gramStart"/>
+      <w:r>
+        <w:rPr>
+          <w:rFonts w:ascii="Courier New" w:eastAsia="Times New Roman" w:hAnsi="Courier New" w:cs="Courier New"/>
+          <w:color w:val="8C8C8C"/>
+          <w:kern w:val="0"/>
+          <w:sz w:val="18"/>
+          <w:szCs w:val="18"/>
+          <w:shd w:val="clear" w:color="auto" w:fill="262626"/>
+          <w14:ligatures w14:val="none"/>
+        </w:rPr>
+        <w:t>state</w:t>
+      </w:r>
+      <w:proofErr w:type="gramEnd"/>
+      <w:r>
+        <w:rPr>
+          <w:rFonts w:ascii="Courier New" w:eastAsia="Times New Roman" w:hAnsi="Courier New" w:cs="Courier New"/>
+          <w:color w:val="8C8C8C"/>
+          <w:kern w:val="0"/>
+          <w:sz w:val="18"/>
+          <w:szCs w:val="18"/>
+          <w:shd w:val="clear" w:color="auto" w:fill="262626"/>
+          <w14:ligatures w14:val="none"/>
+        </w:rPr>
+        <w:t xml:space="preserve"> 0 </w:t>
+      </w:r>
+      <w:proofErr w:type="gramStart"/>
+      <w:r>
+        <w:rPr>
+          <w:rFonts w:ascii="Courier New" w:eastAsia="Times New Roman" w:hAnsi="Courier New" w:cs="Courier New"/>
+          <w:color w:val="8C8C8C"/>
+          <w:kern w:val="0"/>
+          <w:sz w:val="18"/>
+          <w:szCs w:val="18"/>
+          <w:shd w:val="clear" w:color="auto" w:fill="262626"/>
+          <w14:ligatures w14:val="none"/>
+        </w:rPr>
+        <w:t xml:space="preserve">   state</w:t>
+      </w:r>
+      <w:proofErr w:type="gramEnd"/>
+      <w:r>
+        <w:rPr>
+          <w:rFonts w:ascii="Courier New" w:eastAsia="Times New Roman" w:hAnsi="Courier New" w:cs="Courier New"/>
+          <w:color w:val="8C8C8C"/>
+          <w:kern w:val="0"/>
+          <w:sz w:val="18"/>
+          <w:szCs w:val="18"/>
+          <w:shd w:val="clear" w:color="auto" w:fill="262626"/>
+          <w14:ligatures w14:val="none"/>
+        </w:rPr>
+        <w:t xml:space="preserve"> 1 </w:t>
+      </w:r>
+      <w:proofErr w:type="gramStart"/>
+      <w:r>
+        <w:rPr>
+          <w:rFonts w:ascii="Courier New" w:eastAsia="Times New Roman" w:hAnsi="Courier New" w:cs="Courier New"/>
+          <w:color w:val="8C8C8C"/>
+          <w:kern w:val="0"/>
+          <w:sz w:val="18"/>
+          <w:szCs w:val="18"/>
+          <w:shd w:val="clear" w:color="auto" w:fill="262626"/>
+          <w14:ligatures w14:val="none"/>
+        </w:rPr>
+        <w:t xml:space="preserve">   state</w:t>
+      </w:r>
+      <w:proofErr w:type="gramEnd"/>
+      <w:r>
+        <w:rPr>
+          <w:rFonts w:ascii="Courier New" w:eastAsia="Times New Roman" w:hAnsi="Courier New" w:cs="Courier New"/>
+          <w:color w:val="8C8C8C"/>
+          <w:kern w:val="0"/>
+          <w:sz w:val="18"/>
+          <w:szCs w:val="18"/>
+          <w:shd w:val="clear" w:color="auto" w:fill="262626"/>
+          <w14:ligatures w14:val="none"/>
+        </w:rPr>
+        <w:t xml:space="preserve"> 2   ...  state κ</w:t>
+      </w:r>
+    </w:p>
+    <w:p>
+      <w:pPr>
+        <w:shd w:val="clear" w:color="auto" w:fill="191A1B"/>
+        <w:tabs>
+          <w:tab w:val="left" w:pos="916"/>
+          <w:tab w:val="left" w:pos="1832"/>
+          <w:tab w:val="left" w:pos="2748"/>
+          <w:tab w:val="left" w:pos="3664"/>
+          <w:tab w:val="left" w:pos="4580"/>
+          <w:tab w:val="left" w:pos="5496"/>
+          <w:tab w:val="left" w:pos="6412"/>
+          <w:tab w:val="left" w:pos="7328"/>
+          <w:tab w:val="left" w:pos="8244"/>
+          <w:tab w:val="left" w:pos="9160"/>
+          <w:tab w:val="left" w:pos="10076"/>
+          <w:tab w:val="left" w:pos="10992"/>
+          <w:tab w:val="left" w:pos="11908"/>
+          <w:tab w:val="left" w:pos="12824"/>
+          <w:tab w:val="left" w:pos="13740"/>
+          <w:tab w:val="left" w:pos="14656"/>
+        </w:tabs>
+        <w:spacing w:after="0" w:line="240" w:lineRule="auto"/>
+        <w:rPr>
+          <w:rFonts w:ascii="Courier New" w:eastAsia="Times New Roman" w:hAnsi="Courier New" w:cs="Courier New"/>
+          <w:color w:val="8C8C8C"/>
+          <w:kern w:val="0"/>
+          <w:sz w:val="18"/>
+          <w:szCs w:val="18"/>
+          <w:shd w:val="clear" w:color="auto" w:fill="262626"/>
+          <w14:ligatures w14:val="none"/>
+        </w:rPr>
+      </w:pPr>
+      <w:r>
+        <w:rPr>
+          <w:rFonts w:ascii="Courier New" w:eastAsia="Times New Roman" w:hAnsi="Courier New" w:cs="Courier New"/>
+          <w:color w:val="8C8C8C"/>
+          <w:kern w:val="0"/>
+          <w:sz w:val="18"/>
+          <w:szCs w:val="18"/>
+          <w:shd w:val="clear" w:color="auto" w:fill="262626"/>
+          <w14:ligatures w14:val="none"/>
+        </w:rPr>
+        <w:t xml:space="preserve">state 0 </w:t>
+      </w:r>
+      <w:proofErr w:type="gramStart"/>
+      <w:r>
+        <w:rPr>
+          <w:rFonts w:ascii="Courier New" w:eastAsia="Times New Roman" w:hAnsi="Courier New" w:cs="Courier New"/>
+          <w:color w:val="8C8C8C"/>
+          <w:kern w:val="0"/>
+          <w:sz w:val="18"/>
+          <w:szCs w:val="18"/>
+          <w:shd w:val="clear" w:color="auto" w:fill="262626"/>
+          <w14:ligatures w14:val="none"/>
+        </w:rPr>
+        <w:t>[  -</w:t>
+      </w:r>
+      <w:proofErr w:type="gramEnd"/>
+      <w:r>
+        <w:rPr>
+          <w:rFonts w:ascii="Courier New" w:eastAsia="Times New Roman" w:hAnsi="Courier New" w:cs="Courier New"/>
+          <w:color w:val="8C8C8C"/>
+          <w:kern w:val="0"/>
+          <w:sz w:val="18"/>
+          <w:szCs w:val="18"/>
+          <w:shd w:val="clear" w:color="auto" w:fill="262626"/>
+          <w14:ligatures w14:val="none"/>
+        </w:rPr>
+        <w:t xml:space="preserve">λ          μ         0            0  </w:t>
+      </w:r>
+      <w:proofErr w:type="gramStart"/>
+      <w:r>
+        <w:rPr>
+          <w:rFonts w:ascii="Courier New" w:eastAsia="Times New Roman" w:hAnsi="Courier New" w:cs="Courier New"/>
+          <w:color w:val="8C8C8C"/>
+          <w:kern w:val="0"/>
+          <w:sz w:val="18"/>
+          <w:szCs w:val="18"/>
+          <w:shd w:val="clear" w:color="auto" w:fill="262626"/>
+          <w14:ligatures w14:val="none"/>
+        </w:rPr>
+        <w:t xml:space="preserve">  ]</w:t>
+      </w:r>
+      <w:proofErr w:type="gramEnd"/>
+    </w:p>
+    <w:p>
+      <w:pPr>
+        <w:shd w:val="clear" w:color="auto" w:fill="191A1B"/>
+        <w:tabs>
+          <w:tab w:val="left" w:pos="916"/>
+          <w:tab w:val="left" w:pos="1832"/>
+          <w:tab w:val="left" w:pos="2748"/>
+          <w:tab w:val="left" w:pos="3664"/>
+          <w:tab w:val="left" w:pos="4580"/>
+          <w:tab w:val="left" w:pos="5496"/>
+          <w:tab w:val="left" w:pos="6412"/>
+          <w:tab w:val="left" w:pos="7328"/>
+          <w:tab w:val="left" w:pos="8244"/>
+          <w:tab w:val="left" w:pos="9160"/>
+          <w:tab w:val="left" w:pos="10076"/>
+          <w:tab w:val="left" w:pos="10992"/>
+          <w:tab w:val="left" w:pos="11908"/>
+          <w:tab w:val="left" w:pos="12824"/>
+          <w:tab w:val="left" w:pos="13740"/>
+          <w:tab w:val="left" w:pos="14656"/>
+        </w:tabs>
+        <w:spacing w:after="0" w:line="240" w:lineRule="auto"/>
+        <w:rPr>
+          <w:rFonts w:ascii="Courier New" w:eastAsia="Times New Roman" w:hAnsi="Courier New" w:cs="Courier New"/>
+          <w:color w:val="8C8C8C"/>
+          <w:kern w:val="0"/>
+          <w:sz w:val="18"/>
+          <w:szCs w:val="18"/>
+          <w:shd w:val="clear" w:color="auto" w:fill="262626"/>
+          <w14:ligatures w14:val="none"/>
+        </w:rPr>
+      </w:pPr>
+      <w:r>
+        <w:rPr>
+          <w:rFonts w:ascii="Courier New" w:eastAsia="Times New Roman" w:hAnsi="Courier New" w:cs="Courier New"/>
+          <w:color w:val="8C8C8C"/>
+          <w:kern w:val="0"/>
+          <w:sz w:val="18"/>
+          <w:szCs w:val="18"/>
+          <w:shd w:val="clear" w:color="auto" w:fill="262626"/>
+          <w14:ligatures w14:val="none"/>
+        </w:rPr>
+        <w:t>state 1 [   λ        -(</w:t>
+      </w:r>
+      <w:proofErr w:type="spellStart"/>
+      <w:r>
+        <w:rPr>
+          <w:rFonts w:ascii="Courier New" w:eastAsia="Times New Roman" w:hAnsi="Courier New" w:cs="Courier New"/>
+          <w:color w:val="8C8C8C"/>
+          <w:kern w:val="0"/>
+          <w:sz w:val="18"/>
+          <w:szCs w:val="18"/>
+          <w:shd w:val="clear" w:color="auto" w:fill="262626"/>
+          <w14:ligatures w14:val="none"/>
+        </w:rPr>
+        <w:t>λ+</w:t>
+      </w:r>
+      <w:proofErr w:type="gramStart"/>
+      <w:r>
+        <w:rPr>
+          <w:rFonts w:ascii="Courier New" w:eastAsia="Times New Roman" w:hAnsi="Courier New" w:cs="Courier New"/>
+          <w:color w:val="8C8C8C"/>
+          <w:kern w:val="0"/>
+          <w:sz w:val="18"/>
+          <w:szCs w:val="18"/>
+          <w:shd w:val="clear" w:color="auto" w:fill="262626"/>
+          <w14:ligatures w14:val="none"/>
+        </w:rPr>
+        <w:t>μ</w:t>
+      </w:r>
+      <w:proofErr w:type="spellEnd"/>
+      <w:r>
+        <w:rPr>
+          <w:rFonts w:ascii="Courier New" w:eastAsia="Times New Roman" w:hAnsi="Courier New" w:cs="Courier New"/>
+          <w:color w:val="8C8C8C"/>
+          <w:kern w:val="0"/>
+          <w:sz w:val="18"/>
+          <w:szCs w:val="18"/>
+          <w:shd w:val="clear" w:color="auto" w:fill="262626"/>
+          <w14:ligatures w14:val="none"/>
+        </w:rPr>
+        <w:t xml:space="preserve">)   </w:t>
+      </w:r>
+      <w:proofErr w:type="gramEnd"/>
+      <w:r>
+        <w:rPr>
+          <w:rFonts w:ascii="Courier New" w:eastAsia="Times New Roman" w:hAnsi="Courier New" w:cs="Courier New"/>
+          <w:color w:val="8C8C8C"/>
+          <w:kern w:val="0"/>
+          <w:sz w:val="18"/>
+          <w:szCs w:val="18"/>
+          <w:shd w:val="clear" w:color="auto" w:fill="262626"/>
+          <w14:ligatures w14:val="none"/>
+        </w:rPr>
+        <w:t xml:space="preserve">   μ            0  </w:t>
+      </w:r>
+      <w:proofErr w:type="gramStart"/>
+      <w:r>
+        <w:rPr>
+          <w:rFonts w:ascii="Courier New" w:eastAsia="Times New Roman" w:hAnsi="Courier New" w:cs="Courier New"/>
+          <w:color w:val="8C8C8C"/>
+          <w:kern w:val="0"/>
+          <w:sz w:val="18"/>
+          <w:szCs w:val="18"/>
+          <w:shd w:val="clear" w:color="auto" w:fill="262626"/>
+          <w14:ligatures w14:val="none"/>
+        </w:rPr>
+        <w:t xml:space="preserve">  ]</w:t>
+      </w:r>
+      <w:proofErr w:type="gramEnd"/>
+    </w:p>
+    <w:p>
+      <w:pPr>
+        <w:shd w:val="clear" w:color="auto" w:fill="191A1B"/>
+        <w:tabs>
+          <w:tab w:val="left" w:pos="916"/>
+          <w:tab w:val="left" w:pos="1832"/>
+          <w:tab w:val="left" w:pos="2748"/>
+          <w:tab w:val="left" w:pos="3664"/>
+          <w:tab w:val="left" w:pos="4580"/>
+          <w:tab w:val="left" w:pos="5496"/>
+          <w:tab w:val="left" w:pos="6412"/>
+          <w:tab w:val="left" w:pos="7328"/>
+          <w:tab w:val="left" w:pos="8244"/>
+          <w:tab w:val="left" w:pos="9160"/>
+          <w:tab w:val="left" w:pos="10076"/>
+          <w:tab w:val="left" w:pos="10992"/>
+          <w:tab w:val="left" w:pos="11908"/>
+          <w:tab w:val="left" w:pos="12824"/>
+          <w:tab w:val="left" w:pos="13740"/>
+          <w:tab w:val="left" w:pos="14656"/>
+        </w:tabs>
+        <w:spacing w:after="0" w:line="240" w:lineRule="auto"/>
+        <w:rPr>
+          <w:rFonts w:ascii="Courier New" w:eastAsia="Times New Roman" w:hAnsi="Courier New" w:cs="Courier New"/>
+          <w:color w:val="8C8C8C"/>
+          <w:kern w:val="0"/>
+          <w:sz w:val="18"/>
+          <w:szCs w:val="18"/>
+          <w:shd w:val="clear" w:color="auto" w:fill="262626"/>
+          <w14:ligatures w14:val="none"/>
+        </w:rPr>
+      </w:pPr>
+      <w:r>
+        <w:rPr>
+          <w:rFonts w:ascii="Courier New" w:eastAsia="Times New Roman" w:hAnsi="Courier New" w:cs="Courier New"/>
+          <w:color w:val="8C8C8C"/>
+          <w:kern w:val="0"/>
+          <w:sz w:val="18"/>
+          <w:szCs w:val="18"/>
+          <w:shd w:val="clear" w:color="auto" w:fill="262626"/>
+          <w14:ligatures w14:val="none"/>
+        </w:rPr>
+        <w:t>state 2 [   0          λ       -(</w:t>
+      </w:r>
+      <w:proofErr w:type="spellStart"/>
+      <w:r>
+        <w:rPr>
+          <w:rFonts w:ascii="Courier New" w:eastAsia="Times New Roman" w:hAnsi="Courier New" w:cs="Courier New"/>
+          <w:color w:val="8C8C8C"/>
+          <w:kern w:val="0"/>
+          <w:sz w:val="18"/>
+          <w:szCs w:val="18"/>
+          <w:shd w:val="clear" w:color="auto" w:fill="262626"/>
+          <w14:ligatures w14:val="none"/>
+        </w:rPr>
+        <w:t>λ+</w:t>
+      </w:r>
+      <w:proofErr w:type="gramStart"/>
+      <w:r>
+        <w:rPr>
+          <w:rFonts w:ascii="Courier New" w:eastAsia="Times New Roman" w:hAnsi="Courier New" w:cs="Courier New"/>
+          <w:color w:val="8C8C8C"/>
+          <w:kern w:val="0"/>
+          <w:sz w:val="18"/>
+          <w:szCs w:val="18"/>
+          <w:shd w:val="clear" w:color="auto" w:fill="262626"/>
+          <w14:ligatures w14:val="none"/>
+        </w:rPr>
+        <w:t>μ</w:t>
+      </w:r>
+      <w:proofErr w:type="spellEnd"/>
+      <w:r>
+        <w:rPr>
+          <w:rFonts w:ascii="Courier New" w:eastAsia="Times New Roman" w:hAnsi="Courier New" w:cs="Courier New"/>
+          <w:color w:val="8C8C8C"/>
+          <w:kern w:val="0"/>
+          <w:sz w:val="18"/>
+          <w:szCs w:val="18"/>
+          <w:shd w:val="clear" w:color="auto" w:fill="262626"/>
+          <w14:ligatures w14:val="none"/>
+        </w:rPr>
+        <w:t xml:space="preserve">)   </w:t>
+      </w:r>
+      <w:proofErr w:type="gramEnd"/>
+      <w:r>
+        <w:rPr>
+          <w:rFonts w:ascii="Courier New" w:eastAsia="Times New Roman" w:hAnsi="Courier New" w:cs="Courier New"/>
+          <w:color w:val="8C8C8C"/>
+          <w:kern w:val="0"/>
+          <w:sz w:val="18"/>
+          <w:szCs w:val="18"/>
+          <w:shd w:val="clear" w:color="auto" w:fill="262626"/>
+          <w14:ligatures w14:val="none"/>
+        </w:rPr>
+        <w:t xml:space="preserve">      0  </w:t>
+      </w:r>
+      <w:proofErr w:type="gramStart"/>
+      <w:r>
+        <w:rPr>
+          <w:rFonts w:ascii="Courier New" w:eastAsia="Times New Roman" w:hAnsi="Courier New" w:cs="Courier New"/>
+          <w:color w:val="8C8C8C"/>
+          <w:kern w:val="0"/>
+          <w:sz w:val="18"/>
+          <w:szCs w:val="18"/>
+          <w:shd w:val="clear" w:color="auto" w:fill="262626"/>
+          <w14:ligatures w14:val="none"/>
+        </w:rPr>
+        <w:t xml:space="preserve">  ]</w:t>
+      </w:r>
+      <w:proofErr w:type="gramEnd"/>
+    </w:p>
+    <w:p>
+      <w:pPr>
+        <w:shd w:val="clear" w:color="auto" w:fill="191A1B"/>
+        <w:tabs>
+          <w:tab w:val="left" w:pos="916"/>
+          <w:tab w:val="left" w:pos="1832"/>
+          <w:tab w:val="left" w:pos="2748"/>
+          <w:tab w:val="left" w:pos="3664"/>
+          <w:tab w:val="left" w:pos="4580"/>
+          <w:tab w:val="left" w:pos="5496"/>
+          <w:tab w:val="left" w:pos="6412"/>
+          <w:tab w:val="left" w:pos="7328"/>
+          <w:tab w:val="left" w:pos="8244"/>
+          <w:tab w:val="left" w:pos="9160"/>
+          <w:tab w:val="left" w:pos="10076"/>
+          <w:tab w:val="left" w:pos="10992"/>
+          <w:tab w:val="left" w:pos="11908"/>
+          <w:tab w:val="left" w:pos="12824"/>
+          <w:tab w:val="left" w:pos="13740"/>
+          <w:tab w:val="left" w:pos="14656"/>
+        </w:tabs>
+        <w:spacing w:after="0" w:line="240" w:lineRule="auto"/>
+        <w:rPr>
+          <w:rFonts w:ascii="Courier New" w:eastAsia="Times New Roman" w:hAnsi="Courier New" w:cs="Courier New"/>
+          <w:color w:val="8C8C8C"/>
+          <w:kern w:val="0"/>
+          <w:sz w:val="18"/>
+          <w:szCs w:val="18"/>
+          <w:shd w:val="clear" w:color="auto" w:fill="262626"/>
+          <w14:ligatures w14:val="none"/>
+        </w:rPr>
+      </w:pPr>
+      <w:r>
+        <w:rPr>
+          <w:rFonts w:ascii="Courier New" w:eastAsia="Times New Roman" w:hAnsi="Courier New" w:cs="Courier New"/>
+          <w:color w:val="8C8C8C"/>
+          <w:kern w:val="0"/>
+          <w:sz w:val="18"/>
+          <w:szCs w:val="18"/>
+          <w:shd w:val="clear" w:color="auto" w:fill="262626"/>
+          <w14:ligatures w14:val="none"/>
+        </w:rPr>
+        <w:t xml:space="preserve">  ...</w:t>
+      </w:r>
+    </w:p>
+    <w:p>
+      <w:pPr>
+        <w:shd w:val="clear" w:color="auto" w:fill="191A1B"/>
+        <w:tabs>
+          <w:tab w:val="left" w:pos="916"/>
+          <w:tab w:val="left" w:pos="1832"/>
+          <w:tab w:val="left" w:pos="2748"/>
+          <w:tab w:val="left" w:pos="3664"/>
+          <w:tab w:val="left" w:pos="4580"/>
+          <w:tab w:val="left" w:pos="5496"/>
+          <w:tab w:val="left" w:pos="6412"/>
+          <w:tab w:val="left" w:pos="7328"/>
+          <w:tab w:val="left" w:pos="8244"/>
+          <w:tab w:val="left" w:pos="9160"/>
+          <w:tab w:val="left" w:pos="10076"/>
+          <w:tab w:val="left" w:pos="10992"/>
+          <w:tab w:val="left" w:pos="11908"/>
+          <w:tab w:val="left" w:pos="12824"/>
+          <w:tab w:val="left" w:pos="13740"/>
+          <w:tab w:val="left" w:pos="14656"/>
+        </w:tabs>
+        <w:spacing w:after="0" w:line="240" w:lineRule="auto"/>
+        <w:rPr>
+          <w:rFonts w:ascii="Courier New" w:eastAsia="Times New Roman" w:hAnsi="Courier New" w:cs="Courier New"/>
+          <w:color w:val="8C8C8C"/>
+          <w:kern w:val="0"/>
+          <w:sz w:val="18"/>
+          <w:szCs w:val="18"/>
+          <w:shd w:val="clear" w:color="auto" w:fill="262626"/>
+          <w14:ligatures w14:val="none"/>
+        </w:rPr>
+      </w:pPr>
+      <w:r>
+        <w:rPr>
+          <w:rFonts w:ascii="Courier New" w:eastAsia="Times New Roman" w:hAnsi="Courier New" w:cs="Courier New"/>
+          <w:color w:val="8C8C8C"/>
+          <w:kern w:val="0"/>
+          <w:sz w:val="18"/>
+          <w:szCs w:val="18"/>
+          <w:shd w:val="clear" w:color="auto" w:fill="262626"/>
+          <w14:ligatures w14:val="none"/>
+        </w:rPr>
+        <w:t xml:space="preserve">state κ [   0          0         0      ...  -μ  </w:t>
+      </w:r>
+      <w:proofErr w:type="gramStart"/>
+      <w:r>
+        <w:rPr>
+          <w:rFonts w:ascii="Courier New" w:eastAsia="Times New Roman" w:hAnsi="Courier New" w:cs="Courier New"/>
+          <w:color w:val="8C8C8C"/>
+          <w:kern w:val="0"/>
+          <w:sz w:val="18"/>
+          <w:szCs w:val="18"/>
+          <w:shd w:val="clear" w:color="auto" w:fill="262626"/>
+          <w14:ligatures w14:val="none"/>
+        </w:rPr>
+        <w:t xml:space="preserve">  ]</w:t>
+      </w:r>
+      <w:proofErr w:type="gramEnd"/>
+    </w:p>
+    <w:p>
+      <w:pPr>
+        <w:numPr>
+          <w:ilvl w:val="0"/>
+          <w:numId w:val="7"/>
+        </w:numPr>
+        <w:shd w:val="clear" w:color="auto" w:fill="191A1B"/>
+        <w:spacing w:before="100" w:beforeAutospacing="1" w:after="100" w:afterAutospacing="1" w:line="240" w:lineRule="auto"/>
+        <w:rPr>
+          <w:rFonts w:ascii="Segoe UI" w:eastAsia="Times New Roman" w:hAnsi="Segoe UI" w:cs="Segoe UI"/>
+          <w:color w:val="BFBFBF"/>
+          <w:kern w:val="0"/>
+          <w:sz w:val="20"/>
+          <w:szCs w:val="20"/>
+          <w14:ligatures w14:val="none"/>
+        </w:rPr>
+      </w:pPr>
+      <w:r>
+        <w:rPr>
+          <w:rFonts w:ascii="Segoe UI" w:eastAsia="Times New Roman" w:hAnsi="Segoe UI" w:cs="Segoe UI"/>
+          <w:b/>
+          <w:bCs/>
+          <w:color w:val="BFBFBF"/>
+          <w:kern w:val="0"/>
+          <w:sz w:val="20"/>
+          <w:szCs w:val="20"/>
+          <w14:ligatures w14:val="none"/>
+        </w:rPr>
+        <w:t>Main diagonal</w:t>
+      </w:r>
+      <w:r>
+        <w:rPr>
+          <w:rFonts w:ascii="Segoe UI" w:eastAsia="Times New Roman" w:hAnsi="Segoe UI" w:cs="Segoe UI"/>
+          <w:color w:val="BFBFBF"/>
+          <w:kern w:val="0"/>
+          <w:sz w:val="20"/>
+          <w:szCs w:val="20"/>
+          <w14:ligatures w14:val="none"/>
+        </w:rPr>
+        <w:t>: total rate of leaving each state (negative)</w:t>
+      </w:r>
+    </w:p>
+    <w:p>
+      <w:pPr>
+        <w:numPr>
+          <w:ilvl w:val="0"/>
+          <w:numId w:val="7"/>
+        </w:numPr>
+        <w:shd w:val="clear" w:color="auto" w:fill="191A1B"/>
+        <w:spacing w:before="100" w:beforeAutospacing="1" w:after="100" w:afterAutospacing="1" w:line="240" w:lineRule="auto"/>
+        <w:rPr>
+          <w:rFonts w:ascii="Segoe UI" w:eastAsia="Times New Roman" w:hAnsi="Segoe UI" w:cs="Segoe UI"/>
+          <w:color w:val="BFBFBF"/>
+          <w:kern w:val="0"/>
+          <w:sz w:val="20"/>
+          <w:szCs w:val="20"/>
+          <w14:ligatures w14:val="none"/>
+        </w:rPr>
+      </w:pPr>
+      <w:r>
+        <w:rPr>
+          <w:rFonts w:ascii="Segoe UI" w:eastAsia="Times New Roman" w:hAnsi="Segoe UI" w:cs="Segoe UI"/>
+          <w:b/>
+          <w:bCs/>
+          <w:color w:val="BFBFBF"/>
+          <w:kern w:val="0"/>
+          <w:sz w:val="20"/>
+          <w:szCs w:val="20"/>
+          <w14:ligatures w14:val="none"/>
+        </w:rPr>
+        <w:t>Sub-diagonal</w:t>
+      </w:r>
+      <w:r>
+        <w:rPr>
+          <w:rFonts w:ascii="Segoe UI" w:eastAsia="Times New Roman" w:hAnsi="Segoe UI" w:cs="Segoe UI"/>
+          <w:color w:val="BFBFBF"/>
+          <w:kern w:val="0"/>
+          <w:sz w:val="20"/>
+          <w:szCs w:val="20"/>
+          <w14:ligatures w14:val="none"/>
+        </w:rPr>
+        <w:t>: λ — rate of rising one state (successful return)</w:t>
+      </w:r>
+    </w:p>
+    <w:p>
+      <w:pPr>
+        <w:numPr>
+          <w:ilvl w:val="0"/>
+          <w:numId w:val="7"/>
+        </w:numPr>
+        <w:shd w:val="clear" w:color="auto" w:fill="191A1B"/>
+        <w:spacing w:before="100" w:beforeAutospacing="1" w:after="100" w:afterAutospacing="1" w:line="240" w:lineRule="auto"/>
+        <w:rPr>
+          <w:rFonts w:ascii="Segoe UI" w:eastAsia="Times New Roman" w:hAnsi="Segoe UI" w:cs="Segoe UI"/>
+          <w:color w:val="BFBFBF"/>
+          <w:kern w:val="0"/>
+          <w:sz w:val="20"/>
+          <w:szCs w:val="20"/>
+          <w14:ligatures w14:val="none"/>
+        </w:rPr>
+      </w:pPr>
+      <w:r>
+        <w:rPr>
+          <w:rFonts w:ascii="Segoe UI" w:eastAsia="Times New Roman" w:hAnsi="Segoe UI" w:cs="Segoe UI"/>
+          <w:b/>
+          <w:bCs/>
+          <w:color w:val="BFBFBF"/>
+          <w:kern w:val="0"/>
+          <w:sz w:val="20"/>
+          <w:szCs w:val="20"/>
+          <w14:ligatures w14:val="none"/>
+        </w:rPr>
+        <w:t>Super-diagonal</w:t>
+      </w:r>
+      <w:r>
+        <w:rPr>
+          <w:rFonts w:ascii="Segoe UI" w:eastAsia="Times New Roman" w:hAnsi="Segoe UI" w:cs="Segoe UI"/>
+          <w:color w:val="BFBFBF"/>
+          <w:kern w:val="0"/>
+          <w:sz w:val="20"/>
+          <w:szCs w:val="20"/>
+          <w14:ligatures w14:val="none"/>
+        </w:rPr>
+        <w:t>: μ — rate of falling one state (successful pickup)</w:t>
+      </w:r>
+    </w:p>
+    <w:p>
+      <w:pPr>
+        <w:shd w:val="clear" w:color="auto" w:fill="191A1B"/>
+        <w:spacing w:before="24" w:after="48" w:line="240" w:lineRule="auto"/>
+        <w:rPr>
+          <w:rFonts w:ascii="Segoe UI" w:eastAsia="Times New Roman" w:hAnsi="Segoe UI" w:cs="Segoe UI"/>
+          <w:color w:val="BFBFBF"/>
+          <w:kern w:val="0"/>
+          <w:sz w:val="20"/>
+          <w:szCs w:val="20"/>
+          <w14:ligatures w14:val="none"/>
+        </w:rPr>
+      </w:pPr>
+      <w:r>
+        <w:rPr>
+          <w:rFonts w:ascii="Segoe UI" w:eastAsia="Times New Roman" w:hAnsi="Segoe UI" w:cs="Segoe UI"/>
+          <w:color w:val="BFBFBF"/>
+          <w:kern w:val="0"/>
+          <w:sz w:val="20"/>
+          <w:szCs w:val="20"/>
+          <w14:ligatures w14:val="none"/>
+        </w:rPr>
+        <w:t>Failed pickups (at state 0) and failed returns (at state κ) don't appear here — they don't change the state, so they only appear in the dissatisfaction accumulator.</w:t>
+      </w:r>
+    </w:p>
+    <w:p>
+      <w:pPr>
+        <w:spacing w:after="0" w:line="240" w:lineRule="auto"/>
+        <w:rPr>
+          <w:rFonts w:ascii="Segoe UI" w:eastAsia="Times New Roman" w:hAnsi="Segoe UI" w:cs="Segoe UI"/>
+          <w:kern w:val="0"/>
+          <w:sz w:val="20"/>
+          <w:szCs w:val="20"/>
+          <w14:ligatures w14:val="none"/>
+        </w:rPr>
+      </w:pPr>
+      <w:r>
+        <w:rPr>
+          <w:rFonts w:ascii="Times New Roman" w:eastAsia="Times New Roman" w:hAnsi="Times New Roman" w:cs="Times New Roman"/>
+          <w:kern w:val="0"/>
+          <w14:ligatures w14:val="none"/>
+        </w:rPr>
+        <w:pict w14:anchorId="7FCFBF32">
+          <v:rect id="_x0000_i1027" style="width:0;height:1.5pt" o:hralign="center" o:hrstd="t" o:hr="t" fillcolor="#a0a0a0" stroked="f"/>
+        </w:pict>
+      </w:r>
+    </w:p>
+    <w:p>
+      <w:pPr>
+        <w:shd w:val="clear" w:color="auto" w:fill="191A1B"/>
+        <w:spacing w:before="100" w:beforeAutospacing="1" w:after="100" w:afterAutospacing="1" w:line="240" w:lineRule="auto"/>
+        <w:outlineLvl w:val="2"/>
+        <w:rPr>
+          <w:rFonts w:ascii="Segoe UI" w:eastAsia="Times New Roman" w:hAnsi="Segoe UI" w:cs="Segoe UI"/>
+          <w:b/>
+          <w:bCs/>
+          <w:color w:val="BFBFBF"/>
+          <w:kern w:val="0"/>
+          <w:sz w:val="27"/>
+          <w:szCs w:val="27"/>
+          <w14:ligatures w14:val="none"/>
+        </w:rPr>
+      </w:pPr>
+      <w:r>
+        <w:rPr>
+          <w:rFonts w:ascii="Segoe UI" w:eastAsia="Times New Roman" w:hAnsi="Segoe UI" w:cs="Segoe UI"/>
+          <w:b/>
+          <w:bCs/>
+          <w:color w:val="BFBFBF"/>
+          <w:kern w:val="0"/>
+          <w:sz w:val="27"/>
+          <w:szCs w:val="27"/>
+          <w14:ligatures w14:val="none"/>
+        </w:rPr>
+        <w:lastRenderedPageBreak/>
+        <w:t>P — The Probability Matrix</w:t>
+      </w:r>
+    </w:p>
+    <w:p>
+      <w:pPr>
+        <w:shd w:val="clear" w:color="auto" w:fill="191A1B"/>
+        <w:spacing w:before="24" w:after="48" w:line="240" w:lineRule="auto"/>
+        <w:rPr>
+          <w:rFonts w:ascii="Segoe UI" w:eastAsia="Times New Roman" w:hAnsi="Segoe UI" w:cs="Segoe UI"/>
+          <w:color w:val="BFBFBF"/>
+          <w:kern w:val="0"/>
+          <w:sz w:val="20"/>
+          <w:szCs w:val="20"/>
+          <w14:ligatures w14:val="none"/>
+        </w:rPr>
+      </w:pPr>
+      <w:r>
+        <w:rPr>
+          <w:rFonts w:ascii="Segoe UI" w:eastAsia="Times New Roman" w:hAnsi="Segoe UI" w:cs="Segoe UI"/>
+          <w:color w:val="BFBFBF"/>
+          <w:kern w:val="0"/>
+          <w:sz w:val="20"/>
+          <w:szCs w:val="20"/>
+          <w14:ligatures w14:val="none"/>
+        </w:rPr>
+        <w:t xml:space="preserve">Shape </w:t>
+      </w:r>
+      <w:r>
+        <w:rPr>
+          <w:rFonts w:ascii="Courier New" w:eastAsia="Times New Roman" w:hAnsi="Courier New" w:cs="Courier New"/>
+          <w:color w:val="8C8C8C"/>
+          <w:kern w:val="0"/>
+          <w:sz w:val="18"/>
+          <w:szCs w:val="18"/>
+          <w:shd w:val="clear" w:color="auto" w:fill="262626"/>
+          <w14:ligatures w14:val="none"/>
+        </w:rPr>
+        <w:t>(κ+1) × (κ+1)</w:t>
+      </w:r>
+      <w:r>
+        <w:rPr>
+          <w:rFonts w:ascii="Segoe UI" w:eastAsia="Times New Roman" w:hAnsi="Segoe UI" w:cs="Segoe UI"/>
+          <w:color w:val="BFBFBF"/>
+          <w:kern w:val="0"/>
+          <w:sz w:val="20"/>
+          <w:szCs w:val="20"/>
+          <w14:ligatures w14:val="none"/>
+        </w:rPr>
+        <w:t>. Each column j holds the probability distribution over states for the scenario that started with j bikes. Initialized as the identity matrix because at t=0 each scenario is a certainty:</w:t>
+      </w:r>
+    </w:p>
+    <w:p>
+      <w:pPr>
+        <w:shd w:val="clear" w:color="auto" w:fill="191A1B"/>
+        <w:tabs>
+          <w:tab w:val="left" w:pos="916"/>
+          <w:tab w:val="left" w:pos="1832"/>
+          <w:tab w:val="left" w:pos="2748"/>
+          <w:tab w:val="left" w:pos="3664"/>
+          <w:tab w:val="left" w:pos="4580"/>
+          <w:tab w:val="left" w:pos="5496"/>
+          <w:tab w:val="left" w:pos="6412"/>
+          <w:tab w:val="left" w:pos="7328"/>
+          <w:tab w:val="left" w:pos="8244"/>
+          <w:tab w:val="left" w:pos="9160"/>
+          <w:tab w:val="left" w:pos="10076"/>
+          <w:tab w:val="left" w:pos="10992"/>
+          <w:tab w:val="left" w:pos="11908"/>
+          <w:tab w:val="left" w:pos="12824"/>
+          <w:tab w:val="left" w:pos="13740"/>
+          <w:tab w:val="left" w:pos="14656"/>
+        </w:tabs>
+        <w:spacing w:after="0" w:line="240" w:lineRule="auto"/>
+        <w:rPr>
+          <w:rFonts w:ascii="Courier New" w:eastAsia="Times New Roman" w:hAnsi="Courier New" w:cs="Courier New"/>
+          <w:color w:val="8C8C8C"/>
+          <w:kern w:val="0"/>
+          <w:sz w:val="18"/>
+          <w:szCs w:val="18"/>
+          <w:shd w:val="clear" w:color="auto" w:fill="262626"/>
+          <w14:ligatures w14:val="none"/>
+        </w:rPr>
+      </w:pPr>
+      <w:r>
+        <w:rPr>
+          <w:rFonts w:ascii="Courier New" w:eastAsia="Times New Roman" w:hAnsi="Courier New" w:cs="Courier New"/>
+          <w:color w:val="8C8C8C"/>
+          <w:kern w:val="0"/>
+          <w:sz w:val="18"/>
+          <w:szCs w:val="18"/>
+          <w:shd w:val="clear" w:color="auto" w:fill="262626"/>
+          <w14:ligatures w14:val="none"/>
+        </w:rPr>
+        <w:t xml:space="preserve">       x_0=</w:t>
+      </w:r>
+      <w:proofErr w:type="gramStart"/>
+      <w:r>
+        <w:rPr>
+          <w:rFonts w:ascii="Courier New" w:eastAsia="Times New Roman" w:hAnsi="Courier New" w:cs="Courier New"/>
+          <w:color w:val="8C8C8C"/>
+          <w:kern w:val="0"/>
+          <w:sz w:val="18"/>
+          <w:szCs w:val="18"/>
+          <w:shd w:val="clear" w:color="auto" w:fill="262626"/>
+          <w14:ligatures w14:val="none"/>
+        </w:rPr>
+        <w:t>0  x</w:t>
+      </w:r>
+      <w:proofErr w:type="gramEnd"/>
+      <w:r>
+        <w:rPr>
+          <w:rFonts w:ascii="Courier New" w:eastAsia="Times New Roman" w:hAnsi="Courier New" w:cs="Courier New"/>
+          <w:color w:val="8C8C8C"/>
+          <w:kern w:val="0"/>
+          <w:sz w:val="18"/>
+          <w:szCs w:val="18"/>
+          <w:shd w:val="clear" w:color="auto" w:fill="262626"/>
+          <w14:ligatures w14:val="none"/>
+        </w:rPr>
+        <w:t>_0=</w:t>
+      </w:r>
+      <w:proofErr w:type="gramStart"/>
+      <w:r>
+        <w:rPr>
+          <w:rFonts w:ascii="Courier New" w:eastAsia="Times New Roman" w:hAnsi="Courier New" w:cs="Courier New"/>
+          <w:color w:val="8C8C8C"/>
+          <w:kern w:val="0"/>
+          <w:sz w:val="18"/>
+          <w:szCs w:val="18"/>
+          <w:shd w:val="clear" w:color="auto" w:fill="262626"/>
+          <w14:ligatures w14:val="none"/>
+        </w:rPr>
+        <w:t>1  x</w:t>
+      </w:r>
+      <w:proofErr w:type="gramEnd"/>
+      <w:r>
+        <w:rPr>
+          <w:rFonts w:ascii="Courier New" w:eastAsia="Times New Roman" w:hAnsi="Courier New" w:cs="Courier New"/>
+          <w:color w:val="8C8C8C"/>
+          <w:kern w:val="0"/>
+          <w:sz w:val="18"/>
+          <w:szCs w:val="18"/>
+          <w:shd w:val="clear" w:color="auto" w:fill="262626"/>
+          <w14:ligatures w14:val="none"/>
+        </w:rPr>
+        <w:t>_0=</w:t>
+      </w:r>
+      <w:proofErr w:type="gramStart"/>
+      <w:r>
+        <w:rPr>
+          <w:rFonts w:ascii="Courier New" w:eastAsia="Times New Roman" w:hAnsi="Courier New" w:cs="Courier New"/>
+          <w:color w:val="8C8C8C"/>
+          <w:kern w:val="0"/>
+          <w:sz w:val="18"/>
+          <w:szCs w:val="18"/>
+          <w:shd w:val="clear" w:color="auto" w:fill="262626"/>
+          <w14:ligatures w14:val="none"/>
+        </w:rPr>
+        <w:t>2  ...</w:t>
+      </w:r>
+      <w:proofErr w:type="gramEnd"/>
+      <w:r>
+        <w:rPr>
+          <w:rFonts w:ascii="Courier New" w:eastAsia="Times New Roman" w:hAnsi="Courier New" w:cs="Courier New"/>
+          <w:color w:val="8C8C8C"/>
+          <w:kern w:val="0"/>
+          <w:sz w:val="18"/>
+          <w:szCs w:val="18"/>
+          <w:shd w:val="clear" w:color="auto" w:fill="262626"/>
+          <w14:ligatures w14:val="none"/>
+        </w:rPr>
+        <w:t xml:space="preserve">  x_0=κ</w:t>
+      </w:r>
+    </w:p>
+    <w:p>
+      <w:pPr>
+        <w:shd w:val="clear" w:color="auto" w:fill="191A1B"/>
+        <w:tabs>
+          <w:tab w:val="left" w:pos="916"/>
+          <w:tab w:val="left" w:pos="1832"/>
+          <w:tab w:val="left" w:pos="2748"/>
+          <w:tab w:val="left" w:pos="3664"/>
+          <w:tab w:val="left" w:pos="4580"/>
+          <w:tab w:val="left" w:pos="5496"/>
+          <w:tab w:val="left" w:pos="6412"/>
+          <w:tab w:val="left" w:pos="7328"/>
+          <w:tab w:val="left" w:pos="8244"/>
+          <w:tab w:val="left" w:pos="9160"/>
+          <w:tab w:val="left" w:pos="10076"/>
+          <w:tab w:val="left" w:pos="10992"/>
+          <w:tab w:val="left" w:pos="11908"/>
+          <w:tab w:val="left" w:pos="12824"/>
+          <w:tab w:val="left" w:pos="13740"/>
+          <w:tab w:val="left" w:pos="14656"/>
+        </w:tabs>
+        <w:spacing w:after="0" w:line="240" w:lineRule="auto"/>
+        <w:rPr>
+          <w:rFonts w:ascii="Courier New" w:eastAsia="Times New Roman" w:hAnsi="Courier New" w:cs="Courier New"/>
+          <w:color w:val="8C8C8C"/>
+          <w:kern w:val="0"/>
+          <w:sz w:val="18"/>
+          <w:szCs w:val="18"/>
+          <w:shd w:val="clear" w:color="auto" w:fill="262626"/>
+          <w14:ligatures w14:val="none"/>
+        </w:rPr>
+      </w:pPr>
+      <w:r>
+        <w:rPr>
+          <w:rFonts w:ascii="Courier New" w:eastAsia="Times New Roman" w:hAnsi="Courier New" w:cs="Courier New"/>
+          <w:color w:val="8C8C8C"/>
+          <w:kern w:val="0"/>
+          <w:sz w:val="18"/>
+          <w:szCs w:val="18"/>
+          <w:shd w:val="clear" w:color="auto" w:fill="262626"/>
+          <w14:ligatures w14:val="none"/>
+        </w:rPr>
+        <w:t xml:space="preserve">state 0 </w:t>
+      </w:r>
+      <w:proofErr w:type="gramStart"/>
+      <w:r>
+        <w:rPr>
+          <w:rFonts w:ascii="Courier New" w:eastAsia="Times New Roman" w:hAnsi="Courier New" w:cs="Courier New"/>
+          <w:color w:val="8C8C8C"/>
+          <w:kern w:val="0"/>
+          <w:sz w:val="18"/>
+          <w:szCs w:val="18"/>
+          <w:shd w:val="clear" w:color="auto" w:fill="262626"/>
+          <w14:ligatures w14:val="none"/>
+        </w:rPr>
+        <w:t>[  1</w:t>
+      </w:r>
+      <w:proofErr w:type="gramEnd"/>
+      <w:r>
+        <w:rPr>
+          <w:rFonts w:ascii="Courier New" w:eastAsia="Times New Roman" w:hAnsi="Courier New" w:cs="Courier New"/>
+          <w:color w:val="8C8C8C"/>
+          <w:kern w:val="0"/>
+          <w:sz w:val="18"/>
+          <w:szCs w:val="18"/>
+          <w:shd w:val="clear" w:color="auto" w:fill="262626"/>
+          <w14:ligatures w14:val="none"/>
+        </w:rPr>
+        <w:t xml:space="preserve">      0      0           </w:t>
+      </w:r>
+      <w:proofErr w:type="gramStart"/>
+      <w:r>
+        <w:rPr>
+          <w:rFonts w:ascii="Courier New" w:eastAsia="Times New Roman" w:hAnsi="Courier New" w:cs="Courier New"/>
+          <w:color w:val="8C8C8C"/>
+          <w:kern w:val="0"/>
+          <w:sz w:val="18"/>
+          <w:szCs w:val="18"/>
+          <w:shd w:val="clear" w:color="auto" w:fill="262626"/>
+          <w14:ligatures w14:val="none"/>
+        </w:rPr>
+        <w:t>0  ]</w:t>
+      </w:r>
+      <w:proofErr w:type="gramEnd"/>
+    </w:p>
+    <w:p>
+      <w:pPr>
+        <w:shd w:val="clear" w:color="auto" w:fill="191A1B"/>
+        <w:tabs>
+          <w:tab w:val="left" w:pos="916"/>
+          <w:tab w:val="left" w:pos="1832"/>
+          <w:tab w:val="left" w:pos="2748"/>
+          <w:tab w:val="left" w:pos="3664"/>
+          <w:tab w:val="left" w:pos="4580"/>
+          <w:tab w:val="left" w:pos="5496"/>
+          <w:tab w:val="left" w:pos="6412"/>
+          <w:tab w:val="left" w:pos="7328"/>
+          <w:tab w:val="left" w:pos="8244"/>
+          <w:tab w:val="left" w:pos="9160"/>
+          <w:tab w:val="left" w:pos="10076"/>
+          <w:tab w:val="left" w:pos="10992"/>
+          <w:tab w:val="left" w:pos="11908"/>
+          <w:tab w:val="left" w:pos="12824"/>
+          <w:tab w:val="left" w:pos="13740"/>
+          <w:tab w:val="left" w:pos="14656"/>
+        </w:tabs>
+        <w:spacing w:after="0" w:line="240" w:lineRule="auto"/>
+        <w:rPr>
+          <w:rFonts w:ascii="Courier New" w:eastAsia="Times New Roman" w:hAnsi="Courier New" w:cs="Courier New"/>
+          <w:color w:val="8C8C8C"/>
+          <w:kern w:val="0"/>
+          <w:sz w:val="18"/>
+          <w:szCs w:val="18"/>
+          <w:shd w:val="clear" w:color="auto" w:fill="262626"/>
+          <w14:ligatures w14:val="none"/>
+        </w:rPr>
+      </w:pPr>
+      <w:r>
+        <w:rPr>
+          <w:rFonts w:ascii="Courier New" w:eastAsia="Times New Roman" w:hAnsi="Courier New" w:cs="Courier New"/>
+          <w:color w:val="8C8C8C"/>
+          <w:kern w:val="0"/>
+          <w:sz w:val="18"/>
+          <w:szCs w:val="18"/>
+          <w:shd w:val="clear" w:color="auto" w:fill="262626"/>
+          <w14:ligatures w14:val="none"/>
+        </w:rPr>
+        <w:t xml:space="preserve">state 1 </w:t>
+      </w:r>
+      <w:proofErr w:type="gramStart"/>
+      <w:r>
+        <w:rPr>
+          <w:rFonts w:ascii="Courier New" w:eastAsia="Times New Roman" w:hAnsi="Courier New" w:cs="Courier New"/>
+          <w:color w:val="8C8C8C"/>
+          <w:kern w:val="0"/>
+          <w:sz w:val="18"/>
+          <w:szCs w:val="18"/>
+          <w:shd w:val="clear" w:color="auto" w:fill="262626"/>
+          <w14:ligatures w14:val="none"/>
+        </w:rPr>
+        <w:t>[  0</w:t>
+      </w:r>
+      <w:proofErr w:type="gramEnd"/>
+      <w:r>
+        <w:rPr>
+          <w:rFonts w:ascii="Courier New" w:eastAsia="Times New Roman" w:hAnsi="Courier New" w:cs="Courier New"/>
+          <w:color w:val="8C8C8C"/>
+          <w:kern w:val="0"/>
+          <w:sz w:val="18"/>
+          <w:szCs w:val="18"/>
+          <w:shd w:val="clear" w:color="auto" w:fill="262626"/>
+          <w14:ligatures w14:val="none"/>
+        </w:rPr>
+        <w:t xml:space="preserve">      1      0           </w:t>
+      </w:r>
+      <w:proofErr w:type="gramStart"/>
+      <w:r>
+        <w:rPr>
+          <w:rFonts w:ascii="Courier New" w:eastAsia="Times New Roman" w:hAnsi="Courier New" w:cs="Courier New"/>
+          <w:color w:val="8C8C8C"/>
+          <w:kern w:val="0"/>
+          <w:sz w:val="18"/>
+          <w:szCs w:val="18"/>
+          <w:shd w:val="clear" w:color="auto" w:fill="262626"/>
+          <w14:ligatures w14:val="none"/>
+        </w:rPr>
+        <w:t>0  ]</w:t>
+      </w:r>
+      <w:proofErr w:type="gramEnd"/>
+    </w:p>
+    <w:p>
+      <w:pPr>
+        <w:shd w:val="clear" w:color="auto" w:fill="191A1B"/>
+        <w:tabs>
+          <w:tab w:val="left" w:pos="916"/>
+          <w:tab w:val="left" w:pos="1832"/>
+          <w:tab w:val="left" w:pos="2748"/>
+          <w:tab w:val="left" w:pos="3664"/>
+          <w:tab w:val="left" w:pos="4580"/>
+          <w:tab w:val="left" w:pos="5496"/>
+          <w:tab w:val="left" w:pos="6412"/>
+          <w:tab w:val="left" w:pos="7328"/>
+          <w:tab w:val="left" w:pos="8244"/>
+          <w:tab w:val="left" w:pos="9160"/>
+          <w:tab w:val="left" w:pos="10076"/>
+          <w:tab w:val="left" w:pos="10992"/>
+          <w:tab w:val="left" w:pos="11908"/>
+          <w:tab w:val="left" w:pos="12824"/>
+          <w:tab w:val="left" w:pos="13740"/>
+          <w:tab w:val="left" w:pos="14656"/>
+        </w:tabs>
+        <w:spacing w:after="0" w:line="240" w:lineRule="auto"/>
+        <w:rPr>
+          <w:rFonts w:ascii="Courier New" w:eastAsia="Times New Roman" w:hAnsi="Courier New" w:cs="Courier New"/>
+          <w:color w:val="8C8C8C"/>
+          <w:kern w:val="0"/>
+          <w:sz w:val="18"/>
+          <w:szCs w:val="18"/>
+          <w:shd w:val="clear" w:color="auto" w:fill="262626"/>
+          <w14:ligatures w14:val="none"/>
+        </w:rPr>
+      </w:pPr>
+      <w:r>
+        <w:rPr>
+          <w:rFonts w:ascii="Courier New" w:eastAsia="Times New Roman" w:hAnsi="Courier New" w:cs="Courier New"/>
+          <w:color w:val="8C8C8C"/>
+          <w:kern w:val="0"/>
+          <w:sz w:val="18"/>
+          <w:szCs w:val="18"/>
+          <w:shd w:val="clear" w:color="auto" w:fill="262626"/>
+          <w14:ligatures w14:val="none"/>
+        </w:rPr>
+        <w:t xml:space="preserve">state 2 </w:t>
+      </w:r>
+      <w:proofErr w:type="gramStart"/>
+      <w:r>
+        <w:rPr>
+          <w:rFonts w:ascii="Courier New" w:eastAsia="Times New Roman" w:hAnsi="Courier New" w:cs="Courier New"/>
+          <w:color w:val="8C8C8C"/>
+          <w:kern w:val="0"/>
+          <w:sz w:val="18"/>
+          <w:szCs w:val="18"/>
+          <w:shd w:val="clear" w:color="auto" w:fill="262626"/>
+          <w14:ligatures w14:val="none"/>
+        </w:rPr>
+        <w:t>[  0</w:t>
+      </w:r>
+      <w:proofErr w:type="gramEnd"/>
+      <w:r>
+        <w:rPr>
+          <w:rFonts w:ascii="Courier New" w:eastAsia="Times New Roman" w:hAnsi="Courier New" w:cs="Courier New"/>
+          <w:color w:val="8C8C8C"/>
+          <w:kern w:val="0"/>
+          <w:sz w:val="18"/>
+          <w:szCs w:val="18"/>
+          <w:shd w:val="clear" w:color="auto" w:fill="262626"/>
+          <w14:ligatures w14:val="none"/>
+        </w:rPr>
+        <w:t xml:space="preserve">      0      1           </w:t>
+      </w:r>
+      <w:proofErr w:type="gramStart"/>
+      <w:r>
+        <w:rPr>
+          <w:rFonts w:ascii="Courier New" w:eastAsia="Times New Roman" w:hAnsi="Courier New" w:cs="Courier New"/>
+          <w:color w:val="8C8C8C"/>
+          <w:kern w:val="0"/>
+          <w:sz w:val="18"/>
+          <w:szCs w:val="18"/>
+          <w:shd w:val="clear" w:color="auto" w:fill="262626"/>
+          <w14:ligatures w14:val="none"/>
+        </w:rPr>
+        <w:t>0  ]</w:t>
+      </w:r>
+      <w:proofErr w:type="gramEnd"/>
+    </w:p>
+    <w:p>
+      <w:pPr>
+        <w:shd w:val="clear" w:color="auto" w:fill="191A1B"/>
+        <w:tabs>
+          <w:tab w:val="left" w:pos="916"/>
+          <w:tab w:val="left" w:pos="1832"/>
+          <w:tab w:val="left" w:pos="2748"/>
+          <w:tab w:val="left" w:pos="3664"/>
+          <w:tab w:val="left" w:pos="4580"/>
+          <w:tab w:val="left" w:pos="5496"/>
+          <w:tab w:val="left" w:pos="6412"/>
+          <w:tab w:val="left" w:pos="7328"/>
+          <w:tab w:val="left" w:pos="8244"/>
+          <w:tab w:val="left" w:pos="9160"/>
+          <w:tab w:val="left" w:pos="10076"/>
+          <w:tab w:val="left" w:pos="10992"/>
+          <w:tab w:val="left" w:pos="11908"/>
+          <w:tab w:val="left" w:pos="12824"/>
+          <w:tab w:val="left" w:pos="13740"/>
+          <w:tab w:val="left" w:pos="14656"/>
+        </w:tabs>
+        <w:spacing w:after="0" w:line="240" w:lineRule="auto"/>
+        <w:rPr>
+          <w:rFonts w:ascii="Courier New" w:eastAsia="Times New Roman" w:hAnsi="Courier New" w:cs="Courier New"/>
+          <w:color w:val="8C8C8C"/>
+          <w:kern w:val="0"/>
+          <w:sz w:val="18"/>
+          <w:szCs w:val="18"/>
+          <w:shd w:val="clear" w:color="auto" w:fill="262626"/>
+          <w14:ligatures w14:val="none"/>
+        </w:rPr>
+      </w:pPr>
+      <w:r>
+        <w:rPr>
+          <w:rFonts w:ascii="Courier New" w:eastAsia="Times New Roman" w:hAnsi="Courier New" w:cs="Courier New"/>
+          <w:color w:val="8C8C8C"/>
+          <w:kern w:val="0"/>
+          <w:sz w:val="18"/>
+          <w:szCs w:val="18"/>
+          <w:shd w:val="clear" w:color="auto" w:fill="262626"/>
+          <w14:ligatures w14:val="none"/>
+        </w:rPr>
+        <w:t xml:space="preserve">  ...</w:t>
+      </w:r>
+    </w:p>
+    <w:p>
+      <w:pPr>
+        <w:shd w:val="clear" w:color="auto" w:fill="191A1B"/>
+        <w:tabs>
+          <w:tab w:val="left" w:pos="916"/>
+          <w:tab w:val="left" w:pos="1832"/>
+          <w:tab w:val="left" w:pos="2748"/>
+          <w:tab w:val="left" w:pos="3664"/>
+          <w:tab w:val="left" w:pos="4580"/>
+          <w:tab w:val="left" w:pos="5496"/>
+          <w:tab w:val="left" w:pos="6412"/>
+          <w:tab w:val="left" w:pos="7328"/>
+          <w:tab w:val="left" w:pos="8244"/>
+          <w:tab w:val="left" w:pos="9160"/>
+          <w:tab w:val="left" w:pos="10076"/>
+          <w:tab w:val="left" w:pos="10992"/>
+          <w:tab w:val="left" w:pos="11908"/>
+          <w:tab w:val="left" w:pos="12824"/>
+          <w:tab w:val="left" w:pos="13740"/>
+          <w:tab w:val="left" w:pos="14656"/>
+        </w:tabs>
+        <w:spacing w:after="0" w:line="240" w:lineRule="auto"/>
+        <w:rPr>
+          <w:rFonts w:ascii="Courier New" w:eastAsia="Times New Roman" w:hAnsi="Courier New" w:cs="Courier New"/>
+          <w:color w:val="8C8C8C"/>
+          <w:kern w:val="0"/>
+          <w:sz w:val="18"/>
+          <w:szCs w:val="18"/>
+          <w:shd w:val="clear" w:color="auto" w:fill="262626"/>
+          <w14:ligatures w14:val="none"/>
+        </w:rPr>
+      </w:pPr>
+      <w:r>
+        <w:rPr>
+          <w:rFonts w:ascii="Courier New" w:eastAsia="Times New Roman" w:hAnsi="Courier New" w:cs="Courier New"/>
+          <w:color w:val="8C8C8C"/>
+          <w:kern w:val="0"/>
+          <w:sz w:val="18"/>
+          <w:szCs w:val="18"/>
+          <w:shd w:val="clear" w:color="auto" w:fill="262626"/>
+          <w14:ligatures w14:val="none"/>
+        </w:rPr>
+        <w:t xml:space="preserve">state κ </w:t>
+      </w:r>
+      <w:proofErr w:type="gramStart"/>
+      <w:r>
+        <w:rPr>
+          <w:rFonts w:ascii="Courier New" w:eastAsia="Times New Roman" w:hAnsi="Courier New" w:cs="Courier New"/>
+          <w:color w:val="8C8C8C"/>
+          <w:kern w:val="0"/>
+          <w:sz w:val="18"/>
+          <w:szCs w:val="18"/>
+          <w:shd w:val="clear" w:color="auto" w:fill="262626"/>
+          <w14:ligatures w14:val="none"/>
+        </w:rPr>
+        <w:t>[  0</w:t>
+      </w:r>
+      <w:proofErr w:type="gramEnd"/>
+      <w:r>
+        <w:rPr>
+          <w:rFonts w:ascii="Courier New" w:eastAsia="Times New Roman" w:hAnsi="Courier New" w:cs="Courier New"/>
+          <w:color w:val="8C8C8C"/>
+          <w:kern w:val="0"/>
+          <w:sz w:val="18"/>
+          <w:szCs w:val="18"/>
+          <w:shd w:val="clear" w:color="auto" w:fill="262626"/>
+          <w14:ligatures w14:val="none"/>
+        </w:rPr>
+        <w:t xml:space="preserve">      0      0    ...    </w:t>
+      </w:r>
+      <w:proofErr w:type="gramStart"/>
+      <w:r>
+        <w:rPr>
+          <w:rFonts w:ascii="Courier New" w:eastAsia="Times New Roman" w:hAnsi="Courier New" w:cs="Courier New"/>
+          <w:color w:val="8C8C8C"/>
+          <w:kern w:val="0"/>
+          <w:sz w:val="18"/>
+          <w:szCs w:val="18"/>
+          <w:shd w:val="clear" w:color="auto" w:fill="262626"/>
+          <w14:ligatures w14:val="none"/>
+        </w:rPr>
+        <w:t>1  ]</w:t>
+      </w:r>
+      <w:proofErr w:type="gramEnd"/>
+    </w:p>
+    <w:p>
+      <w:pPr>
+        <w:shd w:val="clear" w:color="auto" w:fill="191A1B"/>
+        <w:spacing w:before="24" w:after="48" w:line="240" w:lineRule="auto"/>
+        <w:rPr>
+          <w:rFonts w:ascii="Segoe UI" w:eastAsia="Times New Roman" w:hAnsi="Segoe UI" w:cs="Segoe UI"/>
+          <w:color w:val="BFBFBF"/>
+          <w:kern w:val="0"/>
+          <w:sz w:val="20"/>
+          <w:szCs w:val="20"/>
+          <w14:ligatures w14:val="none"/>
+        </w:rPr>
+      </w:pPr>
+      <w:r>
+        <w:rPr>
+          <w:rFonts w:ascii="Segoe UI" w:eastAsia="Times New Roman" w:hAnsi="Segoe UI" w:cs="Segoe UI"/>
+          <w:color w:val="BFBFBF"/>
+          <w:kern w:val="0"/>
+          <w:sz w:val="20"/>
+          <w:szCs w:val="20"/>
+          <w14:ligatures w14:val="none"/>
+        </w:rPr>
+        <w:t>As Euler steps run, each column spreads from a spike into a full distribution — uncertainty about the station's state grows as the day progresses.</w:t>
+      </w:r>
+    </w:p>
+    <w:p>
+      <w:pPr>
+        <w:spacing w:after="0" w:line="240" w:lineRule="auto"/>
+        <w:rPr>
+          <w:rFonts w:ascii="Segoe UI" w:eastAsia="Times New Roman" w:hAnsi="Segoe UI" w:cs="Segoe UI"/>
+          <w:kern w:val="0"/>
+          <w:sz w:val="20"/>
+          <w:szCs w:val="20"/>
+          <w14:ligatures w14:val="none"/>
+        </w:rPr>
+      </w:pPr>
+      <w:r>
+        <w:rPr>
+          <w:rFonts w:ascii="Times New Roman" w:eastAsia="Times New Roman" w:hAnsi="Times New Roman" w:cs="Times New Roman"/>
+          <w:kern w:val="0"/>
+          <w14:ligatures w14:val="none"/>
+        </w:rPr>
+        <w:pict w14:anchorId="5FE6E483">
+          <v:rect id="_x0000_i1028" style="width:0;height:1.5pt" o:hralign="center" o:hrstd="t" o:hr="t" fillcolor="#a0a0a0" stroked="f"/>
+        </w:pict>
+      </w:r>
+    </w:p>
+    <w:p>
+      <w:pPr>
+        <w:shd w:val="clear" w:color="auto" w:fill="191A1B"/>
+        <w:spacing w:before="100" w:beforeAutospacing="1" w:after="100" w:afterAutospacing="1" w:line="240" w:lineRule="auto"/>
+        <w:outlineLvl w:val="2"/>
+        <w:rPr>
+          <w:rFonts w:ascii="Segoe UI" w:eastAsia="Times New Roman" w:hAnsi="Segoe UI" w:cs="Segoe UI"/>
+          <w:b/>
+          <w:bCs/>
+          <w:color w:val="BFBFBF"/>
+          <w:kern w:val="0"/>
+          <w:sz w:val="27"/>
+          <w:szCs w:val="27"/>
+          <w14:ligatures w14:val="none"/>
+        </w:rPr>
+      </w:pPr>
+      <w:r>
+        <w:rPr>
+          <w:rFonts w:ascii="Segoe UI" w:eastAsia="Times New Roman" w:hAnsi="Segoe UI" w:cs="Segoe UI"/>
+          <w:b/>
+          <w:bCs/>
+          <w:color w:val="BFBFBF"/>
+          <w:kern w:val="0"/>
+          <w:sz w:val="27"/>
+          <w:szCs w:val="27"/>
+          <w14:ligatures w14:val="none"/>
+        </w:rPr>
+        <w:t>The Euler Loop (900 steps, dt = 1 minute)</w:t>
+      </w:r>
+    </w:p>
+    <w:p>
+      <w:pPr>
+        <w:shd w:val="clear" w:color="auto" w:fill="191A1B"/>
+        <w:spacing w:before="24" w:after="48" w:line="240" w:lineRule="auto"/>
+        <w:rPr>
+          <w:rFonts w:ascii="Segoe UI" w:eastAsia="Times New Roman" w:hAnsi="Segoe UI" w:cs="Segoe UI"/>
+          <w:color w:val="BFBFBF"/>
+          <w:kern w:val="0"/>
+          <w:sz w:val="20"/>
+          <w:szCs w:val="20"/>
+          <w14:ligatures w14:val="none"/>
+        </w:rPr>
+      </w:pPr>
+      <w:r>
+        <w:rPr>
+          <w:rFonts w:ascii="Segoe UI" w:eastAsia="Times New Roman" w:hAnsi="Segoe UI" w:cs="Segoe UI"/>
+          <w:color w:val="BFBFBF"/>
+          <w:kern w:val="0"/>
+          <w:sz w:val="20"/>
+          <w:szCs w:val="20"/>
+          <w14:ligatures w14:val="none"/>
+        </w:rPr>
+        <w:t>Each step:</w:t>
+      </w:r>
+    </w:p>
+    <w:p>
+      <w:pPr>
+        <w:shd w:val="clear" w:color="auto" w:fill="191A1B"/>
+        <w:tabs>
+          <w:tab w:val="left" w:pos="916"/>
+          <w:tab w:val="left" w:pos="1832"/>
+          <w:tab w:val="left" w:pos="2748"/>
+          <w:tab w:val="left" w:pos="3664"/>
+          <w:tab w:val="left" w:pos="4580"/>
+          <w:tab w:val="left" w:pos="5496"/>
+          <w:tab w:val="left" w:pos="6412"/>
+          <w:tab w:val="left" w:pos="7328"/>
+          <w:tab w:val="left" w:pos="8244"/>
+          <w:tab w:val="left" w:pos="9160"/>
+          <w:tab w:val="left" w:pos="10076"/>
+          <w:tab w:val="left" w:pos="10992"/>
+          <w:tab w:val="left" w:pos="11908"/>
+          <w:tab w:val="left" w:pos="12824"/>
+          <w:tab w:val="left" w:pos="13740"/>
+          <w:tab w:val="left" w:pos="14656"/>
+        </w:tabs>
+        <w:spacing w:after="0" w:line="240" w:lineRule="auto"/>
+        <w:rPr>
+          <w:rFonts w:ascii="Courier New" w:eastAsia="Times New Roman" w:hAnsi="Courier New" w:cs="Courier New"/>
+          <w:color w:val="8C8C8C"/>
+          <w:kern w:val="0"/>
+          <w:sz w:val="18"/>
+          <w:szCs w:val="18"/>
+          <w:shd w:val="clear" w:color="auto" w:fill="262626"/>
+          <w14:ligatures w14:val="none"/>
+        </w:rPr>
+      </w:pPr>
+      <w:r>
+        <w:rPr>
+          <w:rFonts w:ascii="Courier New" w:eastAsia="Times New Roman" w:hAnsi="Courier New" w:cs="Courier New"/>
+          <w:color w:val="8C8C8C"/>
+          <w:kern w:val="0"/>
+          <w:sz w:val="18"/>
+          <w:szCs w:val="18"/>
+          <w:shd w:val="clear" w:color="auto" w:fill="262626"/>
+          <w14:ligatures w14:val="none"/>
+        </w:rPr>
+        <w:t xml:space="preserve">1. F += dt * (μ * </w:t>
+      </w:r>
+      <w:proofErr w:type="gramStart"/>
+      <w:r>
+        <w:rPr>
+          <w:rFonts w:ascii="Courier New" w:eastAsia="Times New Roman" w:hAnsi="Courier New" w:cs="Courier New"/>
+          <w:color w:val="8C8C8C"/>
+          <w:kern w:val="0"/>
+          <w:sz w:val="18"/>
+          <w:szCs w:val="18"/>
+          <w:shd w:val="clear" w:color="auto" w:fill="262626"/>
+          <w14:ligatures w14:val="none"/>
+        </w:rPr>
+        <w:t>P[</w:t>
+      </w:r>
+      <w:proofErr w:type="gramEnd"/>
+      <w:r>
+        <w:rPr>
+          <w:rFonts w:ascii="Courier New" w:eastAsia="Times New Roman" w:hAnsi="Courier New" w:cs="Courier New"/>
+          <w:color w:val="8C8C8C"/>
+          <w:kern w:val="0"/>
+          <w:sz w:val="18"/>
+          <w:szCs w:val="18"/>
+          <w:shd w:val="clear" w:color="auto" w:fill="262626"/>
+          <w14:ligatures w14:val="none"/>
+        </w:rPr>
+        <w:t>0</w:t>
+      </w:r>
+      <w:proofErr w:type="gramStart"/>
+      <w:r>
+        <w:rPr>
+          <w:rFonts w:ascii="Courier New" w:eastAsia="Times New Roman" w:hAnsi="Courier New" w:cs="Courier New"/>
+          <w:color w:val="8C8C8C"/>
+          <w:kern w:val="0"/>
+          <w:sz w:val="18"/>
+          <w:szCs w:val="18"/>
+          <w:shd w:val="clear" w:color="auto" w:fill="262626"/>
+          <w14:ligatures w14:val="none"/>
+        </w:rPr>
+        <w:t>, :</w:t>
+      </w:r>
+      <w:proofErr w:type="gramEnd"/>
+      <w:r>
+        <w:rPr>
+          <w:rFonts w:ascii="Courier New" w:eastAsia="Times New Roman" w:hAnsi="Courier New" w:cs="Courier New"/>
+          <w:color w:val="8C8C8C"/>
+          <w:kern w:val="0"/>
+          <w:sz w:val="18"/>
+          <w:szCs w:val="18"/>
+          <w:shd w:val="clear" w:color="auto" w:fill="262626"/>
+          <w14:ligatures w14:val="none"/>
+        </w:rPr>
+        <w:t xml:space="preserve">] + λ * </w:t>
+      </w:r>
+      <w:proofErr w:type="gramStart"/>
+      <w:r>
+        <w:rPr>
+          <w:rFonts w:ascii="Courier New" w:eastAsia="Times New Roman" w:hAnsi="Courier New" w:cs="Courier New"/>
+          <w:color w:val="8C8C8C"/>
+          <w:kern w:val="0"/>
+          <w:sz w:val="18"/>
+          <w:szCs w:val="18"/>
+          <w:shd w:val="clear" w:color="auto" w:fill="262626"/>
+          <w14:ligatures w14:val="none"/>
+        </w:rPr>
+        <w:t>P[</w:t>
+      </w:r>
+      <w:proofErr w:type="gramEnd"/>
+      <w:r>
+        <w:rPr>
+          <w:rFonts w:ascii="Courier New" w:eastAsia="Times New Roman" w:hAnsi="Courier New" w:cs="Courier New"/>
+          <w:color w:val="8C8C8C"/>
+          <w:kern w:val="0"/>
+          <w:sz w:val="18"/>
+          <w:szCs w:val="18"/>
+          <w:shd w:val="clear" w:color="auto" w:fill="262626"/>
+          <w14:ligatures w14:val="none"/>
+        </w:rPr>
+        <w:t>-1</w:t>
+      </w:r>
+      <w:proofErr w:type="gramStart"/>
+      <w:r>
+        <w:rPr>
+          <w:rFonts w:ascii="Courier New" w:eastAsia="Times New Roman" w:hAnsi="Courier New" w:cs="Courier New"/>
+          <w:color w:val="8C8C8C"/>
+          <w:kern w:val="0"/>
+          <w:sz w:val="18"/>
+          <w:szCs w:val="18"/>
+          <w:shd w:val="clear" w:color="auto" w:fill="262626"/>
+          <w14:ligatures w14:val="none"/>
+        </w:rPr>
+        <w:t>, :</w:t>
+      </w:r>
+      <w:proofErr w:type="gramEnd"/>
+      <w:r>
+        <w:rPr>
+          <w:rFonts w:ascii="Courier New" w:eastAsia="Times New Roman" w:hAnsi="Courier New" w:cs="Courier New"/>
+          <w:color w:val="8C8C8C"/>
+          <w:kern w:val="0"/>
+          <w:sz w:val="18"/>
+          <w:szCs w:val="18"/>
+          <w:shd w:val="clear" w:color="auto" w:fill="262626"/>
+          <w14:ligatures w14:val="none"/>
+        </w:rPr>
+        <w:t>])   ← accumulate dissatisfaction</w:t>
+      </w:r>
+    </w:p>
+    <w:p>
+      <w:pPr>
+        <w:shd w:val="clear" w:color="auto" w:fill="191A1B"/>
+        <w:tabs>
+          <w:tab w:val="left" w:pos="916"/>
+          <w:tab w:val="left" w:pos="1832"/>
+          <w:tab w:val="left" w:pos="2748"/>
+          <w:tab w:val="left" w:pos="3664"/>
+          <w:tab w:val="left" w:pos="4580"/>
+          <w:tab w:val="left" w:pos="5496"/>
+          <w:tab w:val="left" w:pos="6412"/>
+          <w:tab w:val="left" w:pos="7328"/>
+          <w:tab w:val="left" w:pos="8244"/>
+          <w:tab w:val="left" w:pos="9160"/>
+          <w:tab w:val="left" w:pos="10076"/>
+          <w:tab w:val="left" w:pos="10992"/>
+          <w:tab w:val="left" w:pos="11908"/>
+          <w:tab w:val="left" w:pos="12824"/>
+          <w:tab w:val="left" w:pos="13740"/>
+          <w:tab w:val="left" w:pos="14656"/>
+        </w:tabs>
+        <w:spacing w:after="0" w:line="240" w:lineRule="auto"/>
+        <w:rPr>
+          <w:rFonts w:ascii="Courier New" w:eastAsia="Times New Roman" w:hAnsi="Courier New" w:cs="Courier New"/>
+          <w:color w:val="8C8C8C"/>
+          <w:kern w:val="0"/>
+          <w:sz w:val="18"/>
+          <w:szCs w:val="18"/>
+          <w:shd w:val="clear" w:color="auto" w:fill="262626"/>
+          <w14:ligatures w14:val="none"/>
+        </w:rPr>
+      </w:pPr>
+      <w:r>
+        <w:rPr>
+          <w:rFonts w:ascii="Courier New" w:eastAsia="Times New Roman" w:hAnsi="Courier New" w:cs="Courier New"/>
+          <w:color w:val="8C8C8C"/>
+          <w:kern w:val="0"/>
+          <w:sz w:val="18"/>
+          <w:szCs w:val="18"/>
+          <w:shd w:val="clear" w:color="auto" w:fill="262626"/>
+          <w14:ligatures w14:val="none"/>
+        </w:rPr>
+        <w:t xml:space="preserve">2. </w:t>
+      </w:r>
+      <w:proofErr w:type="gramStart"/>
+      <w:r>
+        <w:rPr>
+          <w:rFonts w:ascii="Courier New" w:eastAsia="Times New Roman" w:hAnsi="Courier New" w:cs="Courier New"/>
+          <w:color w:val="8C8C8C"/>
+          <w:kern w:val="0"/>
+          <w:sz w:val="18"/>
+          <w:szCs w:val="18"/>
+          <w:shd w:val="clear" w:color="auto" w:fill="262626"/>
+          <w14:ligatures w14:val="none"/>
+        </w:rPr>
+        <w:t>P  =</w:t>
+      </w:r>
+      <w:proofErr w:type="gramEnd"/>
+      <w:r>
+        <w:rPr>
+          <w:rFonts w:ascii="Courier New" w:eastAsia="Times New Roman" w:hAnsi="Courier New" w:cs="Courier New"/>
+          <w:color w:val="8C8C8C"/>
+          <w:kern w:val="0"/>
+          <w:sz w:val="18"/>
+          <w:szCs w:val="18"/>
+          <w:shd w:val="clear" w:color="auto" w:fill="262626"/>
+          <w14:ligatures w14:val="none"/>
+        </w:rPr>
+        <w:t xml:space="preserve"> P + dt * (</w:t>
+      </w:r>
+      <w:proofErr w:type="gramStart"/>
+      <w:r>
+        <w:rPr>
+          <w:rFonts w:ascii="Courier New" w:eastAsia="Times New Roman" w:hAnsi="Courier New" w:cs="Courier New"/>
+          <w:color w:val="8C8C8C"/>
+          <w:kern w:val="0"/>
+          <w:sz w:val="18"/>
+          <w:szCs w:val="18"/>
+          <w:shd w:val="clear" w:color="auto" w:fill="262626"/>
+          <w14:ligatures w14:val="none"/>
+        </w:rPr>
+        <w:t>Q @</w:t>
+      </w:r>
+      <w:proofErr w:type="gramEnd"/>
+      <w:r>
+        <w:rPr>
+          <w:rFonts w:ascii="Courier New" w:eastAsia="Times New Roman" w:hAnsi="Courier New" w:cs="Courier New"/>
+          <w:color w:val="8C8C8C"/>
+          <w:kern w:val="0"/>
+          <w:sz w:val="18"/>
+          <w:szCs w:val="18"/>
+          <w:shd w:val="clear" w:color="auto" w:fill="262626"/>
+          <w14:ligatures w14:val="none"/>
+        </w:rPr>
+        <w:t xml:space="preserve"> </w:t>
+      </w:r>
+      <w:proofErr w:type="gramStart"/>
+      <w:r>
+        <w:rPr>
+          <w:rFonts w:ascii="Courier New" w:eastAsia="Times New Roman" w:hAnsi="Courier New" w:cs="Courier New"/>
+          <w:color w:val="8C8C8C"/>
+          <w:kern w:val="0"/>
+          <w:sz w:val="18"/>
+          <w:szCs w:val="18"/>
+          <w:shd w:val="clear" w:color="auto" w:fill="262626"/>
+          <w14:ligatures w14:val="none"/>
+        </w:rPr>
+        <w:t xml:space="preserve">P)   </w:t>
+      </w:r>
+      <w:proofErr w:type="gramEnd"/>
+      <w:r>
+        <w:rPr>
+          <w:rFonts w:ascii="Courier New" w:eastAsia="Times New Roman" w:hAnsi="Courier New" w:cs="Courier New"/>
+          <w:color w:val="8C8C8C"/>
+          <w:kern w:val="0"/>
+          <w:sz w:val="18"/>
+          <w:szCs w:val="18"/>
+          <w:shd w:val="clear" w:color="auto" w:fill="262626"/>
+          <w14:ligatures w14:val="none"/>
+        </w:rPr>
+        <w:t xml:space="preserve">                  ← step all distributions forward</w:t>
+      </w:r>
+    </w:p>
+    <w:p>
+      <w:pPr>
+        <w:numPr>
+          <w:ilvl w:val="0"/>
+          <w:numId w:val="8"/>
+        </w:numPr>
+        <w:shd w:val="clear" w:color="auto" w:fill="191A1B"/>
+        <w:spacing w:before="100" w:beforeAutospacing="1" w:after="100" w:afterAutospacing="1" w:line="240" w:lineRule="auto"/>
+        <w:rPr>
+          <w:rFonts w:ascii="Segoe UI" w:eastAsia="Times New Roman" w:hAnsi="Segoe UI" w:cs="Segoe UI"/>
+          <w:color w:val="BFBFBF"/>
+          <w:kern w:val="0"/>
+          <w:sz w:val="20"/>
+          <w:szCs w:val="20"/>
+          <w14:ligatures w14:val="none"/>
+        </w:rPr>
+      </w:pPr>
+      <w:proofErr w:type="gramStart"/>
+      <w:r>
+        <w:rPr>
+          <w:rFonts w:ascii="Courier New" w:eastAsia="Times New Roman" w:hAnsi="Courier New" w:cs="Courier New"/>
+          <w:color w:val="8C8C8C"/>
+          <w:kern w:val="0"/>
+          <w:sz w:val="18"/>
+          <w:szCs w:val="18"/>
+          <w:shd w:val="clear" w:color="auto" w:fill="262626"/>
+          <w14:ligatures w14:val="none"/>
+        </w:rPr>
+        <w:t>P[</w:t>
+      </w:r>
+      <w:proofErr w:type="gramEnd"/>
+      <w:r>
+        <w:rPr>
+          <w:rFonts w:ascii="Courier New" w:eastAsia="Times New Roman" w:hAnsi="Courier New" w:cs="Courier New"/>
+          <w:color w:val="8C8C8C"/>
+          <w:kern w:val="0"/>
+          <w:sz w:val="18"/>
+          <w:szCs w:val="18"/>
+          <w:shd w:val="clear" w:color="auto" w:fill="262626"/>
+          <w14:ligatures w14:val="none"/>
+        </w:rPr>
+        <w:t>0</w:t>
+      </w:r>
+      <w:proofErr w:type="gramStart"/>
+      <w:r>
+        <w:rPr>
+          <w:rFonts w:ascii="Courier New" w:eastAsia="Times New Roman" w:hAnsi="Courier New" w:cs="Courier New"/>
+          <w:color w:val="8C8C8C"/>
+          <w:kern w:val="0"/>
+          <w:sz w:val="18"/>
+          <w:szCs w:val="18"/>
+          <w:shd w:val="clear" w:color="auto" w:fill="262626"/>
+          <w14:ligatures w14:val="none"/>
+        </w:rPr>
+        <w:t>, :</w:t>
+      </w:r>
+      <w:proofErr w:type="gramEnd"/>
+      <w:r>
+        <w:rPr>
+          <w:rFonts w:ascii="Courier New" w:eastAsia="Times New Roman" w:hAnsi="Courier New" w:cs="Courier New"/>
+          <w:color w:val="8C8C8C"/>
+          <w:kern w:val="0"/>
+          <w:sz w:val="18"/>
+          <w:szCs w:val="18"/>
+          <w:shd w:val="clear" w:color="auto" w:fill="262626"/>
+          <w14:ligatures w14:val="none"/>
+        </w:rPr>
+        <w:t>]</w:t>
+      </w:r>
+      <w:r>
+        <w:rPr>
+          <w:rFonts w:ascii="Segoe UI" w:eastAsia="Times New Roman" w:hAnsi="Segoe UI" w:cs="Segoe UI"/>
+          <w:color w:val="BFBFBF"/>
+          <w:kern w:val="0"/>
+          <w:sz w:val="20"/>
+          <w:szCs w:val="20"/>
+          <w14:ligatures w14:val="none"/>
+        </w:rPr>
+        <w:t> — probability of being empty, for every starting scenario simultaneously</w:t>
+      </w:r>
+    </w:p>
+    <w:p>
+      <w:pPr>
+        <w:numPr>
+          <w:ilvl w:val="0"/>
+          <w:numId w:val="8"/>
+        </w:numPr>
+        <w:shd w:val="clear" w:color="auto" w:fill="191A1B"/>
+        <w:spacing w:before="100" w:beforeAutospacing="1" w:after="100" w:afterAutospacing="1" w:line="240" w:lineRule="auto"/>
+        <w:rPr>
+          <w:rFonts w:ascii="Segoe UI" w:eastAsia="Times New Roman" w:hAnsi="Segoe UI" w:cs="Segoe UI"/>
+          <w:color w:val="BFBFBF"/>
+          <w:kern w:val="0"/>
+          <w:sz w:val="20"/>
+          <w:szCs w:val="20"/>
+          <w14:ligatures w14:val="none"/>
+        </w:rPr>
+      </w:pPr>
+      <w:proofErr w:type="gramStart"/>
+      <w:r>
+        <w:rPr>
+          <w:rFonts w:ascii="Courier New" w:eastAsia="Times New Roman" w:hAnsi="Courier New" w:cs="Courier New"/>
+          <w:color w:val="8C8C8C"/>
+          <w:kern w:val="0"/>
+          <w:sz w:val="18"/>
+          <w:szCs w:val="18"/>
+          <w:shd w:val="clear" w:color="auto" w:fill="262626"/>
+          <w14:ligatures w14:val="none"/>
+        </w:rPr>
+        <w:t>P[</w:t>
+      </w:r>
+      <w:proofErr w:type="gramEnd"/>
+      <w:r>
+        <w:rPr>
+          <w:rFonts w:ascii="Courier New" w:eastAsia="Times New Roman" w:hAnsi="Courier New" w:cs="Courier New"/>
+          <w:color w:val="8C8C8C"/>
+          <w:kern w:val="0"/>
+          <w:sz w:val="18"/>
+          <w:szCs w:val="18"/>
+          <w:shd w:val="clear" w:color="auto" w:fill="262626"/>
+          <w14:ligatures w14:val="none"/>
+        </w:rPr>
+        <w:t>-1</w:t>
+      </w:r>
+      <w:proofErr w:type="gramStart"/>
+      <w:r>
+        <w:rPr>
+          <w:rFonts w:ascii="Courier New" w:eastAsia="Times New Roman" w:hAnsi="Courier New" w:cs="Courier New"/>
+          <w:color w:val="8C8C8C"/>
+          <w:kern w:val="0"/>
+          <w:sz w:val="18"/>
+          <w:szCs w:val="18"/>
+          <w:shd w:val="clear" w:color="auto" w:fill="262626"/>
+          <w14:ligatures w14:val="none"/>
+        </w:rPr>
+        <w:t>, :</w:t>
+      </w:r>
+      <w:proofErr w:type="gramEnd"/>
+      <w:r>
+        <w:rPr>
+          <w:rFonts w:ascii="Courier New" w:eastAsia="Times New Roman" w:hAnsi="Courier New" w:cs="Courier New"/>
+          <w:color w:val="8C8C8C"/>
+          <w:kern w:val="0"/>
+          <w:sz w:val="18"/>
+          <w:szCs w:val="18"/>
+          <w:shd w:val="clear" w:color="auto" w:fill="262626"/>
+          <w14:ligatures w14:val="none"/>
+        </w:rPr>
+        <w:t>]</w:t>
+      </w:r>
+      <w:r>
+        <w:rPr>
+          <w:rFonts w:ascii="Segoe UI" w:eastAsia="Times New Roman" w:hAnsi="Segoe UI" w:cs="Segoe UI"/>
+          <w:color w:val="BFBFBF"/>
+          <w:kern w:val="0"/>
+          <w:sz w:val="20"/>
+          <w:szCs w:val="20"/>
+          <w14:ligatures w14:val="none"/>
+        </w:rPr>
+        <w:t> — probability of being full, for every starting scenario simultaneously</w:t>
+      </w:r>
+    </w:p>
+    <w:p>
+      <w:pPr>
+        <w:numPr>
+          <w:ilvl w:val="0"/>
+          <w:numId w:val="8"/>
+        </w:numPr>
+        <w:shd w:val="clear" w:color="auto" w:fill="191A1B"/>
+        <w:spacing w:before="100" w:beforeAutospacing="1" w:after="100" w:afterAutospacing="1" w:line="240" w:lineRule="auto"/>
+        <w:rPr>
+          <w:rFonts w:ascii="Segoe UI" w:eastAsia="Times New Roman" w:hAnsi="Segoe UI" w:cs="Segoe UI"/>
+          <w:color w:val="BFBFBF"/>
+          <w:kern w:val="0"/>
+          <w:sz w:val="20"/>
+          <w:szCs w:val="20"/>
+          <w14:ligatures w14:val="none"/>
+        </w:rPr>
+      </w:pPr>
+      <w:proofErr w:type="gramStart"/>
+      <w:r>
+        <w:rPr>
+          <w:rFonts w:ascii="Courier New" w:eastAsia="Times New Roman" w:hAnsi="Courier New" w:cs="Courier New"/>
+          <w:color w:val="8C8C8C"/>
+          <w:kern w:val="0"/>
+          <w:sz w:val="18"/>
+          <w:szCs w:val="18"/>
+          <w:shd w:val="clear" w:color="auto" w:fill="262626"/>
+          <w14:ligatures w14:val="none"/>
+        </w:rPr>
+        <w:t>Q @ P</w:t>
+      </w:r>
+      <w:r>
+        <w:rPr>
+          <w:rFonts w:ascii="Segoe UI" w:eastAsia="Times New Roman" w:hAnsi="Segoe UI" w:cs="Segoe UI"/>
+          <w:color w:val="BFBFBF"/>
+          <w:kern w:val="0"/>
+          <w:sz w:val="20"/>
+          <w:szCs w:val="20"/>
+          <w14:ligatures w14:val="none"/>
+        </w:rPr>
+        <w:t> —</w:t>
+      </w:r>
+      <w:proofErr w:type="gramEnd"/>
+      <w:r>
+        <w:rPr>
+          <w:rFonts w:ascii="Segoe UI" w:eastAsia="Times New Roman" w:hAnsi="Segoe UI" w:cs="Segoe UI"/>
+          <w:color w:val="BFBFBF"/>
+          <w:kern w:val="0"/>
+          <w:sz w:val="20"/>
+          <w:szCs w:val="20"/>
+          <w14:ligatures w14:val="none"/>
+        </w:rPr>
+        <w:t xml:space="preserve"> computes the derivative of every column at once (rate of change of every distribution)</w:t>
+      </w:r>
+    </w:p>
+    <w:p>
+      <w:pPr>
+        <w:shd w:val="clear" w:color="auto" w:fill="191A1B"/>
+        <w:spacing w:before="24" w:after="48" w:line="240" w:lineRule="auto"/>
+        <w:rPr>
+          <w:rFonts w:ascii="Segoe UI" w:eastAsia="Times New Roman" w:hAnsi="Segoe UI" w:cs="Segoe UI"/>
+          <w:color w:val="BFBFBF"/>
+          <w:kern w:val="0"/>
+          <w:sz w:val="20"/>
+          <w:szCs w:val="20"/>
+          <w14:ligatures w14:val="none"/>
+        </w:rPr>
+      </w:pPr>
+      <w:r>
+        <w:rPr>
+          <w:rFonts w:ascii="Segoe UI" w:eastAsia="Times New Roman" w:hAnsi="Segoe UI" w:cs="Segoe UI"/>
+          <w:color w:val="BFBFBF"/>
+          <w:kern w:val="0"/>
+          <w:sz w:val="20"/>
+          <w:szCs w:val="20"/>
+          <w14:ligatures w14:val="none"/>
+        </w:rPr>
+        <w:t xml:space="preserve">After 900 steps, </w:t>
+      </w:r>
+      <w:r>
+        <w:rPr>
+          <w:rFonts w:ascii="Courier New" w:eastAsia="Times New Roman" w:hAnsi="Courier New" w:cs="Courier New"/>
+          <w:color w:val="8C8C8C"/>
+          <w:kern w:val="0"/>
+          <w:sz w:val="18"/>
+          <w:szCs w:val="18"/>
+          <w:shd w:val="clear" w:color="auto" w:fill="262626"/>
+          <w14:ligatures w14:val="none"/>
+        </w:rPr>
+        <w:t>F[j]</w:t>
+      </w:r>
+      <w:r>
+        <w:rPr>
+          <w:rFonts w:ascii="Segoe UI" w:eastAsia="Times New Roman" w:hAnsi="Segoe UI" w:cs="Segoe UI"/>
+          <w:color w:val="BFBFBF"/>
+          <w:kern w:val="0"/>
+          <w:sz w:val="20"/>
+          <w:szCs w:val="20"/>
+          <w14:ligatures w14:val="none"/>
+        </w:rPr>
+        <w:t xml:space="preserve"> = total expected dissatisfied users given the station started with j bikes. That's the complete </w:t>
+      </w:r>
+      <w:r>
+        <w:rPr>
+          <w:rFonts w:ascii="Courier New" w:eastAsia="Times New Roman" w:hAnsi="Courier New" w:cs="Courier New"/>
+          <w:color w:val="8C8C8C"/>
+          <w:kern w:val="0"/>
+          <w:sz w:val="18"/>
+          <w:szCs w:val="18"/>
+          <w:shd w:val="clear" w:color="auto" w:fill="262626"/>
+          <w14:ligatures w14:val="none"/>
+        </w:rPr>
+        <w:t>F_s</w:t>
+      </w:r>
+      <w:r>
+        <w:rPr>
+          <w:rFonts w:ascii="Segoe UI" w:eastAsia="Times New Roman" w:hAnsi="Segoe UI" w:cs="Segoe UI"/>
+          <w:color w:val="BFBFBF"/>
+          <w:kern w:val="0"/>
+          <w:sz w:val="20"/>
+          <w:szCs w:val="20"/>
+          <w14:ligatures w14:val="none"/>
+        </w:rPr>
+        <w:t xml:space="preserve"> curve for one station, one day type.</w:t>
+      </w:r>
+    </w:p>
+    <w:p>
+      <w:pPr>
+        <w:spacing w:after="0" w:line="240" w:lineRule="auto"/>
+        <w:rPr>
+          <w:rFonts w:ascii="Segoe UI" w:eastAsia="Times New Roman" w:hAnsi="Segoe UI" w:cs="Segoe UI"/>
+          <w:kern w:val="0"/>
+          <w:sz w:val="20"/>
+          <w:szCs w:val="20"/>
+          <w14:ligatures w14:val="none"/>
+        </w:rPr>
+      </w:pPr>
+      <w:r>
+        <w:rPr>
+          <w:rFonts w:ascii="Times New Roman" w:eastAsia="Times New Roman" w:hAnsi="Times New Roman" w:cs="Times New Roman"/>
+          <w:kern w:val="0"/>
+          <w14:ligatures w14:val="none"/>
+        </w:rPr>
+        <w:pict w14:anchorId="37D95F77">
+          <v:rect id="_x0000_i1029" style="width:0;height:1.5pt" o:hralign="center" o:hrstd="t" o:hr="t" fillcolor="#a0a0a0" stroked="f"/>
+        </w:pict>
+      </w:r>
+    </w:p>
+    <w:p>
+      <w:pPr>
+        <w:shd w:val="clear" w:color="auto" w:fill="191A1B"/>
+        <w:spacing w:before="100" w:beforeAutospacing="1" w:after="100" w:afterAutospacing="1" w:line="240" w:lineRule="auto"/>
+        <w:outlineLvl w:val="2"/>
+        <w:rPr>
+          <w:rFonts w:ascii="Segoe UI" w:eastAsia="Times New Roman" w:hAnsi="Segoe UI" w:cs="Segoe UI"/>
+          <w:b/>
+          <w:bCs/>
+          <w:color w:val="BFBFBF"/>
+          <w:kern w:val="0"/>
+          <w:sz w:val="27"/>
+          <w:szCs w:val="27"/>
+          <w14:ligatures w14:val="none"/>
+        </w:rPr>
+      </w:pPr>
+      <w:r>
+        <w:rPr>
+          <w:rFonts w:ascii="Segoe UI" w:eastAsia="Times New Roman" w:hAnsi="Segoe UI" w:cs="Segoe UI"/>
+          <w:b/>
+          <w:bCs/>
+          <w:color w:val="BFBFBF"/>
+          <w:kern w:val="0"/>
+          <w:sz w:val="27"/>
+          <w:szCs w:val="27"/>
+          <w14:ligatures w14:val="none"/>
+        </w:rPr>
+        <w:t>What Comes Next</w:t>
+      </w:r>
+    </w:p>
+    <w:p>
+      <w:pPr>
+        <w:shd w:val="clear" w:color="auto" w:fill="191A1B"/>
+        <w:spacing w:before="24" w:after="48" w:line="240" w:lineRule="auto"/>
+        <w:rPr>
+          <w:rFonts w:ascii="Segoe UI" w:eastAsia="Times New Roman" w:hAnsi="Segoe UI" w:cs="Segoe UI"/>
+          <w:color w:val="BFBFBF"/>
+          <w:kern w:val="0"/>
+          <w:sz w:val="20"/>
+          <w:szCs w:val="20"/>
+          <w14:ligatures w14:val="none"/>
+        </w:rPr>
+      </w:pPr>
+      <w:r>
+        <w:rPr>
+          <w:rFonts w:ascii="Segoe UI" w:eastAsia="Times New Roman" w:hAnsi="Segoe UI" w:cs="Segoe UI"/>
+          <w:color w:val="BFBFBF"/>
+          <w:kern w:val="0"/>
+          <w:sz w:val="20"/>
+          <w:szCs w:val="20"/>
+          <w14:ligatures w14:val="none"/>
+        </w:rPr>
+        <w:t xml:space="preserve">From </w:t>
+      </w:r>
+      <w:r>
+        <w:rPr>
+          <w:rFonts w:ascii="Courier New" w:eastAsia="Times New Roman" w:hAnsi="Courier New" w:cs="Courier New"/>
+          <w:color w:val="8C8C8C"/>
+          <w:kern w:val="0"/>
+          <w:sz w:val="18"/>
+          <w:szCs w:val="18"/>
+          <w:shd w:val="clear" w:color="auto" w:fill="262626"/>
+          <w14:ligatures w14:val="none"/>
+        </w:rPr>
+        <w:t>F</w:t>
+      </w:r>
+      <w:r>
+        <w:rPr>
+          <w:rFonts w:ascii="Segoe UI" w:eastAsia="Times New Roman" w:hAnsi="Segoe UI" w:cs="Segoe UI"/>
+          <w:color w:val="BFBFBF"/>
+          <w:kern w:val="0"/>
+          <w:sz w:val="20"/>
+          <w:szCs w:val="20"/>
+          <w14:ligatures w14:val="none"/>
+        </w:rPr>
+        <w:t>:</w:t>
+      </w:r>
+    </w:p>
+    <w:p>
+      <w:pPr>
+        <w:numPr>
+          <w:ilvl w:val="0"/>
+          <w:numId w:val="9"/>
+        </w:numPr>
+        <w:shd w:val="clear" w:color="auto" w:fill="191A1B"/>
+        <w:spacing w:before="100" w:beforeAutospacing="1" w:after="100" w:afterAutospacing="1" w:line="240" w:lineRule="auto"/>
+        <w:rPr>
+          <w:rFonts w:ascii="Segoe UI" w:eastAsia="Times New Roman" w:hAnsi="Segoe UI" w:cs="Segoe UI"/>
+          <w:color w:val="BFBFBF"/>
+          <w:kern w:val="0"/>
+          <w:sz w:val="20"/>
+          <w:szCs w:val="20"/>
+          <w14:ligatures w14:val="none"/>
+        </w:rPr>
+      </w:pPr>
+      <w:proofErr w:type="spellStart"/>
+      <w:r>
+        <w:rPr>
+          <w:rFonts w:ascii="Courier New" w:eastAsia="Times New Roman" w:hAnsi="Courier New" w:cs="Courier New"/>
+          <w:color w:val="8C8C8C"/>
+          <w:kern w:val="0"/>
+          <w:sz w:val="18"/>
+          <w:szCs w:val="18"/>
+          <w:shd w:val="clear" w:color="auto" w:fill="262626"/>
+          <w14:ligatures w14:val="none"/>
+        </w:rPr>
+        <w:t>min_s</w:t>
+      </w:r>
+      <w:proofErr w:type="spellEnd"/>
+      <w:r>
+        <w:rPr>
+          <w:rFonts w:ascii="Courier New" w:eastAsia="Times New Roman" w:hAnsi="Courier New" w:cs="Courier New"/>
+          <w:color w:val="8C8C8C"/>
+          <w:kern w:val="0"/>
+          <w:sz w:val="18"/>
+          <w:szCs w:val="18"/>
+          <w:shd w:val="clear" w:color="auto" w:fill="262626"/>
+          <w14:ligatures w14:val="none"/>
+        </w:rPr>
+        <w:t xml:space="preserve"> = </w:t>
+      </w:r>
+      <w:proofErr w:type="spellStart"/>
+      <w:r>
+        <w:rPr>
+          <w:rFonts w:ascii="Courier New" w:eastAsia="Times New Roman" w:hAnsi="Courier New" w:cs="Courier New"/>
+          <w:color w:val="8C8C8C"/>
+          <w:kern w:val="0"/>
+          <w:sz w:val="18"/>
+          <w:szCs w:val="18"/>
+          <w:shd w:val="clear" w:color="auto" w:fill="262626"/>
+          <w14:ligatures w14:val="none"/>
+        </w:rPr>
+        <w:t>argmin</w:t>
+      </w:r>
+      <w:proofErr w:type="spellEnd"/>
+      <w:r>
+        <w:rPr>
+          <w:rFonts w:ascii="Courier New" w:eastAsia="Times New Roman" w:hAnsi="Courier New" w:cs="Courier New"/>
+          <w:color w:val="8C8C8C"/>
+          <w:kern w:val="0"/>
+          <w:sz w:val="18"/>
+          <w:szCs w:val="18"/>
+          <w:shd w:val="clear" w:color="auto" w:fill="262626"/>
+          <w14:ligatures w14:val="none"/>
+        </w:rPr>
+        <w:t>(</w:t>
+      </w:r>
+      <w:proofErr w:type="gramStart"/>
+      <w:r>
+        <w:rPr>
+          <w:rFonts w:ascii="Courier New" w:eastAsia="Times New Roman" w:hAnsi="Courier New" w:cs="Courier New"/>
+          <w:color w:val="8C8C8C"/>
+          <w:kern w:val="0"/>
+          <w:sz w:val="18"/>
+          <w:szCs w:val="18"/>
+          <w:shd w:val="clear" w:color="auto" w:fill="262626"/>
+          <w14:ligatures w14:val="none"/>
+        </w:rPr>
+        <w:t>F)</w:t>
+      </w:r>
+      <w:r>
+        <w:rPr>
+          <w:rFonts w:ascii="Segoe UI" w:eastAsia="Times New Roman" w:hAnsi="Segoe UI" w:cs="Segoe UI"/>
+          <w:color w:val="BFBFBF"/>
+          <w:kern w:val="0"/>
+          <w:sz w:val="20"/>
+          <w:szCs w:val="20"/>
+          <w14:ligatures w14:val="none"/>
+        </w:rPr>
+        <w:t> —</w:t>
+      </w:r>
+      <w:proofErr w:type="gramEnd"/>
+      <w:r>
+        <w:rPr>
+          <w:rFonts w:ascii="Segoe UI" w:eastAsia="Times New Roman" w:hAnsi="Segoe UI" w:cs="Segoe UI"/>
+          <w:color w:val="BFBFBF"/>
+          <w:kern w:val="0"/>
+          <w:sz w:val="20"/>
+          <w:szCs w:val="20"/>
+          <w14:ligatures w14:val="none"/>
+        </w:rPr>
+        <w:t xml:space="preserve"> the optimal starting count</w:t>
+      </w:r>
+    </w:p>
+    <w:p>
+      <w:pPr>
+        <w:numPr>
+          <w:ilvl w:val="0"/>
+          <w:numId w:val="9"/>
+        </w:numPr>
+        <w:shd w:val="clear" w:color="auto" w:fill="191A1B"/>
+        <w:spacing w:before="100" w:beforeAutospacing="1" w:after="100" w:afterAutospacing="1" w:line="240" w:lineRule="auto"/>
+        <w:rPr>
+          <w:rFonts w:ascii="Segoe UI" w:eastAsia="Times New Roman" w:hAnsi="Segoe UI" w:cs="Segoe UI"/>
+          <w:color w:val="BFBFBF"/>
+          <w:kern w:val="0"/>
+          <w:sz w:val="20"/>
+          <w:szCs w:val="20"/>
+          <w14:ligatures w14:val="none"/>
+        </w:rPr>
+      </w:pPr>
+      <w:proofErr w:type="spellStart"/>
+      <w:r>
+        <w:rPr>
+          <w:rFonts w:ascii="Courier New" w:eastAsia="Times New Roman" w:hAnsi="Courier New" w:cs="Courier New"/>
+          <w:color w:val="8C8C8C"/>
+          <w:kern w:val="0"/>
+          <w:sz w:val="18"/>
+          <w:szCs w:val="18"/>
+          <w:shd w:val="clear" w:color="auto" w:fill="262626"/>
+          <w14:ligatures w14:val="none"/>
+        </w:rPr>
+        <w:t>c_s</w:t>
+      </w:r>
+      <w:proofErr w:type="spellEnd"/>
+      <w:r>
+        <w:rPr>
+          <w:rFonts w:ascii="Courier New" w:eastAsia="Times New Roman" w:hAnsi="Courier New" w:cs="Courier New"/>
+          <w:color w:val="8C8C8C"/>
+          <w:kern w:val="0"/>
+          <w:sz w:val="18"/>
+          <w:szCs w:val="18"/>
+          <w:shd w:val="clear" w:color="auto" w:fill="262626"/>
+          <w14:ligatures w14:val="none"/>
+        </w:rPr>
+        <w:t xml:space="preserve"> = [F(</w:t>
+      </w:r>
+      <w:proofErr w:type="spellStart"/>
+      <w:r>
+        <w:rPr>
+          <w:rFonts w:ascii="Courier New" w:eastAsia="Times New Roman" w:hAnsi="Courier New" w:cs="Courier New"/>
+          <w:color w:val="8C8C8C"/>
+          <w:kern w:val="0"/>
+          <w:sz w:val="18"/>
+          <w:szCs w:val="18"/>
+          <w:shd w:val="clear" w:color="auto" w:fill="262626"/>
+          <w14:ligatures w14:val="none"/>
+        </w:rPr>
+        <w:t>start_s</w:t>
+      </w:r>
+      <w:proofErr w:type="spellEnd"/>
+      <w:r>
+        <w:rPr>
+          <w:rFonts w:ascii="Courier New" w:eastAsia="Times New Roman" w:hAnsi="Courier New" w:cs="Courier New"/>
+          <w:color w:val="8C8C8C"/>
+          <w:kern w:val="0"/>
+          <w:sz w:val="18"/>
+          <w:szCs w:val="18"/>
+          <w:shd w:val="clear" w:color="auto" w:fill="262626"/>
+          <w14:ligatures w14:val="none"/>
+        </w:rPr>
+        <w:t>) − F(</w:t>
+      </w:r>
+      <w:proofErr w:type="spellStart"/>
+      <w:r>
+        <w:rPr>
+          <w:rFonts w:ascii="Courier New" w:eastAsia="Times New Roman" w:hAnsi="Courier New" w:cs="Courier New"/>
+          <w:color w:val="8C8C8C"/>
+          <w:kern w:val="0"/>
+          <w:sz w:val="18"/>
+          <w:szCs w:val="18"/>
+          <w:shd w:val="clear" w:color="auto" w:fill="262626"/>
+          <w14:ligatures w14:val="none"/>
+        </w:rPr>
+        <w:t>min_s</w:t>
+      </w:r>
+      <w:proofErr w:type="spellEnd"/>
+      <w:r>
+        <w:rPr>
+          <w:rFonts w:ascii="Courier New" w:eastAsia="Times New Roman" w:hAnsi="Courier New" w:cs="Courier New"/>
+          <w:color w:val="8C8C8C"/>
+          <w:kern w:val="0"/>
+          <w:sz w:val="18"/>
+          <w:szCs w:val="18"/>
+          <w:shd w:val="clear" w:color="auto" w:fill="262626"/>
+          <w14:ligatures w14:val="none"/>
+        </w:rPr>
+        <w:t>)] / (</w:t>
+      </w:r>
+      <w:proofErr w:type="spellStart"/>
+      <w:r>
+        <w:rPr>
+          <w:rFonts w:ascii="Courier New" w:eastAsia="Times New Roman" w:hAnsi="Courier New" w:cs="Courier New"/>
+          <w:color w:val="8C8C8C"/>
+          <w:kern w:val="0"/>
+          <w:sz w:val="18"/>
+          <w:szCs w:val="18"/>
+          <w:shd w:val="clear" w:color="auto" w:fill="262626"/>
+          <w14:ligatures w14:val="none"/>
+        </w:rPr>
+        <w:t>start_s</w:t>
+      </w:r>
+      <w:proofErr w:type="spellEnd"/>
+      <w:r>
+        <w:rPr>
+          <w:rFonts w:ascii="Courier New" w:eastAsia="Times New Roman" w:hAnsi="Courier New" w:cs="Courier New"/>
+          <w:color w:val="8C8C8C"/>
+          <w:kern w:val="0"/>
+          <w:sz w:val="18"/>
+          <w:szCs w:val="18"/>
+          <w:shd w:val="clear" w:color="auto" w:fill="262626"/>
+          <w14:ligatures w14:val="none"/>
+        </w:rPr>
+        <w:t xml:space="preserve"> − </w:t>
+      </w:r>
+      <w:proofErr w:type="spellStart"/>
+      <w:r>
+        <w:rPr>
+          <w:rFonts w:ascii="Courier New" w:eastAsia="Times New Roman" w:hAnsi="Courier New" w:cs="Courier New"/>
+          <w:color w:val="8C8C8C"/>
+          <w:kern w:val="0"/>
+          <w:sz w:val="18"/>
+          <w:szCs w:val="18"/>
+          <w:shd w:val="clear" w:color="auto" w:fill="262626"/>
+          <w14:ligatures w14:val="none"/>
+        </w:rPr>
+        <w:t>min_s</w:t>
+      </w:r>
+      <w:proofErr w:type="spellEnd"/>
+      <w:r>
+        <w:rPr>
+          <w:rFonts w:ascii="Courier New" w:eastAsia="Times New Roman" w:hAnsi="Courier New" w:cs="Courier New"/>
+          <w:color w:val="8C8C8C"/>
+          <w:kern w:val="0"/>
+          <w:sz w:val="18"/>
+          <w:szCs w:val="18"/>
+          <w:shd w:val="clear" w:color="auto" w:fill="262626"/>
+          <w14:ligatures w14:val="none"/>
+        </w:rPr>
+        <w:t>)</w:t>
+      </w:r>
+      <w:r>
+        <w:rPr>
+          <w:rFonts w:ascii="Segoe UI" w:eastAsia="Times New Roman" w:hAnsi="Segoe UI" w:cs="Segoe UI"/>
+          <w:color w:val="BFBFBF"/>
+          <w:kern w:val="0"/>
+          <w:sz w:val="20"/>
+          <w:szCs w:val="20"/>
+          <w14:ligatures w14:val="none"/>
+        </w:rPr>
+        <w:t> — dissatisfaction improvement per bike moved, signed positive for oversupplied stations and negative for undersupplied</w:t>
+      </w:r>
+    </w:p>
+    <w:p>
+      <w:pPr>
+        <w:shd w:val="clear" w:color="auto" w:fill="191A1B"/>
+        <w:spacing w:before="24" w:after="48" w:line="240" w:lineRule="auto"/>
+        <w:rPr>
+          <w:rFonts w:ascii="Segoe UI" w:eastAsia="Times New Roman" w:hAnsi="Segoe UI" w:cs="Segoe UI"/>
+          <w:color w:val="BFBFBF"/>
+          <w:kern w:val="0"/>
+          <w:sz w:val="20"/>
+          <w:szCs w:val="20"/>
+          <w14:ligatures w14:val="none"/>
+        </w:rPr>
+      </w:pPr>
+      <w:proofErr w:type="spellStart"/>
+      <w:r>
+        <w:rPr>
+          <w:rFonts w:ascii="Courier New" w:eastAsia="Times New Roman" w:hAnsi="Courier New" w:cs="Courier New"/>
+          <w:color w:val="8C8C8C"/>
+          <w:kern w:val="0"/>
+          <w:sz w:val="18"/>
+          <w:szCs w:val="18"/>
+          <w:shd w:val="clear" w:color="auto" w:fill="262626"/>
+          <w14:ligatures w14:val="none"/>
+        </w:rPr>
+        <w:t>c_s</w:t>
+      </w:r>
+      <w:proofErr w:type="spellEnd"/>
+      <w:r>
+        <w:rPr>
+          <w:rFonts w:ascii="Segoe UI" w:eastAsia="Times New Roman" w:hAnsi="Segoe UI" w:cs="Segoe UI"/>
+          <w:color w:val="BFBFBF"/>
+          <w:kern w:val="0"/>
+          <w:sz w:val="20"/>
+          <w:szCs w:val="20"/>
+          <w14:ligatures w14:val="none"/>
+        </w:rPr>
+        <w:t xml:space="preserve"> becomes the objective coefficient in the </w:t>
+      </w:r>
+      <w:proofErr w:type="spellStart"/>
+      <w:r>
+        <w:rPr>
+          <w:rFonts w:ascii="Segoe UI" w:eastAsia="Times New Roman" w:hAnsi="Segoe UI" w:cs="Segoe UI"/>
+          <w:color w:val="BFBFBF"/>
+          <w:kern w:val="0"/>
+          <w:sz w:val="20"/>
+          <w:szCs w:val="20"/>
+          <w14:ligatures w14:val="none"/>
+        </w:rPr>
+        <w:t>Gurobi</w:t>
+      </w:r>
+      <w:proofErr w:type="spellEnd"/>
+      <w:r>
+        <w:rPr>
+          <w:rFonts w:ascii="Segoe UI" w:eastAsia="Times New Roman" w:hAnsi="Segoe UI" w:cs="Segoe UI"/>
+          <w:color w:val="BFBFBF"/>
+          <w:kern w:val="0"/>
+          <w:sz w:val="20"/>
+          <w:szCs w:val="20"/>
+          <w14:ligatures w14:val="none"/>
+        </w:rPr>
+        <w:t xml:space="preserve"> IP.</w:t>
+      </w:r>
+    </w:p>
+    <w:p>
+      <w:pPr>
+        <w:rPr>
+          <w:sz w:val="22"/>
+        </w:rPr>
+      </w:pPr>
     </w:p>
     <w:p>
       <w:pPr>
@@ -1129,6 +3898,7 @@
         <w:rPr>
           <w:sz w:val="22"/>
         </w:rPr>
+        <w:lastRenderedPageBreak/>
         <w:t xml:space="preserve">Time intervals are each 6 minutes wide. This is based on NYCBS estimates of how long it takes to load/unload a set </w:t>
       </w:r>
       <w:r>
@@ -1172,7 +3942,6 @@
           <w:sz w:val="22"/>
           <w:u w:val="single"/>
         </w:rPr>
-        <w:lastRenderedPageBreak/>
         <w:t>Indices</w:t>
       </w:r>
     </w:p>
@@ -2003,7 +4772,7 @@
                     <pic:cNvPicPr/>
                   </pic:nvPicPr>
                   <pic:blipFill>
-                    <a:blip r:embed="rId11"/>
+                    <a:blip r:embed="rId9"/>
                     <a:stretch>
                       <a:fillRect/>
                     </a:stretch>
@@ -2247,7 +5016,7 @@
                     <pic:cNvPicPr/>
                   </pic:nvPicPr>
                   <pic:blipFill>
-                    <a:blip r:embed="rId12"/>
+                    <a:blip r:embed="rId10"/>
                     <a:stretch>
                       <a:fillRect/>
                     </a:stretch>
@@ -2481,7 +5250,7 @@
                     <pic:cNvPicPr/>
                   </pic:nvPicPr>
                   <pic:blipFill>
-                    <a:blip r:embed="rId13"/>
+                    <a:blip r:embed="rId11"/>
                     <a:stretch>
                       <a:fillRect/>
                     </a:stretch>
@@ -2960,7 +5729,7 @@
                     <pic:cNvPicPr/>
                   </pic:nvPicPr>
                   <pic:blipFill>
-                    <a:blip r:embed="rId14"/>
+                    <a:blip r:embed="rId12"/>
                     <a:stretch>
                       <a:fillRect/>
                     </a:stretch>
@@ -3122,7 +5891,7 @@
                     <pic:cNvPicPr/>
                   </pic:nvPicPr>
                   <pic:blipFill>
-                    <a:blip r:embed="rId15"/>
+                    <a:blip r:embed="rId13"/>
                     <a:stretch>
                       <a:fillRect/>
                     </a:stretch>
@@ -3295,7 +6064,7 @@
                     <pic:cNvPicPr/>
                   </pic:nvPicPr>
                   <pic:blipFill>
-                    <a:blip r:embed="rId16"/>
+                    <a:blip r:embed="rId14"/>
                     <a:stretch>
                       <a:fillRect/>
                     </a:stretch>
@@ -3460,7 +6229,7 @@
                     <pic:cNvPicPr/>
                   </pic:nvPicPr>
                   <pic:blipFill>
-                    <a:blip r:embed="rId17"/>
+                    <a:blip r:embed="rId15"/>
                     <a:stretch>
                       <a:fillRect/>
                     </a:stretch>
@@ -3562,7 +6331,7 @@
                     <pic:cNvPicPr/>
                   </pic:nvPicPr>
                   <pic:blipFill>
-                    <a:blip r:embed="rId18"/>
+                    <a:blip r:embed="rId16"/>
                     <a:stretch>
                       <a:fillRect/>
                     </a:stretch>
@@ -3686,7 +6455,7 @@
                     <pic:cNvPicPr/>
                   </pic:nvPicPr>
                   <pic:blipFill>
-                    <a:blip r:embed="rId19"/>
+                    <a:blip r:embed="rId17"/>
                     <a:stretch>
                       <a:fillRect/>
                     </a:stretch>
@@ -3875,7 +6644,7 @@
                     <pic:cNvPicPr/>
                   </pic:nvPicPr>
                   <pic:blipFill>
-                    <a:blip r:embed="rId20"/>
+                    <a:blip r:embed="rId18"/>
                     <a:stretch>
                       <a:fillRect/>
                     </a:stretch>
@@ -4331,7 +7100,7 @@
         </w:rPr>
         <w:t xml:space="preserve">. </w:t>
       </w:r>
-      <w:hyperlink r:id="rId21" w:history="1">
+      <w:hyperlink r:id="rId19" w:history="1">
         <w:r>
           <w:rPr>
             <w:rStyle w:val="Hyperlink"/>
@@ -4412,7 +7181,7 @@
         </w:rPr>
         <w:t xml:space="preserve">(1). </w:t>
       </w:r>
-      <w:hyperlink r:id="rId22" w:history="1">
+      <w:hyperlink r:id="rId20" w:history="1">
         <w:r>
           <w:rPr>
             <w:rStyle w:val="Hyperlink"/>
@@ -4471,7 +7240,7 @@
         </w:rPr>
         <w:t xml:space="preserve">. Citibikenyc.com. </w:t>
       </w:r>
-      <w:hyperlink r:id="rId23" w:history="1">
+      <w:hyperlink r:id="rId21" w:history="1">
         <w:r>
           <w:rPr>
             <w:rStyle w:val="Hyperlink"/>
@@ -4567,7 +7336,7 @@
         </w:rPr>
         <w:t xml:space="preserve">. Citybik.es. </w:t>
       </w:r>
-      <w:hyperlink r:id="rId24" w:history="1">
+      <w:hyperlink r:id="rId22" w:history="1">
         <w:r>
           <w:rPr>
             <w:rStyle w:val="Hyperlink"/>
@@ -4644,7 +7413,7 @@
         </w:rPr>
         <w:t xml:space="preserve">. Citybik.es. </w:t>
       </w:r>
-      <w:hyperlink r:id="rId25" w:history="1">
+      <w:hyperlink r:id="rId23" w:history="1">
         <w:r>
           <w:rPr>
             <w:rStyle w:val="Hyperlink"/>
@@ -4698,7 +7467,7 @@
         </w:rPr>
         <w:t xml:space="preserve"> (GPT-5.2 Thinking) [Large language model]. </w:t>
       </w:r>
-      <w:hyperlink r:id="rId26" w:tgtFrame="_new" w:history="1">
+      <w:hyperlink r:id="rId24" w:tgtFrame="_new" w:history="1">
         <w:r>
           <w:rPr>
             <w:rStyle w:val="Hyperlink"/>
@@ -4778,7 +7547,7 @@
         </w:rPr>
         <w:t xml:space="preserve">Large language model]. </w:t>
       </w:r>
-      <w:hyperlink r:id="rId27" w:history="1">
+      <w:hyperlink r:id="rId25" w:history="1">
         <w:r>
           <w:rPr>
             <w:rStyle w:val="Hyperlink"/>
@@ -5122,6 +7891,155 @@
     </w:lvl>
   </w:abstractNum>
   <w:abstractNum w:abstractNumId="3" w15:restartNumberingAfterBreak="0">
+    <w:nsid w:val="198B1F2B"/>
+    <w:multiLevelType w:val="multilevel"/>
+    <w:tmpl w:val="FD80C750"/>
+    <w:lvl w:ilvl="0">
+      <w:start w:val="1"/>
+      <w:numFmt w:val="bullet"/>
+      <w:lvlText w:val=""/>
+      <w:lvlJc w:val="left"/>
+      <w:pPr>
+        <w:tabs>
+          <w:tab w:val="num" w:pos="720"/>
+        </w:tabs>
+        <w:ind w:left="720" w:hanging="360"/>
+      </w:pPr>
+      <w:rPr>
+        <w:rFonts w:ascii="Symbol" w:hAnsi="Symbol" w:hint="default"/>
+        <w:sz w:val="20"/>
+      </w:rPr>
+    </w:lvl>
+    <w:lvl w:ilvl="1" w:tentative="1">
+      <w:start w:val="1"/>
+      <w:numFmt w:val="bullet"/>
+      <w:lvlText w:val="o"/>
+      <w:lvlJc w:val="left"/>
+      <w:pPr>
+        <w:tabs>
+          <w:tab w:val="num" w:pos="1440"/>
+        </w:tabs>
+        <w:ind w:left="1440" w:hanging="360"/>
+      </w:pPr>
+      <w:rPr>
+        <w:rFonts w:ascii="Courier New" w:hAnsi="Courier New" w:hint="default"/>
+        <w:sz w:val="20"/>
+      </w:rPr>
+    </w:lvl>
+    <w:lvl w:ilvl="2" w:tentative="1">
+      <w:start w:val="1"/>
+      <w:numFmt w:val="bullet"/>
+      <w:lvlText w:val=""/>
+      <w:lvlJc w:val="left"/>
+      <w:pPr>
+        <w:tabs>
+          <w:tab w:val="num" w:pos="2160"/>
+        </w:tabs>
+        <w:ind w:left="2160" w:hanging="360"/>
+      </w:pPr>
+      <w:rPr>
+        <w:rFonts w:ascii="Wingdings" w:hAnsi="Wingdings" w:hint="default"/>
+        <w:sz w:val="20"/>
+      </w:rPr>
+    </w:lvl>
+    <w:lvl w:ilvl="3" w:tentative="1">
+      <w:start w:val="1"/>
+      <w:numFmt w:val="bullet"/>
+      <w:lvlText w:val=""/>
+      <w:lvlJc w:val="left"/>
+      <w:pPr>
+        <w:tabs>
+          <w:tab w:val="num" w:pos="2880"/>
+        </w:tabs>
+        <w:ind w:left="2880" w:hanging="360"/>
+      </w:pPr>
+      <w:rPr>
+        <w:rFonts w:ascii="Wingdings" w:hAnsi="Wingdings" w:hint="default"/>
+        <w:sz w:val="20"/>
+      </w:rPr>
+    </w:lvl>
+    <w:lvl w:ilvl="4" w:tentative="1">
+      <w:start w:val="1"/>
+      <w:numFmt w:val="bullet"/>
+      <w:lvlText w:val=""/>
+      <w:lvlJc w:val="left"/>
+      <w:pPr>
+        <w:tabs>
+          <w:tab w:val="num" w:pos="3600"/>
+        </w:tabs>
+        <w:ind w:left="3600" w:hanging="360"/>
+      </w:pPr>
+      <w:rPr>
+        <w:rFonts w:ascii="Wingdings" w:hAnsi="Wingdings" w:hint="default"/>
+        <w:sz w:val="20"/>
+      </w:rPr>
+    </w:lvl>
+    <w:lvl w:ilvl="5" w:tentative="1">
+      <w:start w:val="1"/>
+      <w:numFmt w:val="bullet"/>
+      <w:lvlText w:val=""/>
+      <w:lvlJc w:val="left"/>
+      <w:pPr>
+        <w:tabs>
+          <w:tab w:val="num" w:pos="4320"/>
+        </w:tabs>
+        <w:ind w:left="4320" w:hanging="360"/>
+      </w:pPr>
+      <w:rPr>
+        <w:rFonts w:ascii="Wingdings" w:hAnsi="Wingdings" w:hint="default"/>
+        <w:sz w:val="20"/>
+      </w:rPr>
+    </w:lvl>
+    <w:lvl w:ilvl="6" w:tentative="1">
+      <w:start w:val="1"/>
+      <w:numFmt w:val="bullet"/>
+      <w:lvlText w:val=""/>
+      <w:lvlJc w:val="left"/>
+      <w:pPr>
+        <w:tabs>
+          <w:tab w:val="num" w:pos="5040"/>
+        </w:tabs>
+        <w:ind w:left="5040" w:hanging="360"/>
+      </w:pPr>
+      <w:rPr>
+        <w:rFonts w:ascii="Wingdings" w:hAnsi="Wingdings" w:hint="default"/>
+        <w:sz w:val="20"/>
+      </w:rPr>
+    </w:lvl>
+    <w:lvl w:ilvl="7" w:tentative="1">
+      <w:start w:val="1"/>
+      <w:numFmt w:val="bullet"/>
+      <w:lvlText w:val=""/>
+      <w:lvlJc w:val="left"/>
+      <w:pPr>
+        <w:tabs>
+          <w:tab w:val="num" w:pos="5760"/>
+        </w:tabs>
+        <w:ind w:left="5760" w:hanging="360"/>
+      </w:pPr>
+      <w:rPr>
+        <w:rFonts w:ascii="Wingdings" w:hAnsi="Wingdings" w:hint="default"/>
+        <w:sz w:val="20"/>
+      </w:rPr>
+    </w:lvl>
+    <w:lvl w:ilvl="8" w:tentative="1">
+      <w:start w:val="1"/>
+      <w:numFmt w:val="bullet"/>
+      <w:lvlText w:val=""/>
+      <w:lvlJc w:val="left"/>
+      <w:pPr>
+        <w:tabs>
+          <w:tab w:val="num" w:pos="6480"/>
+        </w:tabs>
+        <w:ind w:left="6480" w:hanging="360"/>
+      </w:pPr>
+      <w:rPr>
+        <w:rFonts w:ascii="Wingdings" w:hAnsi="Wingdings" w:hint="default"/>
+        <w:sz w:val="20"/>
+      </w:rPr>
+    </w:lvl>
+  </w:abstractNum>
+  <w:abstractNum w:abstractNumId="4" w15:restartNumberingAfterBreak="0">
     <w:nsid w:val="25642177"/>
     <w:multiLevelType w:val="hybridMultilevel"/>
     <w:tmpl w:val="168EB426"/>
@@ -5210,7 +8128,156 @@
       </w:pPr>
     </w:lvl>
   </w:abstractNum>
-  <w:abstractNum w:abstractNumId="4" w15:restartNumberingAfterBreak="0">
+  <w:abstractNum w:abstractNumId="5" w15:restartNumberingAfterBreak="0">
+    <w:nsid w:val="27DF579B"/>
+    <w:multiLevelType w:val="multilevel"/>
+    <w:tmpl w:val="60505DB6"/>
+    <w:lvl w:ilvl="0">
+      <w:start w:val="1"/>
+      <w:numFmt w:val="bullet"/>
+      <w:lvlText w:val=""/>
+      <w:lvlJc w:val="left"/>
+      <w:pPr>
+        <w:tabs>
+          <w:tab w:val="num" w:pos="720"/>
+        </w:tabs>
+        <w:ind w:left="720" w:hanging="360"/>
+      </w:pPr>
+      <w:rPr>
+        <w:rFonts w:ascii="Symbol" w:hAnsi="Symbol" w:hint="default"/>
+        <w:sz w:val="20"/>
+      </w:rPr>
+    </w:lvl>
+    <w:lvl w:ilvl="1" w:tentative="1">
+      <w:start w:val="1"/>
+      <w:numFmt w:val="bullet"/>
+      <w:lvlText w:val="o"/>
+      <w:lvlJc w:val="left"/>
+      <w:pPr>
+        <w:tabs>
+          <w:tab w:val="num" w:pos="1440"/>
+        </w:tabs>
+        <w:ind w:left="1440" w:hanging="360"/>
+      </w:pPr>
+      <w:rPr>
+        <w:rFonts w:ascii="Courier New" w:hAnsi="Courier New" w:hint="default"/>
+        <w:sz w:val="20"/>
+      </w:rPr>
+    </w:lvl>
+    <w:lvl w:ilvl="2" w:tentative="1">
+      <w:start w:val="1"/>
+      <w:numFmt w:val="bullet"/>
+      <w:lvlText w:val=""/>
+      <w:lvlJc w:val="left"/>
+      <w:pPr>
+        <w:tabs>
+          <w:tab w:val="num" w:pos="2160"/>
+        </w:tabs>
+        <w:ind w:left="2160" w:hanging="360"/>
+      </w:pPr>
+      <w:rPr>
+        <w:rFonts w:ascii="Wingdings" w:hAnsi="Wingdings" w:hint="default"/>
+        <w:sz w:val="20"/>
+      </w:rPr>
+    </w:lvl>
+    <w:lvl w:ilvl="3" w:tentative="1">
+      <w:start w:val="1"/>
+      <w:numFmt w:val="bullet"/>
+      <w:lvlText w:val=""/>
+      <w:lvlJc w:val="left"/>
+      <w:pPr>
+        <w:tabs>
+          <w:tab w:val="num" w:pos="2880"/>
+        </w:tabs>
+        <w:ind w:left="2880" w:hanging="360"/>
+      </w:pPr>
+      <w:rPr>
+        <w:rFonts w:ascii="Wingdings" w:hAnsi="Wingdings" w:hint="default"/>
+        <w:sz w:val="20"/>
+      </w:rPr>
+    </w:lvl>
+    <w:lvl w:ilvl="4" w:tentative="1">
+      <w:start w:val="1"/>
+      <w:numFmt w:val="bullet"/>
+      <w:lvlText w:val=""/>
+      <w:lvlJc w:val="left"/>
+      <w:pPr>
+        <w:tabs>
+          <w:tab w:val="num" w:pos="3600"/>
+        </w:tabs>
+        <w:ind w:left="3600" w:hanging="360"/>
+      </w:pPr>
+      <w:rPr>
+        <w:rFonts w:ascii="Wingdings" w:hAnsi="Wingdings" w:hint="default"/>
+        <w:sz w:val="20"/>
+      </w:rPr>
+    </w:lvl>
+    <w:lvl w:ilvl="5" w:tentative="1">
+      <w:start w:val="1"/>
+      <w:numFmt w:val="bullet"/>
+      <w:lvlText w:val=""/>
+      <w:lvlJc w:val="left"/>
+      <w:pPr>
+        <w:tabs>
+          <w:tab w:val="num" w:pos="4320"/>
+        </w:tabs>
+        <w:ind w:left="4320" w:hanging="360"/>
+      </w:pPr>
+      <w:rPr>
+        <w:rFonts w:ascii="Wingdings" w:hAnsi="Wingdings" w:hint="default"/>
+        <w:sz w:val="20"/>
+      </w:rPr>
+    </w:lvl>
+    <w:lvl w:ilvl="6" w:tentative="1">
+      <w:start w:val="1"/>
+      <w:numFmt w:val="bullet"/>
+      <w:lvlText w:val=""/>
+      <w:lvlJc w:val="left"/>
+      <w:pPr>
+        <w:tabs>
+          <w:tab w:val="num" w:pos="5040"/>
+        </w:tabs>
+        <w:ind w:left="5040" w:hanging="360"/>
+      </w:pPr>
+      <w:rPr>
+        <w:rFonts w:ascii="Wingdings" w:hAnsi="Wingdings" w:hint="default"/>
+        <w:sz w:val="20"/>
+      </w:rPr>
+    </w:lvl>
+    <w:lvl w:ilvl="7" w:tentative="1">
+      <w:start w:val="1"/>
+      <w:numFmt w:val="bullet"/>
+      <w:lvlText w:val=""/>
+      <w:lvlJc w:val="left"/>
+      <w:pPr>
+        <w:tabs>
+          <w:tab w:val="num" w:pos="5760"/>
+        </w:tabs>
+        <w:ind w:left="5760" w:hanging="360"/>
+      </w:pPr>
+      <w:rPr>
+        <w:rFonts w:ascii="Wingdings" w:hAnsi="Wingdings" w:hint="default"/>
+        <w:sz w:val="20"/>
+      </w:rPr>
+    </w:lvl>
+    <w:lvl w:ilvl="8" w:tentative="1">
+      <w:start w:val="1"/>
+      <w:numFmt w:val="bullet"/>
+      <w:lvlText w:val=""/>
+      <w:lvlJc w:val="left"/>
+      <w:pPr>
+        <w:tabs>
+          <w:tab w:val="num" w:pos="6480"/>
+        </w:tabs>
+        <w:ind w:left="6480" w:hanging="360"/>
+      </w:pPr>
+      <w:rPr>
+        <w:rFonts w:ascii="Wingdings" w:hAnsi="Wingdings" w:hint="default"/>
+        <w:sz w:val="20"/>
+      </w:rPr>
+    </w:lvl>
+  </w:abstractNum>
+  <w:abstractNum w:abstractNumId="6" w15:restartNumberingAfterBreak="0">
     <w:nsid w:val="281D0E4C"/>
     <w:multiLevelType w:val="hybridMultilevel"/>
     <w:tmpl w:val="851019E0"/>
@@ -5299,7 +8366,7 @@
       </w:pPr>
     </w:lvl>
   </w:abstractNum>
-  <w:abstractNum w:abstractNumId="5" w15:restartNumberingAfterBreak="0">
+  <w:abstractNum w:abstractNumId="7" w15:restartNumberingAfterBreak="0">
     <w:nsid w:val="49545157"/>
     <w:multiLevelType w:val="hybridMultilevel"/>
     <w:tmpl w:val="F27AFDAE"/>
@@ -5408,6 +8475,155 @@
       </w:pPr>
       <w:rPr>
         <w:rFonts w:ascii="Wingdings" w:hAnsi="Wingdings" w:hint="default"/>
+      </w:rPr>
+    </w:lvl>
+  </w:abstractNum>
+  <w:abstractNum w:abstractNumId="8" w15:restartNumberingAfterBreak="0">
+    <w:nsid w:val="74D7248B"/>
+    <w:multiLevelType w:val="multilevel"/>
+    <w:tmpl w:val="469412BA"/>
+    <w:lvl w:ilvl="0">
+      <w:start w:val="1"/>
+      <w:numFmt w:val="bullet"/>
+      <w:lvlText w:val=""/>
+      <w:lvlJc w:val="left"/>
+      <w:pPr>
+        <w:tabs>
+          <w:tab w:val="num" w:pos="720"/>
+        </w:tabs>
+        <w:ind w:left="720" w:hanging="360"/>
+      </w:pPr>
+      <w:rPr>
+        <w:rFonts w:ascii="Symbol" w:hAnsi="Symbol" w:hint="default"/>
+        <w:sz w:val="20"/>
+      </w:rPr>
+    </w:lvl>
+    <w:lvl w:ilvl="1" w:tentative="1">
+      <w:start w:val="1"/>
+      <w:numFmt w:val="bullet"/>
+      <w:lvlText w:val="o"/>
+      <w:lvlJc w:val="left"/>
+      <w:pPr>
+        <w:tabs>
+          <w:tab w:val="num" w:pos="1440"/>
+        </w:tabs>
+        <w:ind w:left="1440" w:hanging="360"/>
+      </w:pPr>
+      <w:rPr>
+        <w:rFonts w:ascii="Courier New" w:hAnsi="Courier New" w:hint="default"/>
+        <w:sz w:val="20"/>
+      </w:rPr>
+    </w:lvl>
+    <w:lvl w:ilvl="2" w:tentative="1">
+      <w:start w:val="1"/>
+      <w:numFmt w:val="bullet"/>
+      <w:lvlText w:val=""/>
+      <w:lvlJc w:val="left"/>
+      <w:pPr>
+        <w:tabs>
+          <w:tab w:val="num" w:pos="2160"/>
+        </w:tabs>
+        <w:ind w:left="2160" w:hanging="360"/>
+      </w:pPr>
+      <w:rPr>
+        <w:rFonts w:ascii="Wingdings" w:hAnsi="Wingdings" w:hint="default"/>
+        <w:sz w:val="20"/>
+      </w:rPr>
+    </w:lvl>
+    <w:lvl w:ilvl="3" w:tentative="1">
+      <w:start w:val="1"/>
+      <w:numFmt w:val="bullet"/>
+      <w:lvlText w:val=""/>
+      <w:lvlJc w:val="left"/>
+      <w:pPr>
+        <w:tabs>
+          <w:tab w:val="num" w:pos="2880"/>
+        </w:tabs>
+        <w:ind w:left="2880" w:hanging="360"/>
+      </w:pPr>
+      <w:rPr>
+        <w:rFonts w:ascii="Wingdings" w:hAnsi="Wingdings" w:hint="default"/>
+        <w:sz w:val="20"/>
+      </w:rPr>
+    </w:lvl>
+    <w:lvl w:ilvl="4" w:tentative="1">
+      <w:start w:val="1"/>
+      <w:numFmt w:val="bullet"/>
+      <w:lvlText w:val=""/>
+      <w:lvlJc w:val="left"/>
+      <w:pPr>
+        <w:tabs>
+          <w:tab w:val="num" w:pos="3600"/>
+        </w:tabs>
+        <w:ind w:left="3600" w:hanging="360"/>
+      </w:pPr>
+      <w:rPr>
+        <w:rFonts w:ascii="Wingdings" w:hAnsi="Wingdings" w:hint="default"/>
+        <w:sz w:val="20"/>
+      </w:rPr>
+    </w:lvl>
+    <w:lvl w:ilvl="5" w:tentative="1">
+      <w:start w:val="1"/>
+      <w:numFmt w:val="bullet"/>
+      <w:lvlText w:val=""/>
+      <w:lvlJc w:val="left"/>
+      <w:pPr>
+        <w:tabs>
+          <w:tab w:val="num" w:pos="4320"/>
+        </w:tabs>
+        <w:ind w:left="4320" w:hanging="360"/>
+      </w:pPr>
+      <w:rPr>
+        <w:rFonts w:ascii="Wingdings" w:hAnsi="Wingdings" w:hint="default"/>
+        <w:sz w:val="20"/>
+      </w:rPr>
+    </w:lvl>
+    <w:lvl w:ilvl="6" w:tentative="1">
+      <w:start w:val="1"/>
+      <w:numFmt w:val="bullet"/>
+      <w:lvlText w:val=""/>
+      <w:lvlJc w:val="left"/>
+      <w:pPr>
+        <w:tabs>
+          <w:tab w:val="num" w:pos="5040"/>
+        </w:tabs>
+        <w:ind w:left="5040" w:hanging="360"/>
+      </w:pPr>
+      <w:rPr>
+        <w:rFonts w:ascii="Wingdings" w:hAnsi="Wingdings" w:hint="default"/>
+        <w:sz w:val="20"/>
+      </w:rPr>
+    </w:lvl>
+    <w:lvl w:ilvl="7" w:tentative="1">
+      <w:start w:val="1"/>
+      <w:numFmt w:val="bullet"/>
+      <w:lvlText w:val=""/>
+      <w:lvlJc w:val="left"/>
+      <w:pPr>
+        <w:tabs>
+          <w:tab w:val="num" w:pos="5760"/>
+        </w:tabs>
+        <w:ind w:left="5760" w:hanging="360"/>
+      </w:pPr>
+      <w:rPr>
+        <w:rFonts w:ascii="Wingdings" w:hAnsi="Wingdings" w:hint="default"/>
+        <w:sz w:val="20"/>
+      </w:rPr>
+    </w:lvl>
+    <w:lvl w:ilvl="8" w:tentative="1">
+      <w:start w:val="1"/>
+      <w:numFmt w:val="bullet"/>
+      <w:lvlText w:val=""/>
+      <w:lvlJc w:val="left"/>
+      <w:pPr>
+        <w:tabs>
+          <w:tab w:val="num" w:pos="6480"/>
+        </w:tabs>
+        <w:ind w:left="6480" w:hanging="360"/>
+      </w:pPr>
+      <w:rPr>
+        <w:rFonts w:ascii="Wingdings" w:hAnsi="Wingdings" w:hint="default"/>
+        <w:sz w:val="20"/>
       </w:rPr>
     </w:lvl>
   </w:abstractNum>
@@ -5418,16 +8634,25 @@
     <w:abstractNumId w:val="0"/>
   </w:num>
   <w:num w:numId="3" w16cid:durableId="341854522">
-    <w:abstractNumId w:val="3"/>
+    <w:abstractNumId w:val="4"/>
   </w:num>
   <w:num w:numId="4" w16cid:durableId="489445785">
-    <w:abstractNumId w:val="5"/>
+    <w:abstractNumId w:val="7"/>
   </w:num>
   <w:num w:numId="5" w16cid:durableId="825172234">
-    <w:abstractNumId w:val="4"/>
+    <w:abstractNumId w:val="6"/>
   </w:num>
   <w:num w:numId="6" w16cid:durableId="933438041">
     <w:abstractNumId w:val="1"/>
+  </w:num>
+  <w:num w:numId="7" w16cid:durableId="2058578990">
+    <w:abstractNumId w:val="3"/>
+  </w:num>
+  <w:num w:numId="8" w16cid:durableId="1478301641">
+    <w:abstractNumId w:val="8"/>
+  </w:num>
+  <w:num w:numId="9" w16cid:durableId="1050617323">
+    <w:abstractNumId w:val="5"/>
   </w:num>
 </w:numbering>
 </file>
@@ -6690,22 +9915,4 @@
     </a:ext>
   </a:extLst>
 </a:theme>
-</file>
-
-<file path=customXml/item1.xml><?xml version="1.0" encoding="utf-8"?>
-<b:Sources xmlns:b="http://schemas.openxmlformats.org/officeDocument/2006/bibliography" xmlns="http://schemas.openxmlformats.org/officeDocument/2006/bibliography" SelectedStyle="\APASixthEditionOfficeOnline.xsl" StyleName="APA" Version="6"/>
-</file>
-
-<file path=customXml/itemProps1.xml><?xml version="1.0" encoding="utf-8"?>
-<ds:datastoreItem xmlns:ds="http://schemas.openxmlformats.org/officeDocument/2006/customXml" ds:itemID="{3EF678FB-CDF5-41CD-867C-930E15FB9273}">
-  <ds:schemaRefs>
-    <ds:schemaRef ds:uri="http://schemas.openxmlformats.org/officeDocument/2006/bibliography"/>
-  </ds:schemaRefs>
-</ds:datastoreItem>
-</file>
-
-<file path=docMetadata/LabelInfo.xml><?xml version="1.0" encoding="utf-8"?>
-<clbl:labelList xmlns:clbl="http://schemas.microsoft.com/office/2020/mipLabelMetadata">
-  <clbl:label id="{79c742c4-e61c-4fa5-be89-a3cb566a80d1}" enabled="0" method="" siteId="{79c742c4-e61c-4fa5-be89-a3cb566a80d1}" removed="1"/>
-</clbl:labelList>
 </file>
</xml_diff>